<commit_message>
To Present Successfully Warranty Overview Data in Current Year Dynamically
</commit_message>
<xml_diff>
--- a/document/server.docx
+++ b/document/server.docx
@@ -5,6 +5,12 @@
     <w:p>
       <w:r>
         <w:t>*2#</w:t>
+      </w:r>
+    </w:p>
+    <w:p/>
+    <w:p>
+      <w:r>
+        <w:t>01772 225027</w:t>
       </w:r>
     </w:p>
     <w:p/>
@@ -43,13 +49,21 @@
           <w:b/>
           <w:bCs/>
         </w:rPr>
-        <w:t>frontend/Vite/React server</w:t>
-      </w:r>
+        <w:t xml:space="preserve">frontend/Vite/React </w:t>
+      </w:r>
+      <w:proofErr w:type="gramStart"/>
       <w:r>
         <w:rPr>
           <w:b/>
           <w:bCs/>
         </w:rPr>
+        <w:t>server</w:t>
+      </w:r>
+      <w:r>
+        <w:rPr>
+          <w:b/>
+          <w:bCs/>
+        </w:rPr>
         <w:t xml:space="preserve">  </w:t>
       </w:r>
       <w:proofErr w:type="spellStart"/>
@@ -60,6 +74,7 @@
         <w:t>তাই</w:t>
       </w:r>
       <w:proofErr w:type="spellEnd"/>
+      <w:proofErr w:type="gramEnd"/>
       <w:r>
         <w:t xml:space="preserve"> HTML response </w:t>
       </w:r>
@@ -127,7 +142,15 @@
       </w:r>
       <w:proofErr w:type="spellEnd"/>
       <w:r>
-        <w:t xml:space="preserve"> backend .env </w:t>
+        <w:t xml:space="preserve"> </w:t>
+      </w:r>
+      <w:proofErr w:type="gramStart"/>
+      <w:r>
+        <w:t>backend .env</w:t>
+      </w:r>
+      <w:proofErr w:type="gramEnd"/>
+      <w:r>
+        <w:t xml:space="preserve"> </w:t>
       </w:r>
       <w:proofErr w:type="spellStart"/>
       <w:r>
@@ -506,6 +529,7 @@
         </w:rPr>
       </w:pPr>
       <w:proofErr w:type="spellStart"/>
+      <w:proofErr w:type="gramStart"/>
       <w:r>
         <w:rPr>
           <w:rFonts w:ascii="Courier New" w:eastAsia="Times New Roman" w:hAnsi="Courier New" w:cs="Courier New"/>
@@ -525,9 +549,9 @@
           <w:szCs w:val="20"/>
           <w14:ligatures w14:val="none"/>
         </w:rPr>
-        <w:t xml:space="preserve">("/warranty/summary", </w:t>
-      </w:r>
-      <w:proofErr w:type="spellStart"/>
+        <w:t>(</w:t>
+      </w:r>
+      <w:proofErr w:type="gramEnd"/>
       <w:r>
         <w:rPr>
           <w:rFonts w:ascii="Courier New" w:eastAsia="Times New Roman" w:hAnsi="Courier New" w:cs="Courier New"/>
@@ -536,9 +560,22 @@
           <w:szCs w:val="20"/>
           <w14:ligatures w14:val="none"/>
         </w:rPr>
+        <w:t xml:space="preserve">"/warranty/summary", </w:t>
+      </w:r>
+      <w:proofErr w:type="spellStart"/>
+      <w:proofErr w:type="gramStart"/>
+      <w:r>
+        <w:rPr>
+          <w:rFonts w:ascii="Courier New" w:eastAsia="Times New Roman" w:hAnsi="Courier New" w:cs="Courier New"/>
+          <w:kern w:val="0"/>
+          <w:sz w:val="20"/>
+          <w:szCs w:val="20"/>
+          <w14:ligatures w14:val="none"/>
+        </w:rPr>
         <w:t>h.WarrantyOverviewSummary</w:t>
       </w:r>
       <w:proofErr w:type="spellEnd"/>
+      <w:proofErr w:type="gramEnd"/>
       <w:r>
         <w:rPr>
           <w:rFonts w:ascii="Courier New" w:eastAsia="Times New Roman" w:hAnsi="Courier New" w:cs="Courier New"/>
@@ -891,14 +928,41 @@
           <w14:ligatures w14:val="none"/>
         </w:rPr>
       </w:pPr>
-      <w:r>
-        <w:rPr>
-          <w:rFonts w:ascii="Times New Roman" w:eastAsia="Times New Roman" w:hAnsi="Times New Roman" w:cs="Times New Roman"/>
-          <w:kern w:val="0"/>
-          <w14:ligatures w14:val="none"/>
-        </w:rPr>
-        <w:lastRenderedPageBreak/>
-        <w:t xml:space="preserve">Method : Get    : </w:t>
+      <w:proofErr w:type="gramStart"/>
+      <w:r>
+        <w:rPr>
+          <w:rFonts w:ascii="Times New Roman" w:eastAsia="Times New Roman" w:hAnsi="Times New Roman" w:cs="Times New Roman"/>
+          <w:kern w:val="0"/>
+          <w14:ligatures w14:val="none"/>
+        </w:rPr>
+        <w:t>Method :</w:t>
+      </w:r>
+      <w:proofErr w:type="gramEnd"/>
+      <w:r>
+        <w:rPr>
+          <w:rFonts w:ascii="Times New Roman" w:eastAsia="Times New Roman" w:hAnsi="Times New Roman" w:cs="Times New Roman"/>
+          <w:kern w:val="0"/>
+          <w14:ligatures w14:val="none"/>
+        </w:rPr>
+        <w:t xml:space="preserve"> Get  </w:t>
+      </w:r>
+      <w:proofErr w:type="gramStart"/>
+      <w:r>
+        <w:rPr>
+          <w:rFonts w:ascii="Times New Roman" w:eastAsia="Times New Roman" w:hAnsi="Times New Roman" w:cs="Times New Roman"/>
+          <w:kern w:val="0"/>
+          <w14:ligatures w14:val="none"/>
+        </w:rPr>
+        <w:t xml:space="preserve">  :</w:t>
+      </w:r>
+      <w:proofErr w:type="gramEnd"/>
+      <w:r>
+        <w:rPr>
+          <w:rFonts w:ascii="Times New Roman" w:eastAsia="Times New Roman" w:hAnsi="Times New Roman" w:cs="Times New Roman"/>
+          <w:kern w:val="0"/>
+          <w14:ligatures w14:val="none"/>
+        </w:rPr>
+        <w:t xml:space="preserve"> </w:t>
       </w:r>
       <w:hyperlink r:id="rId6" w:history="1">
         <w:r>
@@ -958,8 +1022,18 @@
           <w:kern w:val="0"/>
           <w14:ligatures w14:val="none"/>
         </w:rPr>
-        <w:t>JSON Data :</w:t>
-      </w:r>
+        <w:t xml:space="preserve">JSON </w:t>
+      </w:r>
+      <w:proofErr w:type="gramStart"/>
+      <w:r>
+        <w:rPr>
+          <w:rFonts w:ascii="Times New Roman" w:eastAsia="Times New Roman" w:hAnsi="Times New Roman" w:cs="Times New Roman"/>
+          <w:kern w:val="0"/>
+          <w14:ligatures w14:val="none"/>
+        </w:rPr>
+        <w:t>Data :</w:t>
+      </w:r>
+      <w:proofErr w:type="gramEnd"/>
     </w:p>
     <w:p>
       <w:pPr>
@@ -1310,6 +1384,7 @@
           <w:kern w:val="0"/>
           <w14:ligatures w14:val="none"/>
         </w:rPr>
+        <w:lastRenderedPageBreak/>
         <w:t>            }</w:t>
       </w:r>
     </w:p>
@@ -1346,7 +1421,6 @@
           <w:kern w:val="0"/>
           <w14:ligatures w14:val="none"/>
         </w:rPr>
-        <w:lastRenderedPageBreak/>
         <w:t>        "raw": {</w:t>
       </w:r>
     </w:p>
@@ -1386,13 +1460,23 @@
         <w:t>            "</w:t>
       </w:r>
       <w:proofErr w:type="spellStart"/>
-      <w:r>
-        <w:rPr>
-          <w:rFonts w:ascii="Times New Roman" w:eastAsia="Times New Roman" w:hAnsi="Times New Roman" w:cs="Times New Roman"/>
-          <w:kern w:val="0"/>
-          <w14:ligatures w14:val="none"/>
-        </w:rPr>
-        <w:t>to_vendor</w:t>
+      <w:proofErr w:type="gramStart"/>
+      <w:r>
+        <w:rPr>
+          <w:rFonts w:ascii="Times New Roman" w:eastAsia="Times New Roman" w:hAnsi="Times New Roman" w:cs="Times New Roman"/>
+          <w:kern w:val="0"/>
+          <w14:ligatures w14:val="none"/>
+        </w:rPr>
+        <w:t>to</w:t>
+      </w:r>
+      <w:proofErr w:type="gramEnd"/>
+      <w:r>
+        <w:rPr>
+          <w:rFonts w:ascii="Times New Roman" w:eastAsia="Times New Roman" w:hAnsi="Times New Roman" w:cs="Times New Roman"/>
+          <w:kern w:val="0"/>
+          <w14:ligatures w14:val="none"/>
+        </w:rPr>
+        <w:t>_vendor</w:t>
       </w:r>
       <w:proofErr w:type="spellEnd"/>
       <w:r>
@@ -1695,12 +1779,25 @@
         <w:t xml:space="preserve">const BASE = </w:t>
       </w:r>
       <w:proofErr w:type="spellStart"/>
-      <w:r>
-        <w:t>process.env.NEXT_PUBLIC_API_URL</w:t>
-      </w:r>
-      <w:proofErr w:type="spellEnd"/>
-      <w:r>
-        <w:t xml:space="preserve"> ?? "http://localhost:8080/</w:t>
+      <w:proofErr w:type="gramStart"/>
+      <w:r>
+        <w:t>process.env.NEXT</w:t>
+      </w:r>
+      <w:proofErr w:type="gramEnd"/>
+      <w:r>
+        <w:t>_PUBLIC_API_</w:t>
+      </w:r>
+      <w:proofErr w:type="gramStart"/>
+      <w:r>
+        <w:t>URL</w:t>
+      </w:r>
+      <w:proofErr w:type="spellEnd"/>
+      <w:r>
+        <w:t xml:space="preserve"> ??</w:t>
+      </w:r>
+      <w:proofErr w:type="gramEnd"/>
+      <w:r>
+        <w:t xml:space="preserve"> "http://localhost:8080/</w:t>
       </w:r>
       <w:proofErr w:type="spellStart"/>
       <w:r>
@@ -1712,6 +1809,2988 @@
       </w:r>
     </w:p>
     <w:p/>
+    <w:p>
+      <w:r>
+        <w:lastRenderedPageBreak/>
+        <w:drawing>
+          <wp:inline distT="0" distB="0" distL="0" distR="0" wp14:anchorId="4456BFD2" wp14:editId="2E3D28DC">
+            <wp:extent cx="5943600" cy="3173730"/>
+            <wp:effectExtent l="0" t="0" r="0" b="7620"/>
+            <wp:docPr id="1236054904" name="Picture 1"/>
+            <wp:cNvGraphicFramePr>
+              <a:graphicFrameLocks xmlns:a="http://schemas.openxmlformats.org/drawingml/2006/main" noChangeAspect="1"/>
+            </wp:cNvGraphicFramePr>
+            <a:graphic xmlns:a="http://schemas.openxmlformats.org/drawingml/2006/main">
+              <a:graphicData uri="http://schemas.openxmlformats.org/drawingml/2006/picture">
+                <pic:pic xmlns:pic="http://schemas.openxmlformats.org/drawingml/2006/picture">
+                  <pic:nvPicPr>
+                    <pic:cNvPr id="1236054904" name=""/>
+                    <pic:cNvPicPr/>
+                  </pic:nvPicPr>
+                  <pic:blipFill>
+                    <a:blip r:embed="rId7"/>
+                    <a:stretch>
+                      <a:fillRect/>
+                    </a:stretch>
+                  </pic:blipFill>
+                  <pic:spPr>
+                    <a:xfrm>
+                      <a:off x="0" y="0"/>
+                      <a:ext cx="5943600" cy="3173730"/>
+                    </a:xfrm>
+                    <a:prstGeom prst="rect">
+                      <a:avLst/>
+                    </a:prstGeom>
+                  </pic:spPr>
+                </pic:pic>
+              </a:graphicData>
+            </a:graphic>
+          </wp:inline>
+        </w:drawing>
+      </w:r>
+    </w:p>
+    <w:p/>
+    <w:p/>
+    <w:p>
+      <w:r>
+        <w:t xml:space="preserve">WITH </w:t>
+      </w:r>
+      <w:proofErr w:type="spellStart"/>
+      <w:r>
+        <w:t>warranty_claim_summary</w:t>
+      </w:r>
+      <w:proofErr w:type="spellEnd"/>
+      <w:r>
+        <w:t xml:space="preserve"> AS (</w:t>
+      </w:r>
+    </w:p>
+    <w:p>
+      <w:r>
+        <w:t xml:space="preserve">    SELECT</w:t>
+      </w:r>
+    </w:p>
+    <w:p>
+      <w:r>
+        <w:t xml:space="preserve">        </w:t>
+      </w:r>
+      <w:proofErr w:type="gramStart"/>
+      <w:r>
+        <w:t>COUNT(</w:t>
+      </w:r>
+      <w:proofErr w:type="gramEnd"/>
+      <w:r>
+        <w:t>*) FILTER (</w:t>
+      </w:r>
+    </w:p>
+    <w:p>
+      <w:r>
+        <w:t xml:space="preserve">            WHERE </w:t>
+      </w:r>
+      <w:proofErr w:type="spellStart"/>
+      <w:proofErr w:type="gramStart"/>
+      <w:r>
+        <w:t>dc.claim</w:t>
+      </w:r>
+      <w:proofErr w:type="gramEnd"/>
+      <w:r>
+        <w:t>_status</w:t>
+      </w:r>
+      <w:proofErr w:type="spellEnd"/>
+      <w:r>
+        <w:t xml:space="preserve"> = 8</w:t>
+      </w:r>
+    </w:p>
+    <w:p>
+      <w:r>
+        <w:t xml:space="preserve">        ) AS claimed,</w:t>
+      </w:r>
+    </w:p>
+    <w:p/>
+    <w:p>
+      <w:r>
+        <w:t xml:space="preserve">        </w:t>
+      </w:r>
+      <w:proofErr w:type="gramStart"/>
+      <w:r>
+        <w:t>COUNT(</w:t>
+      </w:r>
+      <w:proofErr w:type="gramEnd"/>
+      <w:r>
+        <w:t>*) FILTER (</w:t>
+      </w:r>
+    </w:p>
+    <w:p>
+      <w:r>
+        <w:t xml:space="preserve">            WHERE </w:t>
+      </w:r>
+      <w:proofErr w:type="spellStart"/>
+      <w:proofErr w:type="gramStart"/>
+      <w:r>
+        <w:t>dc.claim</w:t>
+      </w:r>
+      <w:proofErr w:type="gramEnd"/>
+      <w:r>
+        <w:t>_status</w:t>
+      </w:r>
+      <w:proofErr w:type="spellEnd"/>
+      <w:r>
+        <w:t xml:space="preserve"> = 9</w:t>
+      </w:r>
+    </w:p>
+    <w:p>
+      <w:r>
+        <w:t xml:space="preserve">        ) AS </w:t>
+      </w:r>
+      <w:proofErr w:type="spellStart"/>
+      <w:r>
+        <w:t>to_vendor</w:t>
+      </w:r>
+      <w:proofErr w:type="spellEnd"/>
+      <w:r>
+        <w:t>,</w:t>
+      </w:r>
+    </w:p>
+    <w:p/>
+    <w:p>
+      <w:r>
+        <w:t xml:space="preserve">        </w:t>
+      </w:r>
+      <w:proofErr w:type="gramStart"/>
+      <w:r>
+        <w:t>COUNT(</w:t>
+      </w:r>
+      <w:proofErr w:type="gramEnd"/>
+      <w:r>
+        <w:t>*) FILTER (</w:t>
+      </w:r>
+    </w:p>
+    <w:p>
+      <w:r>
+        <w:t xml:space="preserve">            WHERE </w:t>
+      </w:r>
+      <w:proofErr w:type="spellStart"/>
+      <w:proofErr w:type="gramStart"/>
+      <w:r>
+        <w:t>dc.claim</w:t>
+      </w:r>
+      <w:proofErr w:type="gramEnd"/>
+      <w:r>
+        <w:t>_status</w:t>
+      </w:r>
+      <w:proofErr w:type="spellEnd"/>
+      <w:r>
+        <w:t xml:space="preserve"> = 10</w:t>
+      </w:r>
+    </w:p>
+    <w:p>
+      <w:r>
+        <w:t xml:space="preserve">        ) AS recovered</w:t>
+      </w:r>
+    </w:p>
+    <w:p>
+      <w:r>
+        <w:lastRenderedPageBreak/>
+        <w:t xml:space="preserve">    FROM </w:t>
+      </w:r>
+      <w:proofErr w:type="spellStart"/>
+      <w:proofErr w:type="gramStart"/>
+      <w:r>
+        <w:t>public.device</w:t>
+      </w:r>
+      <w:proofErr w:type="gramEnd"/>
+      <w:r>
+        <w:t>_claims</w:t>
+      </w:r>
+      <w:proofErr w:type="spellEnd"/>
+      <w:r>
+        <w:t xml:space="preserve"> dc</w:t>
+      </w:r>
+    </w:p>
+    <w:p>
+      <w:r>
+        <w:t>),</w:t>
+      </w:r>
+    </w:p>
+    <w:p/>
+    <w:p>
+      <w:proofErr w:type="spellStart"/>
+      <w:r>
+        <w:t>expired_summary</w:t>
+      </w:r>
+      <w:proofErr w:type="spellEnd"/>
+      <w:r>
+        <w:t xml:space="preserve"> AS (</w:t>
+      </w:r>
+    </w:p>
+    <w:p>
+      <w:r>
+        <w:t xml:space="preserve">    SELECT</w:t>
+      </w:r>
+    </w:p>
+    <w:p>
+      <w:r>
+        <w:t xml:space="preserve">        </w:t>
+      </w:r>
+      <w:proofErr w:type="gramStart"/>
+      <w:r>
+        <w:t>COUNT(</w:t>
+      </w:r>
+      <w:proofErr w:type="gramEnd"/>
+      <w:r>
+        <w:t>*) AS expired</w:t>
+      </w:r>
+    </w:p>
+    <w:p>
+      <w:r>
+        <w:t xml:space="preserve">    FROM </w:t>
+      </w:r>
+      <w:proofErr w:type="spellStart"/>
+      <w:proofErr w:type="gramStart"/>
+      <w:r>
+        <w:t>public.asset</w:t>
+      </w:r>
+      <w:proofErr w:type="gramEnd"/>
+      <w:r>
+        <w:t>_devices</w:t>
+      </w:r>
+      <w:proofErr w:type="spellEnd"/>
+      <w:r>
+        <w:t xml:space="preserve"> ad</w:t>
+      </w:r>
+    </w:p>
+    <w:p>
+      <w:r>
+        <w:t xml:space="preserve">    WHERE </w:t>
+      </w:r>
+      <w:proofErr w:type="spellStart"/>
+      <w:r>
+        <w:t>ad.row_status</w:t>
+      </w:r>
+      <w:proofErr w:type="spellEnd"/>
+      <w:r>
+        <w:t xml:space="preserve"> = 1</w:t>
+      </w:r>
+    </w:p>
+    <w:p>
+      <w:r>
+        <w:t xml:space="preserve">      AND </w:t>
+      </w:r>
+      <w:proofErr w:type="spellStart"/>
+      <w:proofErr w:type="gramStart"/>
+      <w:r>
+        <w:t>ad.warranty</w:t>
+      </w:r>
+      <w:proofErr w:type="gramEnd"/>
+      <w:r>
+        <w:t>_date</w:t>
+      </w:r>
+      <w:proofErr w:type="spellEnd"/>
+      <w:r>
+        <w:t xml:space="preserve"> IS NOT NULL</w:t>
+      </w:r>
+    </w:p>
+    <w:p>
+      <w:r>
+        <w:t xml:space="preserve">      AND </w:t>
+      </w:r>
+      <w:proofErr w:type="spellStart"/>
+      <w:proofErr w:type="gramStart"/>
+      <w:r>
+        <w:t>ad.warranty</w:t>
+      </w:r>
+      <w:proofErr w:type="gramEnd"/>
+      <w:r>
+        <w:t>_</w:t>
+      </w:r>
+      <w:proofErr w:type="gramStart"/>
+      <w:r>
+        <w:t>date</w:t>
+      </w:r>
+      <w:proofErr w:type="spellEnd"/>
+      <w:r>
+        <w:t>::</w:t>
+      </w:r>
+      <w:proofErr w:type="gramEnd"/>
+      <w:r>
+        <w:t>date &lt; CURRENT_DATE</w:t>
+      </w:r>
+    </w:p>
+    <w:p>
+      <w:r>
+        <w:t>)</w:t>
+      </w:r>
+    </w:p>
+    <w:p/>
+    <w:p>
+      <w:r>
+        <w:t>SELECT</w:t>
+      </w:r>
+    </w:p>
+    <w:p>
+      <w:r>
+        <w:t xml:space="preserve">    </w:t>
+      </w:r>
+      <w:proofErr w:type="gramStart"/>
+      <w:r>
+        <w:t>COALESCE(</w:t>
+      </w:r>
+      <w:proofErr w:type="spellStart"/>
+      <w:r>
+        <w:t>wcs.claimed</w:t>
+      </w:r>
+      <w:proofErr w:type="spellEnd"/>
+      <w:proofErr w:type="gramEnd"/>
+      <w:r>
+        <w:t>, 0) AS claimed,</w:t>
+      </w:r>
+    </w:p>
+    <w:p>
+      <w:r>
+        <w:t xml:space="preserve">    </w:t>
+      </w:r>
+      <w:proofErr w:type="gramStart"/>
+      <w:r>
+        <w:t>COALESCE(</w:t>
+      </w:r>
+      <w:proofErr w:type="spellStart"/>
+      <w:proofErr w:type="gramEnd"/>
+      <w:r>
+        <w:t>wcs.to_vendor</w:t>
+      </w:r>
+      <w:proofErr w:type="spellEnd"/>
+      <w:r>
+        <w:t xml:space="preserve">, 0) AS </w:t>
+      </w:r>
+      <w:proofErr w:type="spellStart"/>
+      <w:r>
+        <w:t>to_vendor</w:t>
+      </w:r>
+      <w:proofErr w:type="spellEnd"/>
+      <w:r>
+        <w:t>,</w:t>
+      </w:r>
+    </w:p>
+    <w:p>
+      <w:r>
+        <w:t xml:space="preserve">    </w:t>
+      </w:r>
+      <w:proofErr w:type="gramStart"/>
+      <w:r>
+        <w:t>COALESCE(</w:t>
+      </w:r>
+      <w:proofErr w:type="spellStart"/>
+      <w:r>
+        <w:t>wcs.recovered</w:t>
+      </w:r>
+      <w:proofErr w:type="spellEnd"/>
+      <w:proofErr w:type="gramEnd"/>
+      <w:r>
+        <w:t>, 0) AS recovered,</w:t>
+      </w:r>
+    </w:p>
+    <w:p>
+      <w:r>
+        <w:t xml:space="preserve">    </w:t>
+      </w:r>
+      <w:proofErr w:type="gramStart"/>
+      <w:r>
+        <w:t>COALESCE(</w:t>
+      </w:r>
+      <w:proofErr w:type="spellStart"/>
+      <w:r>
+        <w:t>es.expired</w:t>
+      </w:r>
+      <w:proofErr w:type="spellEnd"/>
+      <w:proofErr w:type="gramEnd"/>
+      <w:r>
+        <w:t>, 0) AS expired,</w:t>
+      </w:r>
+    </w:p>
+    <w:p>
+      <w:r>
+        <w:t xml:space="preserve">    (</w:t>
+      </w:r>
+    </w:p>
+    <w:p>
+      <w:r>
+        <w:t xml:space="preserve">        </w:t>
+      </w:r>
+      <w:proofErr w:type="gramStart"/>
+      <w:r>
+        <w:t>COALESCE(</w:t>
+      </w:r>
+      <w:proofErr w:type="spellStart"/>
+      <w:r>
+        <w:t>wcs.claimed</w:t>
+      </w:r>
+      <w:proofErr w:type="spellEnd"/>
+      <w:proofErr w:type="gramEnd"/>
+      <w:r>
+        <w:t>, 0)</w:t>
+      </w:r>
+    </w:p>
+    <w:p>
+      <w:r>
+        <w:t xml:space="preserve">        + </w:t>
+      </w:r>
+      <w:proofErr w:type="gramStart"/>
+      <w:r>
+        <w:t>COALESCE(</w:t>
+      </w:r>
+      <w:proofErr w:type="spellStart"/>
+      <w:proofErr w:type="gramEnd"/>
+      <w:r>
+        <w:t>wcs.to_vendor</w:t>
+      </w:r>
+      <w:proofErr w:type="spellEnd"/>
+      <w:r>
+        <w:t>, 0)</w:t>
+      </w:r>
+    </w:p>
+    <w:p>
+      <w:r>
+        <w:t xml:space="preserve">        + </w:t>
+      </w:r>
+      <w:proofErr w:type="gramStart"/>
+      <w:r>
+        <w:t>COALESCE(</w:t>
+      </w:r>
+      <w:proofErr w:type="spellStart"/>
+      <w:r>
+        <w:t>wcs.recovered</w:t>
+      </w:r>
+      <w:proofErr w:type="spellEnd"/>
+      <w:proofErr w:type="gramEnd"/>
+      <w:r>
+        <w:t>, 0)</w:t>
+      </w:r>
+    </w:p>
+    <w:p>
+      <w:r>
+        <w:t xml:space="preserve">        + </w:t>
+      </w:r>
+      <w:proofErr w:type="gramStart"/>
+      <w:r>
+        <w:t>COALESCE(</w:t>
+      </w:r>
+      <w:proofErr w:type="spellStart"/>
+      <w:r>
+        <w:t>es.expired</w:t>
+      </w:r>
+      <w:proofErr w:type="spellEnd"/>
+      <w:proofErr w:type="gramEnd"/>
+      <w:r>
+        <w:t>, 0)</w:t>
+      </w:r>
+    </w:p>
+    <w:p>
+      <w:r>
+        <w:t xml:space="preserve">    ) AS total</w:t>
+      </w:r>
+    </w:p>
+    <w:p>
+      <w:r>
+        <w:t xml:space="preserve">FROM </w:t>
+      </w:r>
+      <w:proofErr w:type="spellStart"/>
+      <w:r>
+        <w:t>warranty_claim_summary</w:t>
+      </w:r>
+      <w:proofErr w:type="spellEnd"/>
+      <w:r>
+        <w:t xml:space="preserve"> </w:t>
+      </w:r>
+      <w:proofErr w:type="spellStart"/>
+      <w:r>
+        <w:t>wcs</w:t>
+      </w:r>
+      <w:proofErr w:type="spellEnd"/>
+    </w:p>
+    <w:p>
+      <w:r>
+        <w:t xml:space="preserve">CROSS JOIN </w:t>
+      </w:r>
+      <w:proofErr w:type="spellStart"/>
+      <w:r>
+        <w:t>expired_summary</w:t>
+      </w:r>
+      <w:proofErr w:type="spellEnd"/>
+      <w:r>
+        <w:t xml:space="preserve"> es;</w:t>
+      </w:r>
+    </w:p>
+    <w:p/>
+    <w:p>
+      <w:r>
+        <w:lastRenderedPageBreak/>
+        <w:t xml:space="preserve">WITH </w:t>
+      </w:r>
+      <w:proofErr w:type="spellStart"/>
+      <w:r>
+        <w:t>claimed_assets</w:t>
+      </w:r>
+      <w:proofErr w:type="spellEnd"/>
+      <w:r>
+        <w:t xml:space="preserve"> AS (</w:t>
+      </w:r>
+    </w:p>
+    <w:p>
+      <w:r>
+        <w:t xml:space="preserve">    SELECT</w:t>
+      </w:r>
+    </w:p>
+    <w:p>
+      <w:r>
+        <w:t xml:space="preserve">        ad.id,</w:t>
+      </w:r>
+    </w:p>
+    <w:p>
+      <w:r>
+        <w:t xml:space="preserve">        </w:t>
+      </w:r>
+      <w:proofErr w:type="spellStart"/>
+      <w:proofErr w:type="gramStart"/>
+      <w:r>
+        <w:t>ad.device</w:t>
+      </w:r>
+      <w:proofErr w:type="gramEnd"/>
+      <w:r>
+        <w:t>_serial</w:t>
+      </w:r>
+      <w:proofErr w:type="spellEnd"/>
+    </w:p>
+    <w:p>
+      <w:r>
+        <w:t xml:space="preserve">    FROM </w:t>
+      </w:r>
+      <w:proofErr w:type="spellStart"/>
+      <w:proofErr w:type="gramStart"/>
+      <w:r>
+        <w:t>public.asset</w:t>
+      </w:r>
+      <w:proofErr w:type="gramEnd"/>
+      <w:r>
+        <w:t>_devices</w:t>
+      </w:r>
+      <w:proofErr w:type="spellEnd"/>
+      <w:r>
+        <w:t xml:space="preserve"> ad</w:t>
+      </w:r>
+    </w:p>
+    <w:p>
+      <w:r>
+        <w:t xml:space="preserve">    WHERE </w:t>
+      </w:r>
+      <w:proofErr w:type="spellStart"/>
+      <w:proofErr w:type="gramStart"/>
+      <w:r>
+        <w:t>ad.asset</w:t>
+      </w:r>
+      <w:proofErr w:type="gramEnd"/>
+      <w:r>
+        <w:t>_status</w:t>
+      </w:r>
+      <w:proofErr w:type="spellEnd"/>
+      <w:r>
+        <w:t xml:space="preserve"> = 8</w:t>
+      </w:r>
+    </w:p>
+    <w:p>
+      <w:r>
+        <w:t xml:space="preserve">      AND </w:t>
+      </w:r>
+      <w:proofErr w:type="spellStart"/>
+      <w:r>
+        <w:t>ad.row_status</w:t>
+      </w:r>
+      <w:proofErr w:type="spellEnd"/>
+      <w:r>
+        <w:t xml:space="preserve"> = 1</w:t>
+      </w:r>
+    </w:p>
+    <w:p>
+      <w:r>
+        <w:t>),</w:t>
+      </w:r>
+    </w:p>
+    <w:p/>
+    <w:p>
+      <w:proofErr w:type="spellStart"/>
+      <w:r>
+        <w:t>latest_claim_per_device</w:t>
+      </w:r>
+      <w:proofErr w:type="spellEnd"/>
+      <w:r>
+        <w:t xml:space="preserve"> AS (</w:t>
+      </w:r>
+    </w:p>
+    <w:p>
+      <w:r>
+        <w:t xml:space="preserve">    SELECT DISTINCT ON (</w:t>
+      </w:r>
+      <w:proofErr w:type="spellStart"/>
+      <w:proofErr w:type="gramStart"/>
+      <w:r>
+        <w:t>dc.device</w:t>
+      </w:r>
+      <w:proofErr w:type="gramEnd"/>
+      <w:r>
+        <w:t>_sl_no</w:t>
+      </w:r>
+      <w:proofErr w:type="spellEnd"/>
+      <w:r>
+        <w:t>)</w:t>
+      </w:r>
+    </w:p>
+    <w:p>
+      <w:r>
+        <w:t xml:space="preserve">        dc.id,</w:t>
+      </w:r>
+    </w:p>
+    <w:p>
+      <w:r>
+        <w:t xml:space="preserve">        </w:t>
+      </w:r>
+      <w:proofErr w:type="spellStart"/>
+      <w:r>
+        <w:t>dc.device_sl_no</w:t>
+      </w:r>
+      <w:proofErr w:type="spellEnd"/>
+      <w:r>
+        <w:t>,</w:t>
+      </w:r>
+    </w:p>
+    <w:p>
+      <w:r>
+        <w:t xml:space="preserve">        </w:t>
+      </w:r>
+      <w:proofErr w:type="spellStart"/>
+      <w:r>
+        <w:t>dc.reference_no_claim</w:t>
+      </w:r>
+      <w:proofErr w:type="spellEnd"/>
+      <w:r>
+        <w:t>,</w:t>
+      </w:r>
+    </w:p>
+    <w:p>
+      <w:r>
+        <w:t xml:space="preserve">        </w:t>
+      </w:r>
+      <w:proofErr w:type="spellStart"/>
+      <w:r>
+        <w:t>dc.claim_status</w:t>
+      </w:r>
+      <w:proofErr w:type="spellEnd"/>
+      <w:r>
+        <w:t>,</w:t>
+      </w:r>
+    </w:p>
+    <w:p>
+      <w:r>
+        <w:t xml:space="preserve">        </w:t>
+      </w:r>
+      <w:proofErr w:type="spellStart"/>
+      <w:r>
+        <w:t>dc.previous_status</w:t>
+      </w:r>
+      <w:proofErr w:type="spellEnd"/>
+      <w:r>
+        <w:t>,</w:t>
+      </w:r>
+    </w:p>
+    <w:p>
+      <w:r>
+        <w:t xml:space="preserve">        </w:t>
+      </w:r>
+      <w:proofErr w:type="spellStart"/>
+      <w:r>
+        <w:t>dc.remarks</w:t>
+      </w:r>
+      <w:proofErr w:type="spellEnd"/>
+      <w:r>
+        <w:t>,</w:t>
+      </w:r>
+    </w:p>
+    <w:p>
+      <w:r>
+        <w:t xml:space="preserve">        </w:t>
+      </w:r>
+      <w:proofErr w:type="spellStart"/>
+      <w:r>
+        <w:t>dc.problems</w:t>
+      </w:r>
+      <w:proofErr w:type="spellEnd"/>
+    </w:p>
+    <w:p>
+      <w:r>
+        <w:t xml:space="preserve">    FROM </w:t>
+      </w:r>
+      <w:proofErr w:type="spellStart"/>
+      <w:proofErr w:type="gramStart"/>
+      <w:r>
+        <w:t>public.device</w:t>
+      </w:r>
+      <w:proofErr w:type="gramEnd"/>
+      <w:r>
+        <w:t>_claims</w:t>
+      </w:r>
+      <w:proofErr w:type="spellEnd"/>
+      <w:r>
+        <w:t xml:space="preserve"> dc</w:t>
+      </w:r>
+    </w:p>
+    <w:p>
+      <w:r>
+        <w:t xml:space="preserve">    WHERE </w:t>
+      </w:r>
+      <w:proofErr w:type="spellStart"/>
+      <w:proofErr w:type="gramStart"/>
+      <w:r>
+        <w:t>dc.device</w:t>
+      </w:r>
+      <w:proofErr w:type="gramEnd"/>
+      <w:r>
+        <w:t>_sl_no</w:t>
+      </w:r>
+      <w:proofErr w:type="spellEnd"/>
+      <w:r>
+        <w:t xml:space="preserve"> IS NOT NULL</w:t>
+      </w:r>
+    </w:p>
+    <w:p>
+      <w:r>
+        <w:t xml:space="preserve">    ORDER BY </w:t>
+      </w:r>
+      <w:proofErr w:type="spellStart"/>
+      <w:proofErr w:type="gramStart"/>
+      <w:r>
+        <w:t>dc.device</w:t>
+      </w:r>
+      <w:proofErr w:type="gramEnd"/>
+      <w:r>
+        <w:t>_sl_no</w:t>
+      </w:r>
+      <w:proofErr w:type="spellEnd"/>
+      <w:r>
+        <w:t>, dc.id DESC</w:t>
+      </w:r>
+    </w:p>
+    <w:p>
+      <w:r>
+        <w:t>),</w:t>
+      </w:r>
+    </w:p>
+    <w:p/>
+    <w:p>
+      <w:proofErr w:type="spellStart"/>
+      <w:r>
+        <w:t>expired_summary</w:t>
+      </w:r>
+      <w:proofErr w:type="spellEnd"/>
+      <w:r>
+        <w:t xml:space="preserve"> AS (</w:t>
+      </w:r>
+    </w:p>
+    <w:p>
+      <w:r>
+        <w:t xml:space="preserve">    SELECT </w:t>
+      </w:r>
+      <w:proofErr w:type="gramStart"/>
+      <w:r>
+        <w:t>COUNT(</w:t>
+      </w:r>
+      <w:proofErr w:type="gramEnd"/>
+      <w:r>
+        <w:t>*) AS expired</w:t>
+      </w:r>
+    </w:p>
+    <w:p>
+      <w:r>
+        <w:t xml:space="preserve">    FROM </w:t>
+      </w:r>
+      <w:proofErr w:type="spellStart"/>
+      <w:proofErr w:type="gramStart"/>
+      <w:r>
+        <w:t>public.asset</w:t>
+      </w:r>
+      <w:proofErr w:type="gramEnd"/>
+      <w:r>
+        <w:t>_devices</w:t>
+      </w:r>
+      <w:proofErr w:type="spellEnd"/>
+      <w:r>
+        <w:t xml:space="preserve"> ad</w:t>
+      </w:r>
+    </w:p>
+    <w:p>
+      <w:r>
+        <w:lastRenderedPageBreak/>
+        <w:t xml:space="preserve">    WHERE </w:t>
+      </w:r>
+      <w:proofErr w:type="spellStart"/>
+      <w:r>
+        <w:t>ad.row_status</w:t>
+      </w:r>
+      <w:proofErr w:type="spellEnd"/>
+      <w:r>
+        <w:t xml:space="preserve"> = 1</w:t>
+      </w:r>
+    </w:p>
+    <w:p>
+      <w:r>
+        <w:t xml:space="preserve">      AND </w:t>
+      </w:r>
+      <w:proofErr w:type="spellStart"/>
+      <w:proofErr w:type="gramStart"/>
+      <w:r>
+        <w:t>ad.warranty</w:t>
+      </w:r>
+      <w:proofErr w:type="gramEnd"/>
+      <w:r>
+        <w:t>_date</w:t>
+      </w:r>
+      <w:proofErr w:type="spellEnd"/>
+      <w:r>
+        <w:t xml:space="preserve"> IS NOT NULL</w:t>
+      </w:r>
+    </w:p>
+    <w:p>
+      <w:r>
+        <w:t xml:space="preserve">      AND </w:t>
+      </w:r>
+      <w:proofErr w:type="spellStart"/>
+      <w:proofErr w:type="gramStart"/>
+      <w:r>
+        <w:t>ad.warranty</w:t>
+      </w:r>
+      <w:proofErr w:type="gramEnd"/>
+      <w:r>
+        <w:t>_</w:t>
+      </w:r>
+      <w:proofErr w:type="gramStart"/>
+      <w:r>
+        <w:t>date</w:t>
+      </w:r>
+      <w:proofErr w:type="spellEnd"/>
+      <w:r>
+        <w:t>::</w:t>
+      </w:r>
+      <w:proofErr w:type="gramEnd"/>
+      <w:r>
+        <w:t>date &lt; CURRENT_DATE</w:t>
+      </w:r>
+    </w:p>
+    <w:p>
+      <w:r>
+        <w:t>)</w:t>
+      </w:r>
+    </w:p>
+    <w:p/>
+    <w:p>
+      <w:r>
+        <w:t>SELECT</w:t>
+      </w:r>
+    </w:p>
+    <w:p>
+      <w:r>
+        <w:t xml:space="preserve">    </w:t>
+      </w:r>
+      <w:proofErr w:type="gramStart"/>
+      <w:r>
+        <w:t>COUNT(</w:t>
+      </w:r>
+      <w:proofErr w:type="gramEnd"/>
+      <w:r>
+        <w:t>DISTINCT ca.id) AS claimed,</w:t>
+      </w:r>
+    </w:p>
+    <w:p/>
+    <w:p>
+      <w:r>
+        <w:t xml:space="preserve">    </w:t>
+      </w:r>
+      <w:proofErr w:type="gramStart"/>
+      <w:r>
+        <w:t>COUNT(</w:t>
+      </w:r>
+      <w:proofErr w:type="gramEnd"/>
+      <w:r>
+        <w:t>*) FILTER (</w:t>
+      </w:r>
+    </w:p>
+    <w:p>
+      <w:r>
+        <w:t xml:space="preserve">        WHERE </w:t>
+      </w:r>
+      <w:proofErr w:type="spellStart"/>
+      <w:proofErr w:type="gramStart"/>
+      <w:r>
+        <w:t>lc.claim</w:t>
+      </w:r>
+      <w:proofErr w:type="gramEnd"/>
+      <w:r>
+        <w:t>_status</w:t>
+      </w:r>
+      <w:proofErr w:type="spellEnd"/>
+      <w:r>
+        <w:t xml:space="preserve"> = 9</w:t>
+      </w:r>
+    </w:p>
+    <w:p>
+      <w:r>
+        <w:t xml:space="preserve">    ) AS </w:t>
+      </w:r>
+      <w:proofErr w:type="spellStart"/>
+      <w:r>
+        <w:t>to_vendor</w:t>
+      </w:r>
+      <w:proofErr w:type="spellEnd"/>
+      <w:r>
+        <w:t>,</w:t>
+      </w:r>
+    </w:p>
+    <w:p/>
+    <w:p>
+      <w:r>
+        <w:t xml:space="preserve">    </w:t>
+      </w:r>
+      <w:proofErr w:type="gramStart"/>
+      <w:r>
+        <w:t>COUNT(</w:t>
+      </w:r>
+      <w:proofErr w:type="gramEnd"/>
+      <w:r>
+        <w:t>*) FILTER (</w:t>
+      </w:r>
+    </w:p>
+    <w:p>
+      <w:r>
+        <w:t xml:space="preserve">        WHERE </w:t>
+      </w:r>
+      <w:proofErr w:type="spellStart"/>
+      <w:proofErr w:type="gramStart"/>
+      <w:r>
+        <w:t>lc.claim</w:t>
+      </w:r>
+      <w:proofErr w:type="gramEnd"/>
+      <w:r>
+        <w:t>_status</w:t>
+      </w:r>
+      <w:proofErr w:type="spellEnd"/>
+      <w:r>
+        <w:t xml:space="preserve"> = 10</w:t>
+      </w:r>
+    </w:p>
+    <w:p>
+      <w:r>
+        <w:t xml:space="preserve">    ) AS recovered,</w:t>
+      </w:r>
+    </w:p>
+    <w:p/>
+    <w:p>
+      <w:r>
+        <w:t xml:space="preserve">    </w:t>
+      </w:r>
+      <w:proofErr w:type="gramStart"/>
+      <w:r>
+        <w:t>COALESCE(</w:t>
+      </w:r>
+      <w:proofErr w:type="gramEnd"/>
+      <w:r>
+        <w:t xml:space="preserve">(SELECT expired FROM </w:t>
+      </w:r>
+      <w:proofErr w:type="spellStart"/>
+      <w:r>
+        <w:t>expired_summary</w:t>
+      </w:r>
+      <w:proofErr w:type="spellEnd"/>
+      <w:r>
+        <w:t>), 0) AS expired,</w:t>
+      </w:r>
+    </w:p>
+    <w:p>
+      <w:r>
+        <w:t xml:space="preserve">    (</w:t>
+      </w:r>
+    </w:p>
+    <w:p>
+      <w:r>
+        <w:t xml:space="preserve">        </w:t>
+      </w:r>
+      <w:proofErr w:type="gramStart"/>
+      <w:r>
+        <w:t>COUNT(</w:t>
+      </w:r>
+      <w:proofErr w:type="gramEnd"/>
+      <w:r>
+        <w:t>DISTINCT ca.id)</w:t>
+      </w:r>
+    </w:p>
+    <w:p>
+      <w:r>
+        <w:t xml:space="preserve">        + </w:t>
+      </w:r>
+      <w:proofErr w:type="gramStart"/>
+      <w:r>
+        <w:t>COUNT(</w:t>
+      </w:r>
+      <w:proofErr w:type="gramEnd"/>
+      <w:r>
+        <w:t xml:space="preserve">*) FILTER (WHERE </w:t>
+      </w:r>
+      <w:proofErr w:type="spellStart"/>
+      <w:proofErr w:type="gramStart"/>
+      <w:r>
+        <w:t>lc.claim</w:t>
+      </w:r>
+      <w:proofErr w:type="gramEnd"/>
+      <w:r>
+        <w:t>_status</w:t>
+      </w:r>
+      <w:proofErr w:type="spellEnd"/>
+      <w:r>
+        <w:t xml:space="preserve"> = 9)</w:t>
+      </w:r>
+    </w:p>
+    <w:p>
+      <w:r>
+        <w:t xml:space="preserve">        + </w:t>
+      </w:r>
+      <w:proofErr w:type="gramStart"/>
+      <w:r>
+        <w:t>COUNT(</w:t>
+      </w:r>
+      <w:proofErr w:type="gramEnd"/>
+      <w:r>
+        <w:t xml:space="preserve">*) FILTER (WHERE </w:t>
+      </w:r>
+      <w:proofErr w:type="spellStart"/>
+      <w:proofErr w:type="gramStart"/>
+      <w:r>
+        <w:t>lc.claim</w:t>
+      </w:r>
+      <w:proofErr w:type="gramEnd"/>
+      <w:r>
+        <w:t>_status</w:t>
+      </w:r>
+      <w:proofErr w:type="spellEnd"/>
+      <w:r>
+        <w:t xml:space="preserve"> = 10)</w:t>
+      </w:r>
+    </w:p>
+    <w:p>
+      <w:r>
+        <w:t xml:space="preserve">        + </w:t>
+      </w:r>
+      <w:proofErr w:type="gramStart"/>
+      <w:r>
+        <w:t>COALESCE(</w:t>
+      </w:r>
+      <w:proofErr w:type="gramEnd"/>
+      <w:r>
+        <w:t xml:space="preserve">(SELECT expired FROM </w:t>
+      </w:r>
+      <w:proofErr w:type="spellStart"/>
+      <w:r>
+        <w:t>expired_summary</w:t>
+      </w:r>
+      <w:proofErr w:type="spellEnd"/>
+      <w:r>
+        <w:t>), 0)</w:t>
+      </w:r>
+    </w:p>
+    <w:p>
+      <w:r>
+        <w:t xml:space="preserve">    ) AS total</w:t>
+      </w:r>
+    </w:p>
+    <w:p>
+      <w:r>
+        <w:t xml:space="preserve">FROM </w:t>
+      </w:r>
+      <w:proofErr w:type="spellStart"/>
+      <w:r>
+        <w:t>claimed_assets</w:t>
+      </w:r>
+      <w:proofErr w:type="spellEnd"/>
+      <w:r>
+        <w:t xml:space="preserve"> ca</w:t>
+      </w:r>
+    </w:p>
+    <w:p>
+      <w:r>
+        <w:t xml:space="preserve">LEFT JOIN </w:t>
+      </w:r>
+      <w:proofErr w:type="spellStart"/>
+      <w:r>
+        <w:t>latest_claim_per_device</w:t>
+      </w:r>
+      <w:proofErr w:type="spellEnd"/>
+      <w:r>
+        <w:t xml:space="preserve"> lc</w:t>
+      </w:r>
+    </w:p>
+    <w:p>
+      <w:r>
+        <w:t xml:space="preserve">    ON </w:t>
+      </w:r>
+      <w:proofErr w:type="spellStart"/>
+      <w:proofErr w:type="gramStart"/>
+      <w:r>
+        <w:t>lc.device</w:t>
+      </w:r>
+      <w:proofErr w:type="gramEnd"/>
+      <w:r>
+        <w:t>_sl_no</w:t>
+      </w:r>
+      <w:proofErr w:type="spellEnd"/>
+      <w:r>
+        <w:t xml:space="preserve"> = </w:t>
+      </w:r>
+      <w:proofErr w:type="spellStart"/>
+      <w:proofErr w:type="gramStart"/>
+      <w:r>
+        <w:t>ca.device</w:t>
+      </w:r>
+      <w:proofErr w:type="gramEnd"/>
+      <w:r>
+        <w:t>_serial</w:t>
+      </w:r>
+      <w:proofErr w:type="spellEnd"/>
+      <w:r>
+        <w:t>;</w:t>
+      </w:r>
+    </w:p>
+    <w:p/>
+    <w:p/>
+    <w:p>
+      <w:r>
+        <w:drawing>
+          <wp:inline distT="0" distB="0" distL="0" distR="0" wp14:anchorId="51000137" wp14:editId="0B201B73">
+            <wp:extent cx="5943600" cy="3189605"/>
+            <wp:effectExtent l="0" t="0" r="0" b="0"/>
+            <wp:docPr id="1284588183" name="Picture 1"/>
+            <wp:cNvGraphicFramePr>
+              <a:graphicFrameLocks xmlns:a="http://schemas.openxmlformats.org/drawingml/2006/main" noChangeAspect="1"/>
+            </wp:cNvGraphicFramePr>
+            <a:graphic xmlns:a="http://schemas.openxmlformats.org/drawingml/2006/main">
+              <a:graphicData uri="http://schemas.openxmlformats.org/drawingml/2006/picture">
+                <pic:pic xmlns:pic="http://schemas.openxmlformats.org/drawingml/2006/picture">
+                  <pic:nvPicPr>
+                    <pic:cNvPr id="1284588183" name=""/>
+                    <pic:cNvPicPr/>
+                  </pic:nvPicPr>
+                  <pic:blipFill>
+                    <a:blip r:embed="rId8"/>
+                    <a:stretch>
+                      <a:fillRect/>
+                    </a:stretch>
+                  </pic:blipFill>
+                  <pic:spPr>
+                    <a:xfrm>
+                      <a:off x="0" y="0"/>
+                      <a:ext cx="5943600" cy="3189605"/>
+                    </a:xfrm>
+                    <a:prstGeom prst="rect">
+                      <a:avLst/>
+                    </a:prstGeom>
+                  </pic:spPr>
+                </pic:pic>
+              </a:graphicData>
+            </a:graphic>
+          </wp:inline>
+        </w:drawing>
+      </w:r>
+    </w:p>
+    <w:p/>
+    <w:p/>
+    <w:p>
+      <w:r>
+        <w:t>SELECT *</w:t>
+      </w:r>
+    </w:p>
+    <w:p>
+      <w:r>
+        <w:t xml:space="preserve">FROM </w:t>
+      </w:r>
+      <w:proofErr w:type="spellStart"/>
+      <w:proofErr w:type="gramStart"/>
+      <w:r>
+        <w:t>public.asset</w:t>
+      </w:r>
+      <w:proofErr w:type="gramEnd"/>
+      <w:r>
+        <w:t>_devices</w:t>
+      </w:r>
+      <w:proofErr w:type="spellEnd"/>
+    </w:p>
+    <w:p>
+      <w:r>
+        <w:t xml:space="preserve">WHERE </w:t>
+      </w:r>
+      <w:proofErr w:type="spellStart"/>
+      <w:r>
+        <w:t>row_status</w:t>
+      </w:r>
+      <w:proofErr w:type="spellEnd"/>
+      <w:r>
+        <w:t xml:space="preserve"> = 1</w:t>
+      </w:r>
+    </w:p>
+    <w:p>
+      <w:r>
+        <w:t xml:space="preserve">  AND </w:t>
+      </w:r>
+      <w:proofErr w:type="spellStart"/>
+      <w:r>
+        <w:t>warranty_date</w:t>
+      </w:r>
+      <w:proofErr w:type="spellEnd"/>
+      <w:r>
+        <w:t xml:space="preserve"> IS NOT NULL</w:t>
+      </w:r>
+    </w:p>
+    <w:p>
+      <w:r>
+        <w:t xml:space="preserve">  AND </w:t>
+      </w:r>
+      <w:proofErr w:type="spellStart"/>
+      <w:r>
+        <w:t>warranty_</w:t>
+      </w:r>
+      <w:proofErr w:type="gramStart"/>
+      <w:r>
+        <w:t>date</w:t>
+      </w:r>
+      <w:proofErr w:type="spellEnd"/>
+      <w:r>
+        <w:t>::</w:t>
+      </w:r>
+      <w:proofErr w:type="gramEnd"/>
+      <w:r>
+        <w:t>date &gt;= DATE_</w:t>
+      </w:r>
+      <w:proofErr w:type="gramStart"/>
+      <w:r>
+        <w:t>TRUNC(</w:t>
+      </w:r>
+      <w:proofErr w:type="gramEnd"/>
+      <w:r>
+        <w:t>'year', CURRENT_DATE</w:t>
+      </w:r>
+      <w:proofErr w:type="gramStart"/>
+      <w:r>
+        <w:t>)::</w:t>
+      </w:r>
+      <w:proofErr w:type="gramEnd"/>
+      <w:r>
+        <w:t>date</w:t>
+      </w:r>
+    </w:p>
+    <w:p>
+      <w:r>
+        <w:t xml:space="preserve">  AND </w:t>
+      </w:r>
+      <w:proofErr w:type="spellStart"/>
+      <w:r>
+        <w:t>warranty_</w:t>
+      </w:r>
+      <w:proofErr w:type="gramStart"/>
+      <w:r>
+        <w:t>date</w:t>
+      </w:r>
+      <w:proofErr w:type="spellEnd"/>
+      <w:r>
+        <w:t>::</w:t>
+      </w:r>
+      <w:proofErr w:type="gramEnd"/>
+      <w:r>
+        <w:t>date &lt; (DATE_</w:t>
+      </w:r>
+      <w:proofErr w:type="gramStart"/>
+      <w:r>
+        <w:t>TRUNC(</w:t>
+      </w:r>
+      <w:proofErr w:type="gramEnd"/>
+      <w:r>
+        <w:t>'year', CURRENT_DATE) + INTERVAL '1 year'</w:t>
+      </w:r>
+      <w:proofErr w:type="gramStart"/>
+      <w:r>
+        <w:t>)::</w:t>
+      </w:r>
+      <w:proofErr w:type="gramEnd"/>
+      <w:r>
+        <w:t>date</w:t>
+      </w:r>
+    </w:p>
+    <w:p>
+      <w:r>
+        <w:t xml:space="preserve">  AND </w:t>
+      </w:r>
+      <w:proofErr w:type="spellStart"/>
+      <w:r>
+        <w:t>warranty_</w:t>
+      </w:r>
+      <w:proofErr w:type="gramStart"/>
+      <w:r>
+        <w:t>date</w:t>
+      </w:r>
+      <w:proofErr w:type="spellEnd"/>
+      <w:r>
+        <w:t>::</w:t>
+      </w:r>
+      <w:proofErr w:type="gramEnd"/>
+      <w:r>
+        <w:t>date &lt; CURRENT_DATE</w:t>
+      </w:r>
+    </w:p>
+    <w:p>
+      <w:r>
+        <w:t xml:space="preserve">ORDER BY </w:t>
+      </w:r>
+      <w:proofErr w:type="spellStart"/>
+      <w:r>
+        <w:t>warranty_date</w:t>
+      </w:r>
+      <w:proofErr w:type="spellEnd"/>
+      <w:r>
+        <w:t xml:space="preserve"> ASC;</w:t>
+      </w:r>
+    </w:p>
+    <w:p/>
+    <w:p/>
+    <w:p/>
+    <w:p/>
+    <w:p/>
+    <w:p>
+      <w:r>
+        <w:drawing>
+          <wp:inline distT="0" distB="0" distL="0" distR="0" wp14:anchorId="5BD83D88" wp14:editId="7C8E42CC">
+            <wp:extent cx="5943600" cy="3181350"/>
+            <wp:effectExtent l="0" t="0" r="0" b="0"/>
+            <wp:docPr id="896840018" name="Picture 1"/>
+            <wp:cNvGraphicFramePr>
+              <a:graphicFrameLocks xmlns:a="http://schemas.openxmlformats.org/drawingml/2006/main" noChangeAspect="1"/>
+            </wp:cNvGraphicFramePr>
+            <a:graphic xmlns:a="http://schemas.openxmlformats.org/drawingml/2006/main">
+              <a:graphicData uri="http://schemas.openxmlformats.org/drawingml/2006/picture">
+                <pic:pic xmlns:pic="http://schemas.openxmlformats.org/drawingml/2006/picture">
+                  <pic:nvPicPr>
+                    <pic:cNvPr id="896840018" name=""/>
+                    <pic:cNvPicPr/>
+                  </pic:nvPicPr>
+                  <pic:blipFill>
+                    <a:blip r:embed="rId9"/>
+                    <a:stretch>
+                      <a:fillRect/>
+                    </a:stretch>
+                  </pic:blipFill>
+                  <pic:spPr>
+                    <a:xfrm>
+                      <a:off x="0" y="0"/>
+                      <a:ext cx="5943600" cy="3181350"/>
+                    </a:xfrm>
+                    <a:prstGeom prst="rect">
+                      <a:avLst/>
+                    </a:prstGeom>
+                  </pic:spPr>
+                </pic:pic>
+              </a:graphicData>
+            </a:graphic>
+          </wp:inline>
+        </w:drawing>
+      </w:r>
+    </w:p>
+    <w:p/>
+    <w:p/>
+    <w:p>
+      <w:r>
+        <w:t>Total Query</w:t>
+      </w:r>
+    </w:p>
+    <w:p/>
+    <w:p>
+      <w:pPr>
+        <w:rPr>
+          <w:i/>
+          <w:iCs/>
+        </w:rPr>
+      </w:pPr>
+      <w:r>
+        <w:rPr>
+          <w:i/>
+          <w:iCs/>
+        </w:rPr>
+        <w:t>const query = `</w:t>
+      </w:r>
+    </w:p>
+    <w:p>
+      <w:pPr>
+        <w:rPr>
+          <w:i/>
+          <w:iCs/>
+        </w:rPr>
+      </w:pPr>
+      <w:r>
+        <w:rPr>
+          <w:i/>
+          <w:iCs/>
+        </w:rPr>
+        <w:t xml:space="preserve">        WITH </w:t>
+      </w:r>
+      <w:proofErr w:type="spellStart"/>
+      <w:r>
+        <w:rPr>
+          <w:i/>
+          <w:iCs/>
+        </w:rPr>
+        <w:t>claimed_assets</w:t>
+      </w:r>
+      <w:proofErr w:type="spellEnd"/>
+      <w:r>
+        <w:rPr>
+          <w:i/>
+          <w:iCs/>
+        </w:rPr>
+        <w:t xml:space="preserve"> AS (</w:t>
+      </w:r>
+    </w:p>
+    <w:p>
+      <w:pPr>
+        <w:rPr>
+          <w:i/>
+          <w:iCs/>
+        </w:rPr>
+      </w:pPr>
+      <w:r>
+        <w:rPr>
+          <w:i/>
+          <w:iCs/>
+        </w:rPr>
+        <w:t>            SELECT</w:t>
+      </w:r>
+    </w:p>
+    <w:p>
+      <w:pPr>
+        <w:rPr>
+          <w:i/>
+          <w:iCs/>
+        </w:rPr>
+      </w:pPr>
+      <w:r>
+        <w:rPr>
+          <w:i/>
+          <w:iCs/>
+        </w:rPr>
+        <w:t>                ad.id,</w:t>
+      </w:r>
+    </w:p>
+    <w:p>
+      <w:pPr>
+        <w:rPr>
+          <w:i/>
+          <w:iCs/>
+        </w:rPr>
+      </w:pPr>
+      <w:r>
+        <w:rPr>
+          <w:i/>
+          <w:iCs/>
+        </w:rPr>
+        <w:t xml:space="preserve">                </w:t>
+      </w:r>
+      <w:proofErr w:type="spellStart"/>
+      <w:proofErr w:type="gramStart"/>
+      <w:r>
+        <w:rPr>
+          <w:i/>
+          <w:iCs/>
+        </w:rPr>
+        <w:t>ad.device</w:t>
+      </w:r>
+      <w:proofErr w:type="gramEnd"/>
+      <w:r>
+        <w:rPr>
+          <w:i/>
+          <w:iCs/>
+        </w:rPr>
+        <w:t>_serial</w:t>
+      </w:r>
+      <w:proofErr w:type="spellEnd"/>
+    </w:p>
+    <w:p>
+      <w:pPr>
+        <w:rPr>
+          <w:i/>
+          <w:iCs/>
+        </w:rPr>
+      </w:pPr>
+      <w:r>
+        <w:rPr>
+          <w:i/>
+          <w:iCs/>
+        </w:rPr>
+        <w:t xml:space="preserve">            FROM </w:t>
+      </w:r>
+      <w:proofErr w:type="spellStart"/>
+      <w:proofErr w:type="gramStart"/>
+      <w:r>
+        <w:rPr>
+          <w:i/>
+          <w:iCs/>
+        </w:rPr>
+        <w:t>public.asset</w:t>
+      </w:r>
+      <w:proofErr w:type="gramEnd"/>
+      <w:r>
+        <w:rPr>
+          <w:i/>
+          <w:iCs/>
+        </w:rPr>
+        <w:t>_devices</w:t>
+      </w:r>
+      <w:proofErr w:type="spellEnd"/>
+      <w:r>
+        <w:rPr>
+          <w:i/>
+          <w:iCs/>
+        </w:rPr>
+        <w:t xml:space="preserve"> ad</w:t>
+      </w:r>
+    </w:p>
+    <w:p>
+      <w:pPr>
+        <w:rPr>
+          <w:i/>
+          <w:iCs/>
+        </w:rPr>
+      </w:pPr>
+      <w:r>
+        <w:rPr>
+          <w:i/>
+          <w:iCs/>
+        </w:rPr>
+        <w:t xml:space="preserve">            WHERE </w:t>
+      </w:r>
+      <w:proofErr w:type="spellStart"/>
+      <w:proofErr w:type="gramStart"/>
+      <w:r>
+        <w:rPr>
+          <w:i/>
+          <w:iCs/>
+        </w:rPr>
+        <w:t>ad.asset</w:t>
+      </w:r>
+      <w:proofErr w:type="gramEnd"/>
+      <w:r>
+        <w:rPr>
+          <w:i/>
+          <w:iCs/>
+        </w:rPr>
+        <w:t>_status</w:t>
+      </w:r>
+      <w:proofErr w:type="spellEnd"/>
+      <w:r>
+        <w:rPr>
+          <w:i/>
+          <w:iCs/>
+        </w:rPr>
+        <w:t xml:space="preserve"> = 8</w:t>
+      </w:r>
+    </w:p>
+    <w:p>
+      <w:pPr>
+        <w:rPr>
+          <w:i/>
+          <w:iCs/>
+        </w:rPr>
+      </w:pPr>
+      <w:r>
+        <w:rPr>
+          <w:i/>
+          <w:iCs/>
+        </w:rPr>
+        <w:t xml:space="preserve">              AND </w:t>
+      </w:r>
+      <w:proofErr w:type="spellStart"/>
+      <w:r>
+        <w:rPr>
+          <w:i/>
+          <w:iCs/>
+        </w:rPr>
+        <w:t>ad.row_status</w:t>
+      </w:r>
+      <w:proofErr w:type="spellEnd"/>
+      <w:r>
+        <w:rPr>
+          <w:i/>
+          <w:iCs/>
+        </w:rPr>
+        <w:t xml:space="preserve"> = 1</w:t>
+      </w:r>
+    </w:p>
+    <w:p>
+      <w:pPr>
+        <w:rPr>
+          <w:i/>
+          <w:iCs/>
+        </w:rPr>
+      </w:pPr>
+      <w:r>
+        <w:rPr>
+          <w:i/>
+          <w:iCs/>
+        </w:rPr>
+        <w:t>        ),</w:t>
+      </w:r>
+    </w:p>
+    <w:p>
+      <w:pPr>
+        <w:rPr>
+          <w:i/>
+          <w:iCs/>
+        </w:rPr>
+      </w:pPr>
+    </w:p>
+    <w:p>
+      <w:pPr>
+        <w:rPr>
+          <w:i/>
+          <w:iCs/>
+        </w:rPr>
+      </w:pPr>
+      <w:r>
+        <w:rPr>
+          <w:i/>
+          <w:iCs/>
+        </w:rPr>
+        <w:t xml:space="preserve">        </w:t>
+      </w:r>
+      <w:proofErr w:type="spellStart"/>
+      <w:r>
+        <w:rPr>
+          <w:i/>
+          <w:iCs/>
+        </w:rPr>
+        <w:t>latest_claim_per_device</w:t>
+      </w:r>
+      <w:proofErr w:type="spellEnd"/>
+      <w:r>
+        <w:rPr>
+          <w:i/>
+          <w:iCs/>
+        </w:rPr>
+        <w:t xml:space="preserve"> AS (</w:t>
+      </w:r>
+    </w:p>
+    <w:p>
+      <w:pPr>
+        <w:rPr>
+          <w:i/>
+          <w:iCs/>
+        </w:rPr>
+      </w:pPr>
+      <w:r>
+        <w:rPr>
+          <w:i/>
+          <w:iCs/>
+        </w:rPr>
+        <w:t>            SELECT DISTINCT ON (</w:t>
+      </w:r>
+      <w:proofErr w:type="spellStart"/>
+      <w:proofErr w:type="gramStart"/>
+      <w:r>
+        <w:rPr>
+          <w:i/>
+          <w:iCs/>
+        </w:rPr>
+        <w:t>dc.device</w:t>
+      </w:r>
+      <w:proofErr w:type="gramEnd"/>
+      <w:r>
+        <w:rPr>
+          <w:i/>
+          <w:iCs/>
+        </w:rPr>
+        <w:t>_sl_no</w:t>
+      </w:r>
+      <w:proofErr w:type="spellEnd"/>
+      <w:r>
+        <w:rPr>
+          <w:i/>
+          <w:iCs/>
+        </w:rPr>
+        <w:t>)</w:t>
+      </w:r>
+    </w:p>
+    <w:p>
+      <w:pPr>
+        <w:rPr>
+          <w:i/>
+          <w:iCs/>
+        </w:rPr>
+      </w:pPr>
+      <w:r>
+        <w:rPr>
+          <w:i/>
+          <w:iCs/>
+        </w:rPr>
+        <w:t>                dc.id,</w:t>
+      </w:r>
+    </w:p>
+    <w:p>
+      <w:pPr>
+        <w:rPr>
+          <w:i/>
+          <w:iCs/>
+        </w:rPr>
+      </w:pPr>
+      <w:r>
+        <w:rPr>
+          <w:i/>
+          <w:iCs/>
+        </w:rPr>
+        <w:t xml:space="preserve">                </w:t>
+      </w:r>
+      <w:proofErr w:type="spellStart"/>
+      <w:r>
+        <w:rPr>
+          <w:i/>
+          <w:iCs/>
+        </w:rPr>
+        <w:t>dc.device_sl_no</w:t>
+      </w:r>
+      <w:proofErr w:type="spellEnd"/>
+      <w:r>
+        <w:rPr>
+          <w:i/>
+          <w:iCs/>
+        </w:rPr>
+        <w:t>,</w:t>
+      </w:r>
+    </w:p>
+    <w:p>
+      <w:pPr>
+        <w:rPr>
+          <w:i/>
+          <w:iCs/>
+        </w:rPr>
+      </w:pPr>
+      <w:r>
+        <w:rPr>
+          <w:i/>
+          <w:iCs/>
+        </w:rPr>
+        <w:t xml:space="preserve">                </w:t>
+      </w:r>
+      <w:proofErr w:type="spellStart"/>
+      <w:r>
+        <w:rPr>
+          <w:i/>
+          <w:iCs/>
+        </w:rPr>
+        <w:t>dc.reference_no_claim</w:t>
+      </w:r>
+      <w:proofErr w:type="spellEnd"/>
+      <w:r>
+        <w:rPr>
+          <w:i/>
+          <w:iCs/>
+        </w:rPr>
+        <w:t>,</w:t>
+      </w:r>
+    </w:p>
+    <w:p>
+      <w:pPr>
+        <w:rPr>
+          <w:i/>
+          <w:iCs/>
+        </w:rPr>
+      </w:pPr>
+      <w:r>
+        <w:rPr>
+          <w:i/>
+          <w:iCs/>
+        </w:rPr>
+        <w:t xml:space="preserve">                </w:t>
+      </w:r>
+      <w:proofErr w:type="spellStart"/>
+      <w:r>
+        <w:rPr>
+          <w:i/>
+          <w:iCs/>
+        </w:rPr>
+        <w:t>dc.claim_status</w:t>
+      </w:r>
+      <w:proofErr w:type="spellEnd"/>
+      <w:r>
+        <w:rPr>
+          <w:i/>
+          <w:iCs/>
+        </w:rPr>
+        <w:t>,</w:t>
+      </w:r>
+    </w:p>
+    <w:p>
+      <w:pPr>
+        <w:rPr>
+          <w:i/>
+          <w:iCs/>
+        </w:rPr>
+      </w:pPr>
+      <w:r>
+        <w:rPr>
+          <w:i/>
+          <w:iCs/>
+        </w:rPr>
+        <w:t xml:space="preserve">                </w:t>
+      </w:r>
+      <w:proofErr w:type="spellStart"/>
+      <w:r>
+        <w:rPr>
+          <w:i/>
+          <w:iCs/>
+        </w:rPr>
+        <w:t>dc.previous_status</w:t>
+      </w:r>
+      <w:proofErr w:type="spellEnd"/>
+      <w:r>
+        <w:rPr>
+          <w:i/>
+          <w:iCs/>
+        </w:rPr>
+        <w:t>,</w:t>
+      </w:r>
+    </w:p>
+    <w:p>
+      <w:pPr>
+        <w:rPr>
+          <w:i/>
+          <w:iCs/>
+        </w:rPr>
+      </w:pPr>
+      <w:r>
+        <w:rPr>
+          <w:i/>
+          <w:iCs/>
+        </w:rPr>
+        <w:t xml:space="preserve">                </w:t>
+      </w:r>
+      <w:proofErr w:type="spellStart"/>
+      <w:r>
+        <w:rPr>
+          <w:i/>
+          <w:iCs/>
+        </w:rPr>
+        <w:t>dc.remarks</w:t>
+      </w:r>
+      <w:proofErr w:type="spellEnd"/>
+      <w:r>
+        <w:rPr>
+          <w:i/>
+          <w:iCs/>
+        </w:rPr>
+        <w:t>,</w:t>
+      </w:r>
+    </w:p>
+    <w:p>
+      <w:pPr>
+        <w:rPr>
+          <w:i/>
+          <w:iCs/>
+        </w:rPr>
+      </w:pPr>
+      <w:r>
+        <w:rPr>
+          <w:i/>
+          <w:iCs/>
+        </w:rPr>
+        <w:t xml:space="preserve">                </w:t>
+      </w:r>
+      <w:proofErr w:type="spellStart"/>
+      <w:r>
+        <w:rPr>
+          <w:i/>
+          <w:iCs/>
+        </w:rPr>
+        <w:t>dc.problems</w:t>
+      </w:r>
+      <w:proofErr w:type="spellEnd"/>
+    </w:p>
+    <w:p>
+      <w:pPr>
+        <w:rPr>
+          <w:i/>
+          <w:iCs/>
+        </w:rPr>
+      </w:pPr>
+      <w:r>
+        <w:rPr>
+          <w:i/>
+          <w:iCs/>
+        </w:rPr>
+        <w:t xml:space="preserve">            FROM </w:t>
+      </w:r>
+      <w:proofErr w:type="spellStart"/>
+      <w:proofErr w:type="gramStart"/>
+      <w:r>
+        <w:rPr>
+          <w:i/>
+          <w:iCs/>
+        </w:rPr>
+        <w:t>public.device</w:t>
+      </w:r>
+      <w:proofErr w:type="gramEnd"/>
+      <w:r>
+        <w:rPr>
+          <w:i/>
+          <w:iCs/>
+        </w:rPr>
+        <w:t>_claims</w:t>
+      </w:r>
+      <w:proofErr w:type="spellEnd"/>
+      <w:r>
+        <w:rPr>
+          <w:i/>
+          <w:iCs/>
+        </w:rPr>
+        <w:t xml:space="preserve"> dc</w:t>
+      </w:r>
+    </w:p>
+    <w:p>
+      <w:pPr>
+        <w:rPr>
+          <w:i/>
+          <w:iCs/>
+        </w:rPr>
+      </w:pPr>
+      <w:r>
+        <w:rPr>
+          <w:i/>
+          <w:iCs/>
+        </w:rPr>
+        <w:t xml:space="preserve">            WHERE </w:t>
+      </w:r>
+      <w:proofErr w:type="spellStart"/>
+      <w:proofErr w:type="gramStart"/>
+      <w:r>
+        <w:rPr>
+          <w:i/>
+          <w:iCs/>
+        </w:rPr>
+        <w:t>dc.device</w:t>
+      </w:r>
+      <w:proofErr w:type="gramEnd"/>
+      <w:r>
+        <w:rPr>
+          <w:i/>
+          <w:iCs/>
+        </w:rPr>
+        <w:t>_sl_no</w:t>
+      </w:r>
+      <w:proofErr w:type="spellEnd"/>
+      <w:r>
+        <w:rPr>
+          <w:i/>
+          <w:iCs/>
+        </w:rPr>
+        <w:t xml:space="preserve"> IS NOT NULL</w:t>
+      </w:r>
+    </w:p>
+    <w:p>
+      <w:pPr>
+        <w:rPr>
+          <w:i/>
+          <w:iCs/>
+        </w:rPr>
+      </w:pPr>
+      <w:r>
+        <w:rPr>
+          <w:i/>
+          <w:iCs/>
+        </w:rPr>
+        <w:t xml:space="preserve">            ORDER BY </w:t>
+      </w:r>
+      <w:proofErr w:type="spellStart"/>
+      <w:proofErr w:type="gramStart"/>
+      <w:r>
+        <w:rPr>
+          <w:i/>
+          <w:iCs/>
+        </w:rPr>
+        <w:t>dc.device</w:t>
+      </w:r>
+      <w:proofErr w:type="gramEnd"/>
+      <w:r>
+        <w:rPr>
+          <w:i/>
+          <w:iCs/>
+        </w:rPr>
+        <w:t>_sl_no</w:t>
+      </w:r>
+      <w:proofErr w:type="spellEnd"/>
+      <w:r>
+        <w:rPr>
+          <w:i/>
+          <w:iCs/>
+        </w:rPr>
+        <w:t>, dc.id DESC</w:t>
+      </w:r>
+    </w:p>
+    <w:p>
+      <w:pPr>
+        <w:rPr>
+          <w:i/>
+          <w:iCs/>
+        </w:rPr>
+      </w:pPr>
+      <w:r>
+        <w:rPr>
+          <w:i/>
+          <w:iCs/>
+        </w:rPr>
+        <w:t>        ),</w:t>
+      </w:r>
+    </w:p>
+    <w:p>
+      <w:pPr>
+        <w:rPr>
+          <w:i/>
+          <w:iCs/>
+        </w:rPr>
+      </w:pPr>
+    </w:p>
+    <w:p>
+      <w:pPr>
+        <w:rPr>
+          <w:i/>
+          <w:iCs/>
+        </w:rPr>
+      </w:pPr>
+      <w:r>
+        <w:rPr>
+          <w:i/>
+          <w:iCs/>
+        </w:rPr>
+        <w:t xml:space="preserve">        </w:t>
+      </w:r>
+      <w:proofErr w:type="spellStart"/>
+      <w:r>
+        <w:rPr>
+          <w:i/>
+          <w:iCs/>
+        </w:rPr>
+        <w:t>expired_summary</w:t>
+      </w:r>
+      <w:proofErr w:type="spellEnd"/>
+      <w:r>
+        <w:rPr>
+          <w:i/>
+          <w:iCs/>
+        </w:rPr>
+        <w:t xml:space="preserve"> AS (</w:t>
+      </w:r>
+    </w:p>
+    <w:p>
+      <w:pPr>
+        <w:rPr>
+          <w:i/>
+          <w:iCs/>
+        </w:rPr>
+      </w:pPr>
+      <w:r>
+        <w:rPr>
+          <w:i/>
+          <w:iCs/>
+        </w:rPr>
+        <w:t xml:space="preserve">            SELECT </w:t>
+      </w:r>
+      <w:proofErr w:type="gramStart"/>
+      <w:r>
+        <w:rPr>
+          <w:i/>
+          <w:iCs/>
+        </w:rPr>
+        <w:t>COUNT(</w:t>
+      </w:r>
+      <w:proofErr w:type="gramEnd"/>
+      <w:r>
+        <w:rPr>
+          <w:i/>
+          <w:iCs/>
+        </w:rPr>
+        <w:t>*) AS expired</w:t>
+      </w:r>
+    </w:p>
+    <w:p>
+      <w:pPr>
+        <w:rPr>
+          <w:i/>
+          <w:iCs/>
+        </w:rPr>
+      </w:pPr>
+      <w:r>
+        <w:rPr>
+          <w:i/>
+          <w:iCs/>
+        </w:rPr>
+        <w:t xml:space="preserve">            FROM </w:t>
+      </w:r>
+      <w:proofErr w:type="spellStart"/>
+      <w:proofErr w:type="gramStart"/>
+      <w:r>
+        <w:rPr>
+          <w:i/>
+          <w:iCs/>
+        </w:rPr>
+        <w:t>public.asset</w:t>
+      </w:r>
+      <w:proofErr w:type="gramEnd"/>
+      <w:r>
+        <w:rPr>
+          <w:i/>
+          <w:iCs/>
+        </w:rPr>
+        <w:t>_devices</w:t>
+      </w:r>
+      <w:proofErr w:type="spellEnd"/>
+      <w:r>
+        <w:rPr>
+          <w:i/>
+          <w:iCs/>
+        </w:rPr>
+        <w:t xml:space="preserve"> ad</w:t>
+      </w:r>
+    </w:p>
+    <w:p>
+      <w:pPr>
+        <w:rPr>
+          <w:i/>
+          <w:iCs/>
+        </w:rPr>
+      </w:pPr>
+      <w:r>
+        <w:rPr>
+          <w:i/>
+          <w:iCs/>
+        </w:rPr>
+        <w:t xml:space="preserve">            WHERE </w:t>
+      </w:r>
+      <w:proofErr w:type="spellStart"/>
+      <w:r>
+        <w:rPr>
+          <w:i/>
+          <w:iCs/>
+        </w:rPr>
+        <w:t>ad.row_status</w:t>
+      </w:r>
+      <w:proofErr w:type="spellEnd"/>
+      <w:r>
+        <w:rPr>
+          <w:i/>
+          <w:iCs/>
+        </w:rPr>
+        <w:t xml:space="preserve"> = 1</w:t>
+      </w:r>
+    </w:p>
+    <w:p>
+      <w:pPr>
+        <w:rPr>
+          <w:i/>
+          <w:iCs/>
+        </w:rPr>
+      </w:pPr>
+      <w:r>
+        <w:rPr>
+          <w:i/>
+          <w:iCs/>
+        </w:rPr>
+        <w:t xml:space="preserve">              AND </w:t>
+      </w:r>
+      <w:proofErr w:type="spellStart"/>
+      <w:proofErr w:type="gramStart"/>
+      <w:r>
+        <w:rPr>
+          <w:i/>
+          <w:iCs/>
+        </w:rPr>
+        <w:t>ad.warranty</w:t>
+      </w:r>
+      <w:proofErr w:type="gramEnd"/>
+      <w:r>
+        <w:rPr>
+          <w:i/>
+          <w:iCs/>
+        </w:rPr>
+        <w:t>_date</w:t>
+      </w:r>
+      <w:proofErr w:type="spellEnd"/>
+      <w:r>
+        <w:rPr>
+          <w:i/>
+          <w:iCs/>
+        </w:rPr>
+        <w:t xml:space="preserve"> IS NOT NULL</w:t>
+      </w:r>
+    </w:p>
+    <w:p>
+      <w:pPr>
+        <w:rPr>
+          <w:i/>
+          <w:iCs/>
+        </w:rPr>
+      </w:pPr>
+      <w:r>
+        <w:rPr>
+          <w:i/>
+          <w:iCs/>
+        </w:rPr>
+        <w:t xml:space="preserve">              AND </w:t>
+      </w:r>
+      <w:proofErr w:type="spellStart"/>
+      <w:proofErr w:type="gramStart"/>
+      <w:r>
+        <w:rPr>
+          <w:i/>
+          <w:iCs/>
+        </w:rPr>
+        <w:t>ad.warranty</w:t>
+      </w:r>
+      <w:proofErr w:type="gramEnd"/>
+      <w:r>
+        <w:rPr>
+          <w:i/>
+          <w:iCs/>
+        </w:rPr>
+        <w:t>_</w:t>
+      </w:r>
+      <w:proofErr w:type="gramStart"/>
+      <w:r>
+        <w:rPr>
+          <w:i/>
+          <w:iCs/>
+        </w:rPr>
+        <w:t>date</w:t>
+      </w:r>
+      <w:proofErr w:type="spellEnd"/>
+      <w:r>
+        <w:rPr>
+          <w:i/>
+          <w:iCs/>
+        </w:rPr>
+        <w:t>::</w:t>
+      </w:r>
+      <w:proofErr w:type="gramEnd"/>
+      <w:r>
+        <w:rPr>
+          <w:i/>
+          <w:iCs/>
+        </w:rPr>
+        <w:t>date &lt; CURRENT_DATE</w:t>
+      </w:r>
+    </w:p>
+    <w:p>
+      <w:pPr>
+        <w:rPr>
+          <w:i/>
+          <w:iCs/>
+        </w:rPr>
+      </w:pPr>
+      <w:r>
+        <w:rPr>
+          <w:i/>
+          <w:iCs/>
+        </w:rPr>
+        <w:t>        )</w:t>
+      </w:r>
+    </w:p>
+    <w:p>
+      <w:pPr>
+        <w:rPr>
+          <w:i/>
+          <w:iCs/>
+        </w:rPr>
+      </w:pPr>
+    </w:p>
+    <w:p>
+      <w:pPr>
+        <w:rPr>
+          <w:i/>
+          <w:iCs/>
+        </w:rPr>
+      </w:pPr>
+      <w:r>
+        <w:rPr>
+          <w:i/>
+          <w:iCs/>
+        </w:rPr>
+        <w:t>        SELECT</w:t>
+      </w:r>
+    </w:p>
+    <w:p>
+      <w:pPr>
+        <w:rPr>
+          <w:i/>
+          <w:iCs/>
+        </w:rPr>
+      </w:pPr>
+      <w:r>
+        <w:rPr>
+          <w:i/>
+          <w:iCs/>
+        </w:rPr>
+        <w:t xml:space="preserve">            </w:t>
+      </w:r>
+      <w:proofErr w:type="gramStart"/>
+      <w:r>
+        <w:rPr>
+          <w:i/>
+          <w:iCs/>
+        </w:rPr>
+        <w:t>COUNT(</w:t>
+      </w:r>
+      <w:proofErr w:type="gramEnd"/>
+      <w:r>
+        <w:rPr>
+          <w:i/>
+          <w:iCs/>
+        </w:rPr>
+        <w:t>DISTINCT ca.id) AS claimed,</w:t>
+      </w:r>
+    </w:p>
+    <w:p>
+      <w:pPr>
+        <w:rPr>
+          <w:i/>
+          <w:iCs/>
+        </w:rPr>
+      </w:pPr>
+    </w:p>
+    <w:p>
+      <w:pPr>
+        <w:rPr>
+          <w:i/>
+          <w:iCs/>
+        </w:rPr>
+      </w:pPr>
+      <w:r>
+        <w:rPr>
+          <w:i/>
+          <w:iCs/>
+        </w:rPr>
+        <w:lastRenderedPageBreak/>
+        <w:t xml:space="preserve">            </w:t>
+      </w:r>
+      <w:proofErr w:type="gramStart"/>
+      <w:r>
+        <w:rPr>
+          <w:i/>
+          <w:iCs/>
+        </w:rPr>
+        <w:t>COUNT(</w:t>
+      </w:r>
+      <w:proofErr w:type="gramEnd"/>
+      <w:r>
+        <w:rPr>
+          <w:i/>
+          <w:iCs/>
+        </w:rPr>
+        <w:t>*) FILTER (</w:t>
+      </w:r>
+    </w:p>
+    <w:p>
+      <w:pPr>
+        <w:rPr>
+          <w:i/>
+          <w:iCs/>
+        </w:rPr>
+      </w:pPr>
+      <w:r>
+        <w:rPr>
+          <w:i/>
+          <w:iCs/>
+        </w:rPr>
+        <w:t xml:space="preserve">                WHERE </w:t>
+      </w:r>
+      <w:proofErr w:type="spellStart"/>
+      <w:proofErr w:type="gramStart"/>
+      <w:r>
+        <w:rPr>
+          <w:i/>
+          <w:iCs/>
+        </w:rPr>
+        <w:t>lc.claim</w:t>
+      </w:r>
+      <w:proofErr w:type="gramEnd"/>
+      <w:r>
+        <w:rPr>
+          <w:i/>
+          <w:iCs/>
+        </w:rPr>
+        <w:t>_status</w:t>
+      </w:r>
+      <w:proofErr w:type="spellEnd"/>
+      <w:r>
+        <w:rPr>
+          <w:i/>
+          <w:iCs/>
+        </w:rPr>
+        <w:t xml:space="preserve"> = 9</w:t>
+      </w:r>
+    </w:p>
+    <w:p>
+      <w:pPr>
+        <w:rPr>
+          <w:i/>
+          <w:iCs/>
+        </w:rPr>
+      </w:pPr>
+      <w:r>
+        <w:rPr>
+          <w:i/>
+          <w:iCs/>
+        </w:rPr>
+        <w:t xml:space="preserve">            ) AS </w:t>
+      </w:r>
+      <w:proofErr w:type="spellStart"/>
+      <w:r>
+        <w:rPr>
+          <w:i/>
+          <w:iCs/>
+        </w:rPr>
+        <w:t>to_vendor</w:t>
+      </w:r>
+      <w:proofErr w:type="spellEnd"/>
+      <w:r>
+        <w:rPr>
+          <w:i/>
+          <w:iCs/>
+        </w:rPr>
+        <w:t>,</w:t>
+      </w:r>
+    </w:p>
+    <w:p>
+      <w:pPr>
+        <w:rPr>
+          <w:i/>
+          <w:iCs/>
+        </w:rPr>
+      </w:pPr>
+    </w:p>
+    <w:p>
+      <w:pPr>
+        <w:rPr>
+          <w:i/>
+          <w:iCs/>
+        </w:rPr>
+      </w:pPr>
+      <w:r>
+        <w:rPr>
+          <w:i/>
+          <w:iCs/>
+        </w:rPr>
+        <w:t xml:space="preserve">            </w:t>
+      </w:r>
+      <w:proofErr w:type="gramStart"/>
+      <w:r>
+        <w:rPr>
+          <w:i/>
+          <w:iCs/>
+        </w:rPr>
+        <w:t>COUNT(</w:t>
+      </w:r>
+      <w:proofErr w:type="gramEnd"/>
+      <w:r>
+        <w:rPr>
+          <w:i/>
+          <w:iCs/>
+        </w:rPr>
+        <w:t>*) FILTER (</w:t>
+      </w:r>
+    </w:p>
+    <w:p>
+      <w:pPr>
+        <w:rPr>
+          <w:i/>
+          <w:iCs/>
+        </w:rPr>
+      </w:pPr>
+      <w:r>
+        <w:rPr>
+          <w:i/>
+          <w:iCs/>
+        </w:rPr>
+        <w:t xml:space="preserve">                WHERE </w:t>
+      </w:r>
+      <w:proofErr w:type="spellStart"/>
+      <w:proofErr w:type="gramStart"/>
+      <w:r>
+        <w:rPr>
+          <w:i/>
+          <w:iCs/>
+        </w:rPr>
+        <w:t>lc.claim</w:t>
+      </w:r>
+      <w:proofErr w:type="gramEnd"/>
+      <w:r>
+        <w:rPr>
+          <w:i/>
+          <w:iCs/>
+        </w:rPr>
+        <w:t>_status</w:t>
+      </w:r>
+      <w:proofErr w:type="spellEnd"/>
+      <w:r>
+        <w:rPr>
+          <w:i/>
+          <w:iCs/>
+        </w:rPr>
+        <w:t xml:space="preserve"> = 10</w:t>
+      </w:r>
+    </w:p>
+    <w:p>
+      <w:pPr>
+        <w:rPr>
+          <w:i/>
+          <w:iCs/>
+        </w:rPr>
+      </w:pPr>
+      <w:r>
+        <w:rPr>
+          <w:i/>
+          <w:iCs/>
+        </w:rPr>
+        <w:t>            ) AS recovered,</w:t>
+      </w:r>
+    </w:p>
+    <w:p>
+      <w:pPr>
+        <w:rPr>
+          <w:i/>
+          <w:iCs/>
+        </w:rPr>
+      </w:pPr>
+    </w:p>
+    <w:p>
+      <w:pPr>
+        <w:rPr>
+          <w:i/>
+          <w:iCs/>
+        </w:rPr>
+      </w:pPr>
+      <w:r>
+        <w:rPr>
+          <w:i/>
+          <w:iCs/>
+        </w:rPr>
+        <w:t xml:space="preserve">            </w:t>
+      </w:r>
+      <w:proofErr w:type="gramStart"/>
+      <w:r>
+        <w:rPr>
+          <w:i/>
+          <w:iCs/>
+        </w:rPr>
+        <w:t>COALESCE(</w:t>
+      </w:r>
+      <w:proofErr w:type="gramEnd"/>
+      <w:r>
+        <w:rPr>
+          <w:i/>
+          <w:iCs/>
+        </w:rPr>
+        <w:t xml:space="preserve">(SELECT expired FROM </w:t>
+      </w:r>
+      <w:proofErr w:type="spellStart"/>
+      <w:r>
+        <w:rPr>
+          <w:i/>
+          <w:iCs/>
+        </w:rPr>
+        <w:t>expired_summary</w:t>
+      </w:r>
+      <w:proofErr w:type="spellEnd"/>
+      <w:r>
+        <w:rPr>
+          <w:i/>
+          <w:iCs/>
+        </w:rPr>
+        <w:t>), 0) AS expired,</w:t>
+      </w:r>
+    </w:p>
+    <w:p>
+      <w:pPr>
+        <w:rPr>
+          <w:i/>
+          <w:iCs/>
+        </w:rPr>
+      </w:pPr>
+    </w:p>
+    <w:p>
+      <w:pPr>
+        <w:rPr>
+          <w:i/>
+          <w:iCs/>
+        </w:rPr>
+      </w:pPr>
+      <w:r>
+        <w:rPr>
+          <w:i/>
+          <w:iCs/>
+        </w:rPr>
+        <w:t>            (</w:t>
+      </w:r>
+    </w:p>
+    <w:p>
+      <w:pPr>
+        <w:rPr>
+          <w:i/>
+          <w:iCs/>
+        </w:rPr>
+      </w:pPr>
+      <w:r>
+        <w:rPr>
+          <w:i/>
+          <w:iCs/>
+        </w:rPr>
+        <w:t xml:space="preserve">                </w:t>
+      </w:r>
+      <w:proofErr w:type="gramStart"/>
+      <w:r>
+        <w:rPr>
+          <w:i/>
+          <w:iCs/>
+        </w:rPr>
+        <w:t>COUNT(</w:t>
+      </w:r>
+      <w:proofErr w:type="gramEnd"/>
+      <w:r>
+        <w:rPr>
+          <w:i/>
+          <w:iCs/>
+        </w:rPr>
+        <w:t>DISTINCT ca.id)</w:t>
+      </w:r>
+    </w:p>
+    <w:p>
+      <w:pPr>
+        <w:rPr>
+          <w:i/>
+          <w:iCs/>
+        </w:rPr>
+      </w:pPr>
+      <w:r>
+        <w:rPr>
+          <w:i/>
+          <w:iCs/>
+        </w:rPr>
+        <w:t xml:space="preserve">                + </w:t>
+      </w:r>
+      <w:proofErr w:type="gramStart"/>
+      <w:r>
+        <w:rPr>
+          <w:i/>
+          <w:iCs/>
+        </w:rPr>
+        <w:t>COUNT(</w:t>
+      </w:r>
+      <w:proofErr w:type="gramEnd"/>
+      <w:r>
+        <w:rPr>
+          <w:i/>
+          <w:iCs/>
+        </w:rPr>
+        <w:t xml:space="preserve">*) FILTER (WHERE </w:t>
+      </w:r>
+      <w:proofErr w:type="spellStart"/>
+      <w:proofErr w:type="gramStart"/>
+      <w:r>
+        <w:rPr>
+          <w:i/>
+          <w:iCs/>
+        </w:rPr>
+        <w:t>lc.claim</w:t>
+      </w:r>
+      <w:proofErr w:type="gramEnd"/>
+      <w:r>
+        <w:rPr>
+          <w:i/>
+          <w:iCs/>
+        </w:rPr>
+        <w:t>_status</w:t>
+      </w:r>
+      <w:proofErr w:type="spellEnd"/>
+      <w:r>
+        <w:rPr>
+          <w:i/>
+          <w:iCs/>
+        </w:rPr>
+        <w:t xml:space="preserve"> = 9)</w:t>
+      </w:r>
+    </w:p>
+    <w:p>
+      <w:pPr>
+        <w:rPr>
+          <w:i/>
+          <w:iCs/>
+        </w:rPr>
+      </w:pPr>
+      <w:r>
+        <w:rPr>
+          <w:i/>
+          <w:iCs/>
+        </w:rPr>
+        <w:t xml:space="preserve">                + </w:t>
+      </w:r>
+      <w:proofErr w:type="gramStart"/>
+      <w:r>
+        <w:rPr>
+          <w:i/>
+          <w:iCs/>
+        </w:rPr>
+        <w:t>COUNT(</w:t>
+      </w:r>
+      <w:proofErr w:type="gramEnd"/>
+      <w:r>
+        <w:rPr>
+          <w:i/>
+          <w:iCs/>
+        </w:rPr>
+        <w:t xml:space="preserve">*) FILTER (WHERE </w:t>
+      </w:r>
+      <w:proofErr w:type="spellStart"/>
+      <w:proofErr w:type="gramStart"/>
+      <w:r>
+        <w:rPr>
+          <w:i/>
+          <w:iCs/>
+        </w:rPr>
+        <w:t>lc.claim</w:t>
+      </w:r>
+      <w:proofErr w:type="gramEnd"/>
+      <w:r>
+        <w:rPr>
+          <w:i/>
+          <w:iCs/>
+        </w:rPr>
+        <w:t>_status</w:t>
+      </w:r>
+      <w:proofErr w:type="spellEnd"/>
+      <w:r>
+        <w:rPr>
+          <w:i/>
+          <w:iCs/>
+        </w:rPr>
+        <w:t xml:space="preserve"> = 10)</w:t>
+      </w:r>
+    </w:p>
+    <w:p>
+      <w:pPr>
+        <w:rPr>
+          <w:i/>
+          <w:iCs/>
+        </w:rPr>
+      </w:pPr>
+      <w:r>
+        <w:rPr>
+          <w:i/>
+          <w:iCs/>
+        </w:rPr>
+        <w:t xml:space="preserve">                + </w:t>
+      </w:r>
+      <w:proofErr w:type="gramStart"/>
+      <w:r>
+        <w:rPr>
+          <w:i/>
+          <w:iCs/>
+        </w:rPr>
+        <w:t>COALESCE(</w:t>
+      </w:r>
+      <w:proofErr w:type="gramEnd"/>
+      <w:r>
+        <w:rPr>
+          <w:i/>
+          <w:iCs/>
+        </w:rPr>
+        <w:t xml:space="preserve">(SELECT expired FROM </w:t>
+      </w:r>
+      <w:proofErr w:type="spellStart"/>
+      <w:r>
+        <w:rPr>
+          <w:i/>
+          <w:iCs/>
+        </w:rPr>
+        <w:t>expired_summary</w:t>
+      </w:r>
+      <w:proofErr w:type="spellEnd"/>
+      <w:r>
+        <w:rPr>
+          <w:i/>
+          <w:iCs/>
+        </w:rPr>
+        <w:t>), 0)</w:t>
+      </w:r>
+    </w:p>
+    <w:p>
+      <w:pPr>
+        <w:rPr>
+          <w:i/>
+          <w:iCs/>
+        </w:rPr>
+      </w:pPr>
+      <w:r>
+        <w:rPr>
+          <w:i/>
+          <w:iCs/>
+        </w:rPr>
+        <w:t>            ) AS total</w:t>
+      </w:r>
+    </w:p>
+    <w:p>
+      <w:pPr>
+        <w:rPr>
+          <w:i/>
+          <w:iCs/>
+        </w:rPr>
+      </w:pPr>
+    </w:p>
+    <w:p>
+      <w:pPr>
+        <w:rPr>
+          <w:i/>
+          <w:iCs/>
+        </w:rPr>
+      </w:pPr>
+      <w:r>
+        <w:rPr>
+          <w:i/>
+          <w:iCs/>
+        </w:rPr>
+        <w:t xml:space="preserve">        FROM </w:t>
+      </w:r>
+      <w:proofErr w:type="spellStart"/>
+      <w:r>
+        <w:rPr>
+          <w:i/>
+          <w:iCs/>
+        </w:rPr>
+        <w:t>claimed_assets</w:t>
+      </w:r>
+      <w:proofErr w:type="spellEnd"/>
+      <w:r>
+        <w:rPr>
+          <w:i/>
+          <w:iCs/>
+        </w:rPr>
+        <w:t xml:space="preserve"> ca</w:t>
+      </w:r>
+    </w:p>
+    <w:p>
+      <w:pPr>
+        <w:rPr>
+          <w:i/>
+          <w:iCs/>
+        </w:rPr>
+      </w:pPr>
+      <w:r>
+        <w:rPr>
+          <w:i/>
+          <w:iCs/>
+        </w:rPr>
+        <w:t xml:space="preserve">        LEFT JOIN </w:t>
+      </w:r>
+      <w:proofErr w:type="spellStart"/>
+      <w:r>
+        <w:rPr>
+          <w:i/>
+          <w:iCs/>
+        </w:rPr>
+        <w:t>latest_claim_per_device</w:t>
+      </w:r>
+      <w:proofErr w:type="spellEnd"/>
+      <w:r>
+        <w:rPr>
+          <w:i/>
+          <w:iCs/>
+        </w:rPr>
+        <w:t xml:space="preserve"> lc</w:t>
+      </w:r>
+    </w:p>
+    <w:p>
+      <w:pPr>
+        <w:rPr>
+          <w:i/>
+          <w:iCs/>
+        </w:rPr>
+      </w:pPr>
+      <w:r>
+        <w:rPr>
+          <w:i/>
+          <w:iCs/>
+        </w:rPr>
+        <w:t xml:space="preserve">            ON </w:t>
+      </w:r>
+      <w:proofErr w:type="spellStart"/>
+      <w:proofErr w:type="gramStart"/>
+      <w:r>
+        <w:rPr>
+          <w:i/>
+          <w:iCs/>
+        </w:rPr>
+        <w:t>lc.device</w:t>
+      </w:r>
+      <w:proofErr w:type="gramEnd"/>
+      <w:r>
+        <w:rPr>
+          <w:i/>
+          <w:iCs/>
+        </w:rPr>
+        <w:t>_sl_no</w:t>
+      </w:r>
+      <w:proofErr w:type="spellEnd"/>
+      <w:r>
+        <w:rPr>
+          <w:i/>
+          <w:iCs/>
+        </w:rPr>
+        <w:t xml:space="preserve"> = </w:t>
+      </w:r>
+      <w:proofErr w:type="spellStart"/>
+      <w:proofErr w:type="gramStart"/>
+      <w:r>
+        <w:rPr>
+          <w:i/>
+          <w:iCs/>
+        </w:rPr>
+        <w:t>ca.device</w:t>
+      </w:r>
+      <w:proofErr w:type="gramEnd"/>
+      <w:r>
+        <w:rPr>
+          <w:i/>
+          <w:iCs/>
+        </w:rPr>
+        <w:t>_serial</w:t>
+      </w:r>
+      <w:proofErr w:type="spellEnd"/>
+    </w:p>
+    <w:p>
+      <w:pPr>
+        <w:rPr>
+          <w:i/>
+          <w:iCs/>
+        </w:rPr>
+      </w:pPr>
+      <w:r>
+        <w:rPr>
+          <w:i/>
+          <w:iCs/>
+        </w:rPr>
+        <w:t>    `</w:t>
+      </w:r>
+    </w:p>
     <w:p/>
     <w:sectPr>
       <w:pgSz w:w="12240" w:h="15840"/>

</xml_diff>

<commit_message>
Warranty Claims Data is showing inside Data Table without Recovered Data
</commit_message>
<xml_diff>
--- a/document/server.docx
+++ b/document/server.docx
@@ -49,70 +49,47 @@
           <w:b/>
           <w:bCs/>
         </w:rPr>
-        <w:t xml:space="preserve">frontend/Vite/React </w:t>
-      </w:r>
-      <w:proofErr w:type="gramStart"/>
+        <w:t>frontend/Vite/React server</w:t>
+      </w:r>
       <w:r>
         <w:rPr>
           <w:b/>
           <w:bCs/>
         </w:rPr>
-        <w:t>server</w:t>
-      </w:r>
-      <w:r>
-        <w:rPr>
-          <w:b/>
-          <w:bCs/>
-        </w:rPr>
         <w:t xml:space="preserve">  </w:t>
       </w:r>
-      <w:proofErr w:type="spellStart"/>
       <w:r>
         <w:rPr>
           <w:rFonts w:ascii="Nirmala UI" w:hAnsi="Nirmala UI" w:cs="Nirmala UI"/>
         </w:rPr>
         <w:t>তাই</w:t>
       </w:r>
-      <w:proofErr w:type="spellEnd"/>
-      <w:proofErr w:type="gramEnd"/>
       <w:r>
         <w:t xml:space="preserve"> HTML response </w:t>
       </w:r>
-      <w:proofErr w:type="spellStart"/>
       <w:r>
         <w:rPr>
           <w:rFonts w:ascii="Nirmala UI" w:hAnsi="Nirmala UI" w:cs="Nirmala UI"/>
         </w:rPr>
         <w:t>আসছে</w:t>
       </w:r>
-      <w:proofErr w:type="spellEnd"/>
       <w:r>
         <w:t xml:space="preserve"> </w:t>
       </w:r>
-      <w:proofErr w:type="spellStart"/>
       <w:r>
         <w:rPr>
           <w:rFonts w:ascii="Nirmala UI" w:hAnsi="Nirmala UI" w:cs="Nirmala UI"/>
         </w:rPr>
         <w:t>এবং</w:t>
       </w:r>
-      <w:proofErr w:type="spellEnd"/>
       <w:r>
         <w:t xml:space="preserve"> 404 Not Found </w:t>
       </w:r>
-      <w:proofErr w:type="spellStart"/>
       <w:r>
         <w:rPr>
           <w:rFonts w:ascii="Nirmala UI" w:hAnsi="Nirmala UI" w:cs="Nirmala UI"/>
         </w:rPr>
-        <w:t>দেখাচ্ছে</w:t>
-      </w:r>
-      <w:proofErr w:type="spellEnd"/>
-      <w:r>
-        <w:rPr>
-          <w:rFonts w:ascii="Nirmala UI" w:hAnsi="Nirmala UI" w:cs="Nirmala UI"/>
-        </w:rPr>
-        <w:t>।</w:t>
+        <w:t>দেখাচ্ছে।</w:t>
       </w:r>
     </w:p>
     <w:p>
@@ -133,44 +110,30 @@
           <w:numId w:val="1"/>
         </w:numPr>
       </w:pPr>
-      <w:proofErr w:type="spellStart"/>
       <w:r>
         <w:rPr>
           <w:rFonts w:ascii="Nirmala UI" w:hAnsi="Nirmala UI" w:cs="Nirmala UI"/>
         </w:rPr>
         <w:t>আপনার</w:t>
       </w:r>
-      <w:proofErr w:type="spellEnd"/>
-      <w:r>
-        <w:t xml:space="preserve"> </w:t>
-      </w:r>
-      <w:proofErr w:type="gramStart"/>
-      <w:r>
-        <w:t>backend .env</w:t>
-      </w:r>
-      <w:proofErr w:type="gramEnd"/>
-      <w:r>
-        <w:t xml:space="preserve"> </w:t>
-      </w:r>
-      <w:proofErr w:type="spellStart"/>
+      <w:r>
+        <w:t xml:space="preserve"> backend .env </w:t>
+      </w:r>
       <w:r>
         <w:rPr>
           <w:rFonts w:ascii="Nirmala UI" w:hAnsi="Nirmala UI" w:cs="Nirmala UI"/>
         </w:rPr>
         <w:t>অনুযায়ী</w:t>
       </w:r>
-      <w:proofErr w:type="spellEnd"/>
       <w:r>
         <w:t xml:space="preserve"> backend </w:t>
       </w:r>
-      <w:proofErr w:type="spellStart"/>
       <w:r>
         <w:rPr>
           <w:rFonts w:ascii="Nirmala UI" w:hAnsi="Nirmala UI" w:cs="Nirmala UI"/>
         </w:rPr>
         <w:t>চলছে</w:t>
       </w:r>
-      <w:proofErr w:type="spellEnd"/>
       <w:r>
         <w:t>:</w:t>
       </w:r>
@@ -248,7 +211,6 @@
           <w14:ligatures w14:val="none"/>
         </w:rPr>
       </w:pPr>
-      <w:proofErr w:type="spellStart"/>
       <w:r>
         <w:rPr>
           <w:rFonts w:ascii="Nirmala UI" w:eastAsia="Times New Roman" w:hAnsi="Nirmala UI" w:cs="Nirmala UI"/>
@@ -257,7 +219,6 @@
         </w:rPr>
         <w:t>তাই</w:t>
       </w:r>
-      <w:proofErr w:type="spellEnd"/>
       <w:r>
         <w:rPr>
           <w:rFonts w:ascii="Times New Roman" w:eastAsia="Times New Roman" w:hAnsi="Times New Roman" w:cs="Times New Roman"/>
@@ -266,7 +227,6 @@
         </w:rPr>
         <w:t xml:space="preserve"> Postman URL </w:t>
       </w:r>
-      <w:proofErr w:type="spellStart"/>
       <w:r>
         <w:rPr>
           <w:rFonts w:ascii="Nirmala UI" w:eastAsia="Times New Roman" w:hAnsi="Nirmala UI" w:cs="Nirmala UI"/>
@@ -275,7 +235,6 @@
         </w:rPr>
         <w:t>হবে</w:t>
       </w:r>
-      <w:proofErr w:type="spellEnd"/>
       <w:r>
         <w:rPr>
           <w:rFonts w:ascii="Times New Roman" w:eastAsia="Times New Roman" w:hAnsi="Times New Roman" w:cs="Times New Roman"/>
@@ -435,7 +394,6 @@
           <w14:ligatures w14:val="none"/>
         </w:rPr>
       </w:pPr>
-      <w:proofErr w:type="spellStart"/>
       <w:r>
         <w:rPr>
           <w:rFonts w:ascii="Nirmala UI" w:eastAsia="Times New Roman" w:hAnsi="Nirmala UI" w:cs="Nirmala UI"/>
@@ -444,7 +402,6 @@
         </w:rPr>
         <w:t>আপনার</w:t>
       </w:r>
-      <w:proofErr w:type="spellEnd"/>
       <w:r>
         <w:rPr>
           <w:rFonts w:ascii="Times New Roman" w:eastAsia="Times New Roman" w:hAnsi="Times New Roman" w:cs="Times New Roman"/>
@@ -453,7 +410,6 @@
         </w:rPr>
         <w:t xml:space="preserve"> backend route already </w:t>
       </w:r>
-      <w:proofErr w:type="spellStart"/>
       <w:r>
         <w:rPr>
           <w:rFonts w:ascii="Nirmala UI" w:eastAsia="Times New Roman" w:hAnsi="Nirmala UI" w:cs="Nirmala UI"/>
@@ -462,7 +418,6 @@
         </w:rPr>
         <w:t>আছে</w:t>
       </w:r>
-      <w:proofErr w:type="spellEnd"/>
       <w:r>
         <w:rPr>
           <w:rFonts w:ascii="Times New Roman" w:eastAsia="Times New Roman" w:hAnsi="Times New Roman" w:cs="Times New Roman"/>
@@ -528,8 +483,6 @@
           <w14:ligatures w14:val="none"/>
         </w:rPr>
       </w:pPr>
-      <w:proofErr w:type="spellStart"/>
-      <w:proofErr w:type="gramStart"/>
       <w:r>
         <w:rPr>
           <w:rFonts w:ascii="Courier New" w:eastAsia="Times New Roman" w:hAnsi="Courier New" w:cs="Courier New"/>
@@ -538,53 +491,7 @@
           <w:szCs w:val="20"/>
           <w14:ligatures w14:val="none"/>
         </w:rPr>
-        <w:t>g.GET</w:t>
-      </w:r>
-      <w:proofErr w:type="spellEnd"/>
-      <w:r>
-        <w:rPr>
-          <w:rFonts w:ascii="Courier New" w:eastAsia="Times New Roman" w:hAnsi="Courier New" w:cs="Courier New"/>
-          <w:kern w:val="0"/>
-          <w:sz w:val="20"/>
-          <w:szCs w:val="20"/>
-          <w14:ligatures w14:val="none"/>
-        </w:rPr>
-        <w:t>(</w:t>
-      </w:r>
-      <w:proofErr w:type="gramEnd"/>
-      <w:r>
-        <w:rPr>
-          <w:rFonts w:ascii="Courier New" w:eastAsia="Times New Roman" w:hAnsi="Courier New" w:cs="Courier New"/>
-          <w:kern w:val="0"/>
-          <w:sz w:val="20"/>
-          <w:szCs w:val="20"/>
-          <w14:ligatures w14:val="none"/>
-        </w:rPr>
-        <w:t xml:space="preserve">"/warranty/summary", </w:t>
-      </w:r>
-      <w:proofErr w:type="spellStart"/>
-      <w:proofErr w:type="gramStart"/>
-      <w:r>
-        <w:rPr>
-          <w:rFonts w:ascii="Courier New" w:eastAsia="Times New Roman" w:hAnsi="Courier New" w:cs="Courier New"/>
-          <w:kern w:val="0"/>
-          <w:sz w:val="20"/>
-          <w:szCs w:val="20"/>
-          <w14:ligatures w14:val="none"/>
-        </w:rPr>
-        <w:t>h.WarrantyOverviewSummary</w:t>
-      </w:r>
-      <w:proofErr w:type="spellEnd"/>
-      <w:proofErr w:type="gramEnd"/>
-      <w:r>
-        <w:rPr>
-          <w:rFonts w:ascii="Courier New" w:eastAsia="Times New Roman" w:hAnsi="Courier New" w:cs="Courier New"/>
-          <w:kern w:val="0"/>
-          <w:sz w:val="20"/>
-          <w:szCs w:val="20"/>
-          <w14:ligatures w14:val="none"/>
-        </w:rPr>
-        <w:t>)</w:t>
+        <w:t>g.GET("/warranty/summary", h.WarrantyOverviewSummary)</w:t>
       </w:r>
     </w:p>
     <w:p>
@@ -693,7 +600,6 @@
           <w14:ligatures w14:val="none"/>
         </w:rPr>
       </w:pPr>
-      <w:proofErr w:type="spellStart"/>
       <w:r>
         <w:rPr>
           <w:rFonts w:ascii="Nirmala UI" w:eastAsia="Times New Roman" w:hAnsi="Nirmala UI" w:cs="Nirmala UI"/>
@@ -702,7 +608,6 @@
         </w:rPr>
         <w:t>মানে</w:t>
       </w:r>
-      <w:proofErr w:type="spellEnd"/>
       <w:r>
         <w:rPr>
           <w:rFonts w:ascii="Times New Roman" w:eastAsia="Times New Roman" w:hAnsi="Times New Roman" w:cs="Times New Roman"/>
@@ -711,7 +616,6 @@
         </w:rPr>
         <w:t xml:space="preserve"> full route </w:t>
       </w:r>
-      <w:proofErr w:type="spellStart"/>
       <w:r>
         <w:rPr>
           <w:rFonts w:ascii="Nirmala UI" w:eastAsia="Times New Roman" w:hAnsi="Nirmala UI" w:cs="Nirmala UI"/>
@@ -720,7 +624,6 @@
         </w:rPr>
         <w:t>হবে</w:t>
       </w:r>
-      <w:proofErr w:type="spellEnd"/>
       <w:r>
         <w:rPr>
           <w:rFonts w:ascii="Times New Roman" w:eastAsia="Times New Roman" w:hAnsi="Times New Roman" w:cs="Times New Roman"/>
@@ -737,9 +640,32 @@
           <w:szCs w:val="20"/>
           <w14:ligatures w14:val="none"/>
         </w:rPr>
-        <w:t>/</w:t>
-      </w:r>
-      <w:proofErr w:type="spellStart"/>
+        <w:t>/api/v1/assets/warranty/summary</w:t>
+      </w:r>
+      <w:r>
+        <w:rPr>
+          <w:rFonts w:ascii="Times New Roman" w:eastAsia="Times New Roman" w:hAnsi="Times New Roman" w:cs="Times New Roman"/>
+          <w:kern w:val="0"/>
+          <w14:ligatures w14:val="none"/>
+        </w:rPr>
+        <w:t xml:space="preserve">, </w:t>
+      </w:r>
+      <w:r>
+        <w:rPr>
+          <w:rFonts w:ascii="Nirmala UI" w:eastAsia="Times New Roman" w:hAnsi="Nirmala UI" w:cs="Nirmala UI"/>
+          <w:kern w:val="0"/>
+          <w14:ligatures w14:val="none"/>
+        </w:rPr>
+        <w:t>যদি</w:t>
+      </w:r>
+      <w:r>
+        <w:rPr>
+          <w:rFonts w:ascii="Times New Roman" w:eastAsia="Times New Roman" w:hAnsi="Times New Roman" w:cs="Times New Roman"/>
+          <w:kern w:val="0"/>
+          <w14:ligatures w14:val="none"/>
+        </w:rPr>
+        <w:t xml:space="preserve"> router group </w:t>
+      </w:r>
       <w:r>
         <w:rPr>
           <w:rFonts w:ascii="Courier New" w:eastAsia="Times New Roman" w:hAnsi="Courier New" w:cs="Courier New"/>
@@ -748,120 +674,39 @@
           <w:szCs w:val="20"/>
           <w14:ligatures w14:val="none"/>
         </w:rPr>
-        <w:t>api</w:t>
-      </w:r>
-      <w:proofErr w:type="spellEnd"/>
-      <w:r>
-        <w:rPr>
-          <w:rFonts w:ascii="Courier New" w:eastAsia="Times New Roman" w:hAnsi="Courier New" w:cs="Courier New"/>
-          <w:kern w:val="0"/>
-          <w:sz w:val="20"/>
-          <w:szCs w:val="20"/>
-          <w14:ligatures w14:val="none"/>
-        </w:rPr>
-        <w:t>/v1/assets/warranty/summary</w:t>
-      </w:r>
-      <w:r>
-        <w:rPr>
-          <w:rFonts w:ascii="Times New Roman" w:eastAsia="Times New Roman" w:hAnsi="Times New Roman" w:cs="Times New Roman"/>
-          <w:kern w:val="0"/>
-          <w14:ligatures w14:val="none"/>
-        </w:rPr>
-        <w:t xml:space="preserve">, </w:t>
-      </w:r>
-      <w:proofErr w:type="spellStart"/>
+        <w:t>/api/v1</w:t>
+      </w:r>
+      <w:r>
+        <w:rPr>
+          <w:rFonts w:ascii="Times New Roman" w:eastAsia="Times New Roman" w:hAnsi="Times New Roman" w:cs="Times New Roman"/>
+          <w:kern w:val="0"/>
+          <w14:ligatures w14:val="none"/>
+        </w:rPr>
+        <w:t xml:space="preserve"> </w:t>
+      </w:r>
       <w:r>
         <w:rPr>
           <w:rFonts w:ascii="Nirmala UI" w:eastAsia="Times New Roman" w:hAnsi="Nirmala UI" w:cs="Nirmala UI"/>
           <w:kern w:val="0"/>
           <w14:ligatures w14:val="none"/>
         </w:rPr>
-        <w:t>যদি</w:t>
-      </w:r>
-      <w:proofErr w:type="spellEnd"/>
-      <w:r>
-        <w:rPr>
-          <w:rFonts w:ascii="Times New Roman" w:eastAsia="Times New Roman" w:hAnsi="Times New Roman" w:cs="Times New Roman"/>
-          <w:kern w:val="0"/>
-          <w14:ligatures w14:val="none"/>
-        </w:rPr>
-        <w:t xml:space="preserve"> router group </w:t>
-      </w:r>
-      <w:r>
-        <w:rPr>
-          <w:rFonts w:ascii="Courier New" w:eastAsia="Times New Roman" w:hAnsi="Courier New" w:cs="Courier New"/>
-          <w:kern w:val="0"/>
-          <w:sz w:val="20"/>
-          <w:szCs w:val="20"/>
-          <w14:ligatures w14:val="none"/>
-        </w:rPr>
-        <w:t>/</w:t>
-      </w:r>
-      <w:proofErr w:type="spellStart"/>
-      <w:r>
-        <w:rPr>
-          <w:rFonts w:ascii="Courier New" w:eastAsia="Times New Roman" w:hAnsi="Courier New" w:cs="Courier New"/>
-          <w:kern w:val="0"/>
-          <w:sz w:val="20"/>
-          <w:szCs w:val="20"/>
-          <w14:ligatures w14:val="none"/>
-        </w:rPr>
-        <w:t>api</w:t>
-      </w:r>
-      <w:proofErr w:type="spellEnd"/>
-      <w:r>
-        <w:rPr>
-          <w:rFonts w:ascii="Courier New" w:eastAsia="Times New Roman" w:hAnsi="Courier New" w:cs="Courier New"/>
-          <w:kern w:val="0"/>
-          <w:sz w:val="20"/>
-          <w:szCs w:val="20"/>
-          <w14:ligatures w14:val="none"/>
-        </w:rPr>
-        <w:t>/v1</w:t>
-      </w:r>
-      <w:r>
-        <w:rPr>
-          <w:rFonts w:ascii="Times New Roman" w:eastAsia="Times New Roman" w:hAnsi="Times New Roman" w:cs="Times New Roman"/>
-          <w:kern w:val="0"/>
-          <w14:ligatures w14:val="none"/>
-        </w:rPr>
-        <w:t xml:space="preserve"> </w:t>
-      </w:r>
-      <w:proofErr w:type="spellStart"/>
+        <w:t>দিয়ে</w:t>
+      </w:r>
+      <w:r>
+        <w:rPr>
+          <w:rFonts w:ascii="Times New Roman" w:eastAsia="Times New Roman" w:hAnsi="Times New Roman" w:cs="Times New Roman"/>
+          <w:kern w:val="0"/>
+          <w14:ligatures w14:val="none"/>
+        </w:rPr>
+        <w:t xml:space="preserve"> registered </w:t>
+      </w:r>
       <w:r>
         <w:rPr>
           <w:rFonts w:ascii="Nirmala UI" w:eastAsia="Times New Roman" w:hAnsi="Nirmala UI" w:cs="Nirmala UI"/>
           <w:kern w:val="0"/>
           <w14:ligatures w14:val="none"/>
         </w:rPr>
-        <w:t>দিয়ে</w:t>
-      </w:r>
-      <w:proofErr w:type="spellEnd"/>
-      <w:r>
-        <w:rPr>
-          <w:rFonts w:ascii="Times New Roman" w:eastAsia="Times New Roman" w:hAnsi="Times New Roman" w:cs="Times New Roman"/>
-          <w:kern w:val="0"/>
-          <w14:ligatures w14:val="none"/>
-        </w:rPr>
-        <w:t xml:space="preserve"> registered </w:t>
-      </w:r>
-      <w:proofErr w:type="spellStart"/>
-      <w:r>
-        <w:rPr>
-          <w:rFonts w:ascii="Nirmala UI" w:eastAsia="Times New Roman" w:hAnsi="Nirmala UI" w:cs="Nirmala UI"/>
-          <w:kern w:val="0"/>
-          <w14:ligatures w14:val="none"/>
-        </w:rPr>
-        <w:t>থাকে</w:t>
-      </w:r>
-      <w:proofErr w:type="spellEnd"/>
-      <w:r>
-        <w:rPr>
-          <w:rFonts w:ascii="Nirmala UI" w:eastAsia="Times New Roman" w:hAnsi="Nirmala UI" w:cs="Nirmala UI"/>
-          <w:kern w:val="0"/>
-          <w14:ligatures w14:val="none"/>
-        </w:rPr>
-        <w:t>।</w:t>
+        <w:t>থাকে।</w:t>
       </w:r>
     </w:p>
     <w:p>
@@ -928,41 +773,13 @@
           <w14:ligatures w14:val="none"/>
         </w:rPr>
       </w:pPr>
-      <w:proofErr w:type="gramStart"/>
-      <w:r>
-        <w:rPr>
-          <w:rFonts w:ascii="Times New Roman" w:eastAsia="Times New Roman" w:hAnsi="Times New Roman" w:cs="Times New Roman"/>
-          <w:kern w:val="0"/>
-          <w14:ligatures w14:val="none"/>
-        </w:rPr>
-        <w:t>Method :</w:t>
-      </w:r>
-      <w:proofErr w:type="gramEnd"/>
-      <w:r>
-        <w:rPr>
-          <w:rFonts w:ascii="Times New Roman" w:eastAsia="Times New Roman" w:hAnsi="Times New Roman" w:cs="Times New Roman"/>
-          <w:kern w:val="0"/>
-          <w14:ligatures w14:val="none"/>
-        </w:rPr>
-        <w:t xml:space="preserve"> Get  </w:t>
-      </w:r>
-      <w:proofErr w:type="gramStart"/>
-      <w:r>
-        <w:rPr>
-          <w:rFonts w:ascii="Times New Roman" w:eastAsia="Times New Roman" w:hAnsi="Times New Roman" w:cs="Times New Roman"/>
-          <w:kern w:val="0"/>
-          <w14:ligatures w14:val="none"/>
-        </w:rPr>
-        <w:t xml:space="preserve">  :</w:t>
-      </w:r>
-      <w:proofErr w:type="gramEnd"/>
-      <w:r>
-        <w:rPr>
-          <w:rFonts w:ascii="Times New Roman" w:eastAsia="Times New Roman" w:hAnsi="Times New Roman" w:cs="Times New Roman"/>
-          <w:kern w:val="0"/>
-          <w14:ligatures w14:val="none"/>
-        </w:rPr>
-        <w:t xml:space="preserve"> </w:t>
+      <w:r>
+        <w:rPr>
+          <w:rFonts w:ascii="Times New Roman" w:eastAsia="Times New Roman" w:hAnsi="Times New Roman" w:cs="Times New Roman"/>
+          <w:kern w:val="0"/>
+          <w14:ligatures w14:val="none"/>
+        </w:rPr>
+        <w:t xml:space="preserve">Method : Get    : </w:t>
       </w:r>
       <w:hyperlink r:id="rId6" w:history="1">
         <w:r>
@@ -1022,18 +839,8 @@
           <w:kern w:val="0"/>
           <w14:ligatures w14:val="none"/>
         </w:rPr>
-        <w:t xml:space="preserve">JSON </w:t>
-      </w:r>
-      <w:proofErr w:type="gramStart"/>
-      <w:r>
-        <w:rPr>
-          <w:rFonts w:ascii="Times New Roman" w:eastAsia="Times New Roman" w:hAnsi="Times New Roman" w:cs="Times New Roman"/>
-          <w:kern w:val="0"/>
-          <w14:ligatures w14:val="none"/>
-        </w:rPr>
-        <w:t>Data :</w:t>
-      </w:r>
-      <w:proofErr w:type="gramEnd"/>
+        <w:t>JSON Data :</w:t>
+      </w:r>
     </w:p>
     <w:p>
       <w:pPr>
@@ -1457,35 +1264,7 @@
           <w:kern w:val="0"/>
           <w14:ligatures w14:val="none"/>
         </w:rPr>
-        <w:t>            "</w:t>
-      </w:r>
-      <w:proofErr w:type="spellStart"/>
-      <w:proofErr w:type="gramStart"/>
-      <w:r>
-        <w:rPr>
-          <w:rFonts w:ascii="Times New Roman" w:eastAsia="Times New Roman" w:hAnsi="Times New Roman" w:cs="Times New Roman"/>
-          <w:kern w:val="0"/>
-          <w14:ligatures w14:val="none"/>
-        </w:rPr>
-        <w:t>to</w:t>
-      </w:r>
-      <w:proofErr w:type="gramEnd"/>
-      <w:r>
-        <w:rPr>
-          <w:rFonts w:ascii="Times New Roman" w:eastAsia="Times New Roman" w:hAnsi="Times New Roman" w:cs="Times New Roman"/>
-          <w:kern w:val="0"/>
-          <w14:ligatures w14:val="none"/>
-        </w:rPr>
-        <w:t>_vendor</w:t>
-      </w:r>
-      <w:proofErr w:type="spellEnd"/>
-      <w:r>
-        <w:rPr>
-          <w:rFonts w:ascii="Times New Roman" w:eastAsia="Times New Roman" w:hAnsi="Times New Roman" w:cs="Times New Roman"/>
-          <w:kern w:val="0"/>
-          <w14:ligatures w14:val="none"/>
-        </w:rPr>
-        <w:t>": 4,</w:t>
+        <w:t>            "to_vendor": 4,</w:t>
       </w:r>
     </w:p>
     <w:p>
@@ -1700,7 +1479,6 @@
           <w:bCs/>
         </w:rPr>
       </w:pPr>
-      <w:proofErr w:type="spellStart"/>
       <w:r>
         <w:rPr>
           <w:rFonts w:ascii="Nirmala UI" w:hAnsi="Nirmala UI" w:cs="Nirmala UI"/>
@@ -1709,21 +1487,12 @@
         </w:rPr>
         <w:t>আপনার</w:t>
       </w:r>
-      <w:proofErr w:type="spellEnd"/>
       <w:r>
         <w:rPr>
           <w:b/>
           <w:bCs/>
         </w:rPr>
-        <w:t xml:space="preserve"> frontend/lib/</w:t>
-      </w:r>
-      <w:proofErr w:type="spellStart"/>
-      <w:r>
-        <w:rPr>
-          <w:b/>
-          <w:bCs/>
-        </w:rPr>
-        <w:t>api.ts-</w:t>
+        <w:t xml:space="preserve"> frontend/lib/api.ts-</w:t>
       </w:r>
       <w:r>
         <w:rPr>
@@ -1733,7 +1502,6 @@
         </w:rPr>
         <w:t>এও</w:t>
       </w:r>
-      <w:proofErr w:type="spellEnd"/>
       <w:r>
         <w:rPr>
           <w:b/>
@@ -1756,7 +1524,6 @@
         </w:rPr>
         <w:t xml:space="preserve"> point </w:t>
       </w:r>
-      <w:proofErr w:type="spellStart"/>
       <w:r>
         <w:rPr>
           <w:rFonts w:ascii="Nirmala UI" w:hAnsi="Nirmala UI" w:cs="Nirmala UI"/>
@@ -1765,7 +1532,6 @@
         </w:rPr>
         <w:t>করছে</w:t>
       </w:r>
-      <w:proofErr w:type="spellEnd"/>
       <w:r>
         <w:rPr>
           <w:b/>
@@ -1776,36 +1542,7 @@
     </w:p>
     <w:p>
       <w:r>
-        <w:t xml:space="preserve">const BASE = </w:t>
-      </w:r>
-      <w:proofErr w:type="spellStart"/>
-      <w:proofErr w:type="gramStart"/>
-      <w:r>
-        <w:t>process.env.NEXT</w:t>
-      </w:r>
-      <w:proofErr w:type="gramEnd"/>
-      <w:r>
-        <w:t>_PUBLIC_API_</w:t>
-      </w:r>
-      <w:proofErr w:type="gramStart"/>
-      <w:r>
-        <w:t>URL</w:t>
-      </w:r>
-      <w:proofErr w:type="spellEnd"/>
-      <w:r>
-        <w:t xml:space="preserve"> ??</w:t>
-      </w:r>
-      <w:proofErr w:type="gramEnd"/>
-      <w:r>
-        <w:t xml:space="preserve"> "http://localhost:8080/</w:t>
-      </w:r>
-      <w:proofErr w:type="spellStart"/>
-      <w:r>
-        <w:t>api</w:t>
-      </w:r>
-      <w:proofErr w:type="spellEnd"/>
-      <w:r>
-        <w:t>/v1";</w:t>
+        <w:t>const BASE = process.env.NEXT_PUBLIC_API_URL ?? "http://localhost:8080/api/v1";</w:t>
       </w:r>
     </w:p>
     <w:p/>
@@ -1853,15 +1590,7 @@
     <w:p/>
     <w:p>
       <w:r>
-        <w:t xml:space="preserve">WITH </w:t>
-      </w:r>
-      <w:proofErr w:type="spellStart"/>
-      <w:r>
-        <w:t>warranty_claim_summary</w:t>
-      </w:r>
-      <w:proofErr w:type="spellEnd"/>
-      <w:r>
-        <w:t xml:space="preserve"> AS (</w:t>
+        <w:t>WITH warranty_claim_summary AS (</w:t>
       </w:r>
     </w:p>
     <w:p>
@@ -1871,33 +1600,12 @@
     </w:p>
     <w:p>
       <w:r>
-        <w:t xml:space="preserve">        </w:t>
-      </w:r>
-      <w:proofErr w:type="gramStart"/>
-      <w:r>
-        <w:t>COUNT(</w:t>
-      </w:r>
-      <w:proofErr w:type="gramEnd"/>
-      <w:r>
-        <w:t>*) FILTER (</w:t>
-      </w:r>
-    </w:p>
-    <w:p>
-      <w:r>
-        <w:t xml:space="preserve">            WHERE </w:t>
-      </w:r>
-      <w:proofErr w:type="spellStart"/>
-      <w:proofErr w:type="gramStart"/>
-      <w:r>
-        <w:t>dc.claim</w:t>
-      </w:r>
-      <w:proofErr w:type="gramEnd"/>
-      <w:r>
-        <w:t>_status</w:t>
-      </w:r>
-      <w:proofErr w:type="spellEnd"/>
-      <w:r>
-        <w:t xml:space="preserve"> = 8</w:t>
+        <w:t xml:space="preserve">        COUNT(*) FILTER (</w:t>
+      </w:r>
+    </w:p>
+    <w:p>
+      <w:r>
+        <w:t xml:space="preserve">            WHERE dc.claim_status = 8</w:t>
       </w:r>
     </w:p>
     <w:p>
@@ -1908,78 +1616,28 @@
     <w:p/>
     <w:p>
       <w:r>
-        <w:t xml:space="preserve">        </w:t>
-      </w:r>
-      <w:proofErr w:type="gramStart"/>
-      <w:r>
-        <w:t>COUNT(</w:t>
-      </w:r>
-      <w:proofErr w:type="gramEnd"/>
-      <w:r>
-        <w:t>*) FILTER (</w:t>
-      </w:r>
-    </w:p>
-    <w:p>
-      <w:r>
-        <w:t xml:space="preserve">            WHERE </w:t>
-      </w:r>
-      <w:proofErr w:type="spellStart"/>
-      <w:proofErr w:type="gramStart"/>
-      <w:r>
-        <w:t>dc.claim</w:t>
-      </w:r>
-      <w:proofErr w:type="gramEnd"/>
-      <w:r>
-        <w:t>_status</w:t>
-      </w:r>
-      <w:proofErr w:type="spellEnd"/>
-      <w:r>
-        <w:t xml:space="preserve"> = 9</w:t>
-      </w:r>
-    </w:p>
-    <w:p>
-      <w:r>
-        <w:t xml:space="preserve">        ) AS </w:t>
-      </w:r>
-      <w:proofErr w:type="spellStart"/>
-      <w:r>
-        <w:t>to_vendor</w:t>
-      </w:r>
-      <w:proofErr w:type="spellEnd"/>
-      <w:r>
-        <w:t>,</w:t>
+        <w:t xml:space="preserve">        COUNT(*) FILTER (</w:t>
+      </w:r>
+    </w:p>
+    <w:p>
+      <w:r>
+        <w:t xml:space="preserve">            WHERE dc.claim_status = 9</w:t>
+      </w:r>
+    </w:p>
+    <w:p>
+      <w:r>
+        <w:t xml:space="preserve">        ) AS to_vendor,</w:t>
       </w:r>
     </w:p>
     <w:p/>
     <w:p>
       <w:r>
-        <w:t xml:space="preserve">        </w:t>
-      </w:r>
-      <w:proofErr w:type="gramStart"/>
-      <w:r>
-        <w:t>COUNT(</w:t>
-      </w:r>
-      <w:proofErr w:type="gramEnd"/>
-      <w:r>
-        <w:t>*) FILTER (</w:t>
-      </w:r>
-    </w:p>
-    <w:p>
-      <w:r>
-        <w:t xml:space="preserve">            WHERE </w:t>
-      </w:r>
-      <w:proofErr w:type="spellStart"/>
-      <w:proofErr w:type="gramStart"/>
-      <w:r>
-        <w:t>dc.claim</w:t>
-      </w:r>
-      <w:proofErr w:type="gramEnd"/>
-      <w:r>
-        <w:t>_status</w:t>
-      </w:r>
-      <w:proofErr w:type="spellEnd"/>
-      <w:r>
-        <w:t xml:space="preserve"> = 10</w:t>
+        <w:t xml:space="preserve">        COUNT(*) FILTER (</w:t>
+      </w:r>
+    </w:p>
+    <w:p>
+      <w:r>
+        <w:t xml:space="preserve">            WHERE dc.claim_status = 10</w:t>
       </w:r>
     </w:p>
     <w:p>
@@ -1990,20 +1648,7 @@
     <w:p>
       <w:r>
         <w:lastRenderedPageBreak/>
-        <w:t xml:space="preserve">    FROM </w:t>
-      </w:r>
-      <w:proofErr w:type="spellStart"/>
-      <w:proofErr w:type="gramStart"/>
-      <w:r>
-        <w:t>public.device</w:t>
-      </w:r>
-      <w:proofErr w:type="gramEnd"/>
-      <w:r>
-        <w:t>_claims</w:t>
-      </w:r>
-      <w:proofErr w:type="spellEnd"/>
-      <w:r>
-        <w:t xml:space="preserve"> dc</w:t>
+        <w:t xml:space="preserve">    FROM public.device_claims dc</w:t>
       </w:r>
     </w:p>
     <w:p>
@@ -2013,13 +1658,8 @@
     </w:p>
     <w:p/>
     <w:p>
-      <w:proofErr w:type="spellStart"/>
-      <w:r>
-        <w:t>expired_summary</w:t>
-      </w:r>
-      <w:proofErr w:type="spellEnd"/>
-      <w:r>
-        <w:t xml:space="preserve"> AS (</w:t>
+      <w:r>
+        <w:t>expired_summary AS (</w:t>
       </w:r>
     </w:p>
     <w:p>
@@ -2029,90 +1669,27 @@
     </w:p>
     <w:p>
       <w:r>
-        <w:t xml:space="preserve">        </w:t>
-      </w:r>
-      <w:proofErr w:type="gramStart"/>
-      <w:r>
-        <w:t>COUNT(</w:t>
-      </w:r>
-      <w:proofErr w:type="gramEnd"/>
-      <w:r>
-        <w:t>*) AS expired</w:t>
-      </w:r>
-    </w:p>
-    <w:p>
-      <w:r>
-        <w:t xml:space="preserve">    FROM </w:t>
-      </w:r>
-      <w:proofErr w:type="spellStart"/>
-      <w:proofErr w:type="gramStart"/>
-      <w:r>
-        <w:t>public.asset</w:t>
-      </w:r>
-      <w:proofErr w:type="gramEnd"/>
-      <w:r>
-        <w:t>_devices</w:t>
-      </w:r>
-      <w:proofErr w:type="spellEnd"/>
-      <w:r>
-        <w:t xml:space="preserve"> ad</w:t>
-      </w:r>
-    </w:p>
-    <w:p>
-      <w:r>
-        <w:t xml:space="preserve">    WHERE </w:t>
-      </w:r>
-      <w:proofErr w:type="spellStart"/>
-      <w:r>
-        <w:t>ad.row_status</w:t>
-      </w:r>
-      <w:proofErr w:type="spellEnd"/>
-      <w:r>
-        <w:t xml:space="preserve"> = 1</w:t>
-      </w:r>
-    </w:p>
-    <w:p>
-      <w:r>
-        <w:t xml:space="preserve">      AND </w:t>
-      </w:r>
-      <w:proofErr w:type="spellStart"/>
-      <w:proofErr w:type="gramStart"/>
-      <w:r>
-        <w:t>ad.warranty</w:t>
-      </w:r>
-      <w:proofErr w:type="gramEnd"/>
-      <w:r>
-        <w:t>_date</w:t>
-      </w:r>
-      <w:proofErr w:type="spellEnd"/>
-      <w:r>
-        <w:t xml:space="preserve"> IS NOT NULL</w:t>
-      </w:r>
-    </w:p>
-    <w:p>
-      <w:r>
-        <w:t xml:space="preserve">      AND </w:t>
-      </w:r>
-      <w:proofErr w:type="spellStart"/>
-      <w:proofErr w:type="gramStart"/>
-      <w:r>
-        <w:t>ad.warranty</w:t>
-      </w:r>
-      <w:proofErr w:type="gramEnd"/>
-      <w:r>
-        <w:t>_</w:t>
-      </w:r>
-      <w:proofErr w:type="gramStart"/>
-      <w:r>
-        <w:t>date</w:t>
-      </w:r>
-      <w:proofErr w:type="spellEnd"/>
-      <w:r>
-        <w:t>::</w:t>
-      </w:r>
-      <w:proofErr w:type="gramEnd"/>
-      <w:r>
-        <w:t>date &lt; CURRENT_DATE</w:t>
+        <w:t xml:space="preserve">        COUNT(*) AS expired</w:t>
+      </w:r>
+    </w:p>
+    <w:p>
+      <w:r>
+        <w:t xml:space="preserve">    FROM public.asset_devices ad</w:t>
+      </w:r>
+    </w:p>
+    <w:p>
+      <w:r>
+        <w:t xml:space="preserve">    WHERE ad.row_status = 1</w:t>
+      </w:r>
+    </w:p>
+    <w:p>
+      <w:r>
+        <w:t xml:space="preserve">      AND ad.warranty_date IS NOT NULL</w:t>
+      </w:r>
+    </w:p>
+    <w:p>
+      <w:r>
+        <w:t xml:space="preserve">      AND ad.warranty_date::date &lt; CURRENT_DATE</w:t>
       </w:r>
     </w:p>
     <w:p>
@@ -2128,82 +1705,22 @@
     </w:p>
     <w:p>
       <w:r>
-        <w:t xml:space="preserve">    </w:t>
-      </w:r>
-      <w:proofErr w:type="gramStart"/>
-      <w:r>
-        <w:t>COALESCE(</w:t>
-      </w:r>
-      <w:proofErr w:type="spellStart"/>
-      <w:r>
-        <w:t>wcs.claimed</w:t>
-      </w:r>
-      <w:proofErr w:type="spellEnd"/>
-      <w:proofErr w:type="gramEnd"/>
-      <w:r>
-        <w:t>, 0) AS claimed,</w:t>
-      </w:r>
-    </w:p>
-    <w:p>
-      <w:r>
-        <w:t xml:space="preserve">    </w:t>
-      </w:r>
-      <w:proofErr w:type="gramStart"/>
-      <w:r>
-        <w:t>COALESCE(</w:t>
-      </w:r>
-      <w:proofErr w:type="spellStart"/>
-      <w:proofErr w:type="gramEnd"/>
-      <w:r>
-        <w:t>wcs.to_vendor</w:t>
-      </w:r>
-      <w:proofErr w:type="spellEnd"/>
-      <w:r>
-        <w:t xml:space="preserve">, 0) AS </w:t>
-      </w:r>
-      <w:proofErr w:type="spellStart"/>
-      <w:r>
-        <w:t>to_vendor</w:t>
-      </w:r>
-      <w:proofErr w:type="spellEnd"/>
-      <w:r>
-        <w:t>,</w:t>
-      </w:r>
-    </w:p>
-    <w:p>
-      <w:r>
-        <w:t xml:space="preserve">    </w:t>
-      </w:r>
-      <w:proofErr w:type="gramStart"/>
-      <w:r>
-        <w:t>COALESCE(</w:t>
-      </w:r>
-      <w:proofErr w:type="spellStart"/>
-      <w:r>
-        <w:t>wcs.recovered</w:t>
-      </w:r>
-      <w:proofErr w:type="spellEnd"/>
-      <w:proofErr w:type="gramEnd"/>
-      <w:r>
-        <w:t>, 0) AS recovered,</w:t>
-      </w:r>
-    </w:p>
-    <w:p>
-      <w:r>
-        <w:t xml:space="preserve">    </w:t>
-      </w:r>
-      <w:proofErr w:type="gramStart"/>
-      <w:r>
-        <w:t>COALESCE(</w:t>
-      </w:r>
-      <w:proofErr w:type="spellStart"/>
-      <w:r>
-        <w:t>es.expired</w:t>
-      </w:r>
-      <w:proofErr w:type="spellEnd"/>
-      <w:proofErr w:type="gramEnd"/>
-      <w:r>
-        <w:t>, 0) AS expired,</w:t>
+        <w:t xml:space="preserve">    COALESCE(wcs.claimed, 0) AS claimed,</w:t>
+      </w:r>
+    </w:p>
+    <w:p>
+      <w:r>
+        <w:t xml:space="preserve">    COALESCE(wcs.to_vendor, 0) AS to_vendor,</w:t>
+      </w:r>
+    </w:p>
+    <w:p>
+      <w:r>
+        <w:t xml:space="preserve">    COALESCE(wcs.recovered, 0) AS recovered,</w:t>
+      </w:r>
+    </w:p>
+    <w:p>
+      <w:r>
+        <w:t xml:space="preserve">    COALESCE(es.expired, 0) AS expired,</w:t>
       </w:r>
     </w:p>
     <w:p>
@@ -2213,74 +1730,22 @@
     </w:p>
     <w:p>
       <w:r>
-        <w:t xml:space="preserve">        </w:t>
-      </w:r>
-      <w:proofErr w:type="gramStart"/>
-      <w:r>
-        <w:t>COALESCE(</w:t>
-      </w:r>
-      <w:proofErr w:type="spellStart"/>
-      <w:r>
-        <w:t>wcs.claimed</w:t>
-      </w:r>
-      <w:proofErr w:type="spellEnd"/>
-      <w:proofErr w:type="gramEnd"/>
-      <w:r>
-        <w:t>, 0)</w:t>
-      </w:r>
-    </w:p>
-    <w:p>
-      <w:r>
-        <w:t xml:space="preserve">        + </w:t>
-      </w:r>
-      <w:proofErr w:type="gramStart"/>
-      <w:r>
-        <w:t>COALESCE(</w:t>
-      </w:r>
-      <w:proofErr w:type="spellStart"/>
-      <w:proofErr w:type="gramEnd"/>
-      <w:r>
-        <w:t>wcs.to_vendor</w:t>
-      </w:r>
-      <w:proofErr w:type="spellEnd"/>
-      <w:r>
-        <w:t>, 0)</w:t>
-      </w:r>
-    </w:p>
-    <w:p>
-      <w:r>
-        <w:t xml:space="preserve">        + </w:t>
-      </w:r>
-      <w:proofErr w:type="gramStart"/>
-      <w:r>
-        <w:t>COALESCE(</w:t>
-      </w:r>
-      <w:proofErr w:type="spellStart"/>
-      <w:r>
-        <w:t>wcs.recovered</w:t>
-      </w:r>
-      <w:proofErr w:type="spellEnd"/>
-      <w:proofErr w:type="gramEnd"/>
-      <w:r>
-        <w:t>, 0)</w:t>
-      </w:r>
-    </w:p>
-    <w:p>
-      <w:r>
-        <w:t xml:space="preserve">        + </w:t>
-      </w:r>
-      <w:proofErr w:type="gramStart"/>
-      <w:r>
-        <w:t>COALESCE(</w:t>
-      </w:r>
-      <w:proofErr w:type="spellStart"/>
-      <w:r>
-        <w:t>es.expired</w:t>
-      </w:r>
-      <w:proofErr w:type="spellEnd"/>
-      <w:proofErr w:type="gramEnd"/>
-      <w:r>
-        <w:t>, 0)</w:t>
+        <w:t xml:space="preserve">        COALESCE(wcs.claimed, 0)</w:t>
+      </w:r>
+    </w:p>
+    <w:p>
+      <w:r>
+        <w:t xml:space="preserve">        + COALESCE(wcs.to_vendor, 0)</w:t>
+      </w:r>
+    </w:p>
+    <w:p>
+      <w:r>
+        <w:t xml:space="preserve">        + COALESCE(wcs.recovered, 0)</w:t>
+      </w:r>
+    </w:p>
+    <w:p>
+      <w:r>
+        <w:t xml:space="preserve">        + COALESCE(es.expired, 0)</w:t>
       </w:r>
     </w:p>
     <w:p>
@@ -2290,48 +1755,19 @@
     </w:p>
     <w:p>
       <w:r>
-        <w:t xml:space="preserve">FROM </w:t>
-      </w:r>
-      <w:proofErr w:type="spellStart"/>
-      <w:r>
-        <w:t>warranty_claim_summary</w:t>
-      </w:r>
-      <w:proofErr w:type="spellEnd"/>
-      <w:r>
-        <w:t xml:space="preserve"> </w:t>
-      </w:r>
-      <w:proofErr w:type="spellStart"/>
-      <w:r>
-        <w:t>wcs</w:t>
-      </w:r>
-      <w:proofErr w:type="spellEnd"/>
-    </w:p>
-    <w:p>
-      <w:r>
-        <w:t xml:space="preserve">CROSS JOIN </w:t>
-      </w:r>
-      <w:proofErr w:type="spellStart"/>
-      <w:r>
-        <w:t>expired_summary</w:t>
-      </w:r>
-      <w:proofErr w:type="spellEnd"/>
-      <w:r>
-        <w:t xml:space="preserve"> es;</w:t>
+        <w:t>FROM warranty_claim_summary wcs</w:t>
+      </w:r>
+    </w:p>
+    <w:p>
+      <w:r>
+        <w:t>CROSS JOIN expired_summary es;</w:t>
       </w:r>
     </w:p>
     <w:p/>
     <w:p>
       <w:r>
         <w:lastRenderedPageBreak/>
-        <w:t xml:space="preserve">WITH </w:t>
-      </w:r>
-      <w:proofErr w:type="spellStart"/>
-      <w:r>
-        <w:t>claimed_assets</w:t>
-      </w:r>
-      <w:proofErr w:type="spellEnd"/>
-      <w:r>
-        <w:t xml:space="preserve"> AS (</w:t>
+        <w:t>WITH claimed_assets AS (</w:t>
       </w:r>
     </w:p>
     <w:p>
@@ -2346,66 +1782,22 @@
     </w:p>
     <w:p>
       <w:r>
-        <w:t xml:space="preserve">        </w:t>
-      </w:r>
-      <w:proofErr w:type="spellStart"/>
-      <w:proofErr w:type="gramStart"/>
-      <w:r>
-        <w:t>ad.device</w:t>
-      </w:r>
-      <w:proofErr w:type="gramEnd"/>
-      <w:r>
-        <w:t>_serial</w:t>
-      </w:r>
-      <w:proofErr w:type="spellEnd"/>
-    </w:p>
-    <w:p>
-      <w:r>
-        <w:t xml:space="preserve">    FROM </w:t>
-      </w:r>
-      <w:proofErr w:type="spellStart"/>
-      <w:proofErr w:type="gramStart"/>
-      <w:r>
-        <w:t>public.asset</w:t>
-      </w:r>
-      <w:proofErr w:type="gramEnd"/>
-      <w:r>
-        <w:t>_devices</w:t>
-      </w:r>
-      <w:proofErr w:type="spellEnd"/>
-      <w:r>
-        <w:t xml:space="preserve"> ad</w:t>
-      </w:r>
-    </w:p>
-    <w:p>
-      <w:r>
-        <w:t xml:space="preserve">    WHERE </w:t>
-      </w:r>
-      <w:proofErr w:type="spellStart"/>
-      <w:proofErr w:type="gramStart"/>
-      <w:r>
-        <w:t>ad.asset</w:t>
-      </w:r>
-      <w:proofErr w:type="gramEnd"/>
-      <w:r>
-        <w:t>_status</w:t>
-      </w:r>
-      <w:proofErr w:type="spellEnd"/>
-      <w:r>
-        <w:t xml:space="preserve"> = 8</w:t>
-      </w:r>
-    </w:p>
-    <w:p>
-      <w:r>
-        <w:t xml:space="preserve">      AND </w:t>
-      </w:r>
-      <w:proofErr w:type="spellStart"/>
-      <w:r>
-        <w:t>ad.row_status</w:t>
-      </w:r>
-      <w:proofErr w:type="spellEnd"/>
-      <w:r>
-        <w:t xml:space="preserve"> = 1</w:t>
+        <w:t xml:space="preserve">        ad.device_serial</w:t>
+      </w:r>
+    </w:p>
+    <w:p>
+      <w:r>
+        <w:t xml:space="preserve">    FROM public.asset_devices ad</w:t>
+      </w:r>
+    </w:p>
+    <w:p>
+      <w:r>
+        <w:t xml:space="preserve">    WHERE ad.asset_status = 8</w:t>
+      </w:r>
+    </w:p>
+    <w:p>
+      <w:r>
+        <w:t xml:space="preserve">      AND ad.row_status = 1</w:t>
       </w:r>
     </w:p>
     <w:p>
@@ -2415,398 +1807,154 @@
     </w:p>
     <w:p/>
     <w:p>
-      <w:proofErr w:type="spellStart"/>
-      <w:r>
-        <w:t>latest_claim_per_device</w:t>
-      </w:r>
-      <w:proofErr w:type="spellEnd"/>
-      <w:r>
-        <w:t xml:space="preserve"> AS (</w:t>
-      </w:r>
-    </w:p>
-    <w:p>
-      <w:r>
-        <w:t xml:space="preserve">    SELECT DISTINCT ON (</w:t>
-      </w:r>
-      <w:proofErr w:type="spellStart"/>
-      <w:proofErr w:type="gramStart"/>
-      <w:r>
-        <w:t>dc.device</w:t>
-      </w:r>
-      <w:proofErr w:type="gramEnd"/>
-      <w:r>
-        <w:t>_sl_no</w:t>
-      </w:r>
-      <w:proofErr w:type="spellEnd"/>
+      <w:r>
+        <w:t>latest_claim_per_device AS (</w:t>
+      </w:r>
+    </w:p>
+    <w:p>
+      <w:r>
+        <w:t xml:space="preserve">    SELECT DISTINCT ON (dc.device_sl_no)</w:t>
+      </w:r>
+    </w:p>
+    <w:p>
+      <w:r>
+        <w:t xml:space="preserve">        dc.id,</w:t>
+      </w:r>
+    </w:p>
+    <w:p>
+      <w:r>
+        <w:t xml:space="preserve">        dc.device_sl_no,</w:t>
+      </w:r>
+    </w:p>
+    <w:p>
+      <w:r>
+        <w:t xml:space="preserve">        dc.reference_no_claim,</w:t>
+      </w:r>
+    </w:p>
+    <w:p>
+      <w:r>
+        <w:t xml:space="preserve">        dc.claim_status,</w:t>
+      </w:r>
+    </w:p>
+    <w:p>
+      <w:r>
+        <w:t xml:space="preserve">        dc.previous_status,</w:t>
+      </w:r>
+    </w:p>
+    <w:p>
+      <w:r>
+        <w:t xml:space="preserve">        dc.remarks,</w:t>
+      </w:r>
+    </w:p>
+    <w:p>
+      <w:r>
+        <w:t xml:space="preserve">        dc.problems</w:t>
+      </w:r>
+    </w:p>
+    <w:p>
+      <w:r>
+        <w:t xml:space="preserve">    FROM public.device_claims dc</w:t>
+      </w:r>
+    </w:p>
+    <w:p>
+      <w:r>
+        <w:t xml:space="preserve">    WHERE dc.device_sl_no IS NOT NULL</w:t>
+      </w:r>
+    </w:p>
+    <w:p>
+      <w:r>
+        <w:t xml:space="preserve">    ORDER BY dc.device_sl_no, dc.id DESC</w:t>
+      </w:r>
+    </w:p>
+    <w:p>
+      <w:r>
+        <w:t>),</w:t>
+      </w:r>
+    </w:p>
+    <w:p/>
+    <w:p>
+      <w:r>
+        <w:t>expired_summary AS (</w:t>
+      </w:r>
+    </w:p>
+    <w:p>
+      <w:r>
+        <w:t xml:space="preserve">    SELECT COUNT(*) AS expired</w:t>
+      </w:r>
+    </w:p>
+    <w:p>
+      <w:r>
+        <w:t xml:space="preserve">    FROM public.asset_devices ad</w:t>
+      </w:r>
+    </w:p>
+    <w:p>
+      <w:r>
+        <w:lastRenderedPageBreak/>
+        <w:t xml:space="preserve">    WHERE ad.row_status = 1</w:t>
+      </w:r>
+    </w:p>
+    <w:p>
+      <w:r>
+        <w:t xml:space="preserve">      AND ad.warranty_date IS NOT NULL</w:t>
+      </w:r>
+    </w:p>
+    <w:p>
+      <w:r>
+        <w:t xml:space="preserve">      AND ad.warranty_date::date &lt; CURRENT_DATE</w:t>
+      </w:r>
+    </w:p>
+    <w:p>
       <w:r>
         <w:t>)</w:t>
       </w:r>
     </w:p>
-    <w:p>
-      <w:r>
-        <w:t xml:space="preserve">        dc.id,</w:t>
-      </w:r>
-    </w:p>
-    <w:p>
-      <w:r>
-        <w:t xml:space="preserve">        </w:t>
-      </w:r>
-      <w:proofErr w:type="spellStart"/>
-      <w:r>
-        <w:t>dc.device_sl_no</w:t>
-      </w:r>
-      <w:proofErr w:type="spellEnd"/>
-      <w:r>
-        <w:t>,</w:t>
-      </w:r>
-    </w:p>
-    <w:p>
-      <w:r>
-        <w:t xml:space="preserve">        </w:t>
-      </w:r>
-      <w:proofErr w:type="spellStart"/>
-      <w:r>
-        <w:t>dc.reference_no_claim</w:t>
-      </w:r>
-      <w:proofErr w:type="spellEnd"/>
-      <w:r>
-        <w:t>,</w:t>
-      </w:r>
-    </w:p>
-    <w:p>
-      <w:r>
-        <w:t xml:space="preserve">        </w:t>
-      </w:r>
-      <w:proofErr w:type="spellStart"/>
-      <w:r>
-        <w:t>dc.claim_status</w:t>
-      </w:r>
-      <w:proofErr w:type="spellEnd"/>
-      <w:r>
-        <w:t>,</w:t>
-      </w:r>
-    </w:p>
-    <w:p>
-      <w:r>
-        <w:t xml:space="preserve">        </w:t>
-      </w:r>
-      <w:proofErr w:type="spellStart"/>
-      <w:r>
-        <w:t>dc.previous_status</w:t>
-      </w:r>
-      <w:proofErr w:type="spellEnd"/>
-      <w:r>
-        <w:t>,</w:t>
-      </w:r>
-    </w:p>
-    <w:p>
-      <w:r>
-        <w:t xml:space="preserve">        </w:t>
-      </w:r>
-      <w:proofErr w:type="spellStart"/>
-      <w:r>
-        <w:t>dc.remarks</w:t>
-      </w:r>
-      <w:proofErr w:type="spellEnd"/>
-      <w:r>
-        <w:t>,</w:t>
-      </w:r>
-    </w:p>
-    <w:p>
-      <w:r>
-        <w:t xml:space="preserve">        </w:t>
-      </w:r>
-      <w:proofErr w:type="spellStart"/>
-      <w:r>
-        <w:t>dc.problems</w:t>
-      </w:r>
-      <w:proofErr w:type="spellEnd"/>
-    </w:p>
-    <w:p>
-      <w:r>
-        <w:t xml:space="preserve">    FROM </w:t>
-      </w:r>
-      <w:proofErr w:type="spellStart"/>
-      <w:proofErr w:type="gramStart"/>
-      <w:r>
-        <w:t>public.device</w:t>
-      </w:r>
-      <w:proofErr w:type="gramEnd"/>
-      <w:r>
-        <w:t>_claims</w:t>
-      </w:r>
-      <w:proofErr w:type="spellEnd"/>
-      <w:r>
-        <w:t xml:space="preserve"> dc</w:t>
-      </w:r>
-    </w:p>
-    <w:p>
-      <w:r>
-        <w:t xml:space="preserve">    WHERE </w:t>
-      </w:r>
-      <w:proofErr w:type="spellStart"/>
-      <w:proofErr w:type="gramStart"/>
-      <w:r>
-        <w:t>dc.device</w:t>
-      </w:r>
-      <w:proofErr w:type="gramEnd"/>
-      <w:r>
-        <w:t>_sl_no</w:t>
-      </w:r>
-      <w:proofErr w:type="spellEnd"/>
-      <w:r>
-        <w:t xml:space="preserve"> IS NOT NULL</w:t>
-      </w:r>
-    </w:p>
-    <w:p>
-      <w:r>
-        <w:t xml:space="preserve">    ORDER BY </w:t>
-      </w:r>
-      <w:proofErr w:type="spellStart"/>
-      <w:proofErr w:type="gramStart"/>
-      <w:r>
-        <w:t>dc.device</w:t>
-      </w:r>
-      <w:proofErr w:type="gramEnd"/>
-      <w:r>
-        <w:t>_sl_no</w:t>
-      </w:r>
-      <w:proofErr w:type="spellEnd"/>
-      <w:r>
-        <w:t>, dc.id DESC</w:t>
-      </w:r>
-    </w:p>
-    <w:p>
-      <w:r>
-        <w:t>),</w:t>
-      </w:r>
-    </w:p>
     <w:p/>
     <w:p>
-      <w:proofErr w:type="spellStart"/>
-      <w:r>
-        <w:t>expired_summary</w:t>
-      </w:r>
-      <w:proofErr w:type="spellEnd"/>
-      <w:r>
-        <w:t xml:space="preserve"> AS (</w:t>
-      </w:r>
-    </w:p>
-    <w:p>
-      <w:r>
-        <w:t xml:space="preserve">    SELECT </w:t>
-      </w:r>
-      <w:proofErr w:type="gramStart"/>
-      <w:r>
-        <w:t>COUNT(</w:t>
-      </w:r>
-      <w:proofErr w:type="gramEnd"/>
-      <w:r>
-        <w:t>*) AS expired</w:t>
-      </w:r>
-    </w:p>
-    <w:p>
-      <w:r>
-        <w:t xml:space="preserve">    FROM </w:t>
-      </w:r>
-      <w:proofErr w:type="spellStart"/>
-      <w:proofErr w:type="gramStart"/>
-      <w:r>
-        <w:t>public.asset</w:t>
-      </w:r>
-      <w:proofErr w:type="gramEnd"/>
-      <w:r>
-        <w:t>_devices</w:t>
-      </w:r>
-      <w:proofErr w:type="spellEnd"/>
-      <w:r>
-        <w:t xml:space="preserve"> ad</w:t>
-      </w:r>
-    </w:p>
-    <w:p>
-      <w:r>
-        <w:lastRenderedPageBreak/>
-        <w:t xml:space="preserve">    WHERE </w:t>
-      </w:r>
-      <w:proofErr w:type="spellStart"/>
-      <w:r>
-        <w:t>ad.row_status</w:t>
-      </w:r>
-      <w:proofErr w:type="spellEnd"/>
-      <w:r>
-        <w:t xml:space="preserve"> = 1</w:t>
-      </w:r>
-    </w:p>
-    <w:p>
-      <w:r>
-        <w:t xml:space="preserve">      AND </w:t>
-      </w:r>
-      <w:proofErr w:type="spellStart"/>
-      <w:proofErr w:type="gramStart"/>
-      <w:r>
-        <w:t>ad.warranty</w:t>
-      </w:r>
-      <w:proofErr w:type="gramEnd"/>
-      <w:r>
-        <w:t>_date</w:t>
-      </w:r>
-      <w:proofErr w:type="spellEnd"/>
-      <w:r>
-        <w:t xml:space="preserve"> IS NOT NULL</w:t>
-      </w:r>
-    </w:p>
-    <w:p>
-      <w:r>
-        <w:t xml:space="preserve">      AND </w:t>
-      </w:r>
-      <w:proofErr w:type="spellStart"/>
-      <w:proofErr w:type="gramStart"/>
-      <w:r>
-        <w:t>ad.warranty</w:t>
-      </w:r>
-      <w:proofErr w:type="gramEnd"/>
-      <w:r>
-        <w:t>_</w:t>
-      </w:r>
-      <w:proofErr w:type="gramStart"/>
-      <w:r>
-        <w:t>date</w:t>
-      </w:r>
-      <w:proofErr w:type="spellEnd"/>
-      <w:r>
-        <w:t>::</w:t>
-      </w:r>
-      <w:proofErr w:type="gramEnd"/>
-      <w:r>
-        <w:t>date &lt; CURRENT_DATE</w:t>
-      </w:r>
-    </w:p>
-    <w:p>
-      <w:r>
-        <w:t>)</w:t>
+      <w:r>
+        <w:t>SELECT</w:t>
+      </w:r>
+    </w:p>
+    <w:p>
+      <w:r>
+        <w:t xml:space="preserve">    COUNT(DISTINCT ca.id) AS claimed,</w:t>
       </w:r>
     </w:p>
     <w:p/>
     <w:p>
       <w:r>
-        <w:t>SELECT</w:t>
-      </w:r>
-    </w:p>
-    <w:p>
-      <w:r>
-        <w:t xml:space="preserve">    </w:t>
-      </w:r>
-      <w:proofErr w:type="gramStart"/>
-      <w:r>
-        <w:t>COUNT(</w:t>
-      </w:r>
-      <w:proofErr w:type="gramEnd"/>
-      <w:r>
-        <w:t>DISTINCT ca.id) AS claimed,</w:t>
+        <w:t xml:space="preserve">    COUNT(*) FILTER (</w:t>
+      </w:r>
+    </w:p>
+    <w:p>
+      <w:r>
+        <w:t xml:space="preserve">        WHERE lc.claim_status = 9</w:t>
+      </w:r>
+    </w:p>
+    <w:p>
+      <w:r>
+        <w:t xml:space="preserve">    ) AS to_vendor,</w:t>
       </w:r>
     </w:p>
     <w:p/>
     <w:p>
       <w:r>
-        <w:t xml:space="preserve">    </w:t>
-      </w:r>
-      <w:proofErr w:type="gramStart"/>
-      <w:r>
-        <w:t>COUNT(</w:t>
-      </w:r>
-      <w:proofErr w:type="gramEnd"/>
-      <w:r>
-        <w:t>*) FILTER (</w:t>
-      </w:r>
-    </w:p>
-    <w:p>
-      <w:r>
-        <w:t xml:space="preserve">        WHERE </w:t>
-      </w:r>
-      <w:proofErr w:type="spellStart"/>
-      <w:proofErr w:type="gramStart"/>
-      <w:r>
-        <w:t>lc.claim</w:t>
-      </w:r>
-      <w:proofErr w:type="gramEnd"/>
-      <w:r>
-        <w:t>_status</w:t>
-      </w:r>
-      <w:proofErr w:type="spellEnd"/>
-      <w:r>
-        <w:t xml:space="preserve"> = 9</w:t>
-      </w:r>
-    </w:p>
-    <w:p>
-      <w:r>
-        <w:t xml:space="preserve">    ) AS </w:t>
-      </w:r>
-      <w:proofErr w:type="spellStart"/>
-      <w:r>
-        <w:t>to_vendor</w:t>
-      </w:r>
-      <w:proofErr w:type="spellEnd"/>
-      <w:r>
-        <w:t>,</w:t>
+        <w:t xml:space="preserve">    COUNT(*) FILTER (</w:t>
+      </w:r>
+    </w:p>
+    <w:p>
+      <w:r>
+        <w:t xml:space="preserve">        WHERE lc.claim_status = 10</w:t>
+      </w:r>
+    </w:p>
+    <w:p>
+      <w:r>
+        <w:t xml:space="preserve">    ) AS recovered,</w:t>
       </w:r>
     </w:p>
     <w:p/>
     <w:p>
       <w:r>
-        <w:t xml:space="preserve">    </w:t>
-      </w:r>
-      <w:proofErr w:type="gramStart"/>
-      <w:r>
-        <w:t>COUNT(</w:t>
-      </w:r>
-      <w:proofErr w:type="gramEnd"/>
-      <w:r>
-        <w:t>*) FILTER (</w:t>
-      </w:r>
-    </w:p>
-    <w:p>
-      <w:r>
-        <w:t xml:space="preserve">        WHERE </w:t>
-      </w:r>
-      <w:proofErr w:type="spellStart"/>
-      <w:proofErr w:type="gramStart"/>
-      <w:r>
-        <w:t>lc.claim</w:t>
-      </w:r>
-      <w:proofErr w:type="gramEnd"/>
-      <w:r>
-        <w:t>_status</w:t>
-      </w:r>
-      <w:proofErr w:type="spellEnd"/>
-      <w:r>
-        <w:t xml:space="preserve"> = 10</w:t>
-      </w:r>
-    </w:p>
-    <w:p>
-      <w:r>
-        <w:t xml:space="preserve">    ) AS recovered,</w:t>
-      </w:r>
-    </w:p>
-    <w:p/>
-    <w:p>
-      <w:r>
-        <w:t xml:space="preserve">    </w:t>
-      </w:r>
-      <w:proofErr w:type="gramStart"/>
-      <w:r>
-        <w:t>COALESCE(</w:t>
-      </w:r>
-      <w:proofErr w:type="gramEnd"/>
-      <w:r>
-        <w:t xml:space="preserve">(SELECT expired FROM </w:t>
-      </w:r>
-      <w:proofErr w:type="spellStart"/>
-      <w:r>
-        <w:t>expired_summary</w:t>
-      </w:r>
-      <w:proofErr w:type="spellEnd"/>
-      <w:r>
-        <w:t>), 0) AS expired,</w:t>
+        <w:t xml:space="preserve">    COALESCE((SELECT expired FROM expired_summary), 0) AS expired,</w:t>
       </w:r>
     </w:p>
     <w:p>
@@ -2816,88 +1964,22 @@
     </w:p>
     <w:p>
       <w:r>
-        <w:t xml:space="preserve">        </w:t>
-      </w:r>
-      <w:proofErr w:type="gramStart"/>
-      <w:r>
-        <w:t>COUNT(</w:t>
-      </w:r>
-      <w:proofErr w:type="gramEnd"/>
-      <w:r>
-        <w:t>DISTINCT ca.id)</w:t>
-      </w:r>
-    </w:p>
-    <w:p>
-      <w:r>
-        <w:t xml:space="preserve">        + </w:t>
-      </w:r>
-      <w:proofErr w:type="gramStart"/>
-      <w:r>
-        <w:t>COUNT(</w:t>
-      </w:r>
-      <w:proofErr w:type="gramEnd"/>
-      <w:r>
-        <w:t xml:space="preserve">*) FILTER (WHERE </w:t>
-      </w:r>
-      <w:proofErr w:type="spellStart"/>
-      <w:proofErr w:type="gramStart"/>
-      <w:r>
-        <w:t>lc.claim</w:t>
-      </w:r>
-      <w:proofErr w:type="gramEnd"/>
-      <w:r>
-        <w:t>_status</w:t>
-      </w:r>
-      <w:proofErr w:type="spellEnd"/>
-      <w:r>
-        <w:t xml:space="preserve"> = 9)</w:t>
-      </w:r>
-    </w:p>
-    <w:p>
-      <w:r>
-        <w:t xml:space="preserve">        + </w:t>
-      </w:r>
-      <w:proofErr w:type="gramStart"/>
-      <w:r>
-        <w:t>COUNT(</w:t>
-      </w:r>
-      <w:proofErr w:type="gramEnd"/>
-      <w:r>
-        <w:t xml:space="preserve">*) FILTER (WHERE </w:t>
-      </w:r>
-      <w:proofErr w:type="spellStart"/>
-      <w:proofErr w:type="gramStart"/>
-      <w:r>
-        <w:t>lc.claim</w:t>
-      </w:r>
-      <w:proofErr w:type="gramEnd"/>
-      <w:r>
-        <w:t>_status</w:t>
-      </w:r>
-      <w:proofErr w:type="spellEnd"/>
-      <w:r>
-        <w:t xml:space="preserve"> = 10)</w:t>
-      </w:r>
-    </w:p>
-    <w:p>
-      <w:r>
-        <w:t xml:space="preserve">        + </w:t>
-      </w:r>
-      <w:proofErr w:type="gramStart"/>
-      <w:r>
-        <w:t>COALESCE(</w:t>
-      </w:r>
-      <w:proofErr w:type="gramEnd"/>
-      <w:r>
-        <w:t xml:space="preserve">(SELECT expired FROM </w:t>
-      </w:r>
-      <w:proofErr w:type="spellStart"/>
-      <w:r>
-        <w:t>expired_summary</w:t>
-      </w:r>
-      <w:proofErr w:type="spellEnd"/>
-      <w:r>
-        <w:t>), 0)</w:t>
+        <w:t xml:space="preserve">        COUNT(DISTINCT ca.id)</w:t>
+      </w:r>
+    </w:p>
+    <w:p>
+      <w:r>
+        <w:t xml:space="preserve">        + COUNT(*) FILTER (WHERE lc.claim_status = 9)</w:t>
+      </w:r>
+    </w:p>
+    <w:p>
+      <w:r>
+        <w:t xml:space="preserve">        + COUNT(*) FILTER (WHERE lc.claim_status = 10)</w:t>
+      </w:r>
+    </w:p>
+    <w:p>
+      <w:r>
+        <w:t xml:space="preserve">        + COALESCE((SELECT expired FROM expired_summary), 0)</w:t>
       </w:r>
     </w:p>
     <w:p>
@@ -2907,59 +1989,17 @@
     </w:p>
     <w:p>
       <w:r>
-        <w:t xml:space="preserve">FROM </w:t>
-      </w:r>
-      <w:proofErr w:type="spellStart"/>
-      <w:r>
-        <w:t>claimed_assets</w:t>
-      </w:r>
-      <w:proofErr w:type="spellEnd"/>
-      <w:r>
-        <w:t xml:space="preserve"> ca</w:t>
-      </w:r>
-    </w:p>
-    <w:p>
-      <w:r>
-        <w:t xml:space="preserve">LEFT JOIN </w:t>
-      </w:r>
-      <w:proofErr w:type="spellStart"/>
-      <w:r>
-        <w:t>latest_claim_per_device</w:t>
-      </w:r>
-      <w:proofErr w:type="spellEnd"/>
-      <w:r>
-        <w:t xml:space="preserve"> lc</w:t>
-      </w:r>
-    </w:p>
-    <w:p>
-      <w:r>
-        <w:t xml:space="preserve">    ON </w:t>
-      </w:r>
-      <w:proofErr w:type="spellStart"/>
-      <w:proofErr w:type="gramStart"/>
-      <w:r>
-        <w:t>lc.device</w:t>
-      </w:r>
-      <w:proofErr w:type="gramEnd"/>
-      <w:r>
-        <w:t>_sl_no</w:t>
-      </w:r>
-      <w:proofErr w:type="spellEnd"/>
-      <w:r>
-        <w:t xml:space="preserve"> = </w:t>
-      </w:r>
-      <w:proofErr w:type="spellStart"/>
-      <w:proofErr w:type="gramStart"/>
-      <w:r>
-        <w:t>ca.device</w:t>
-      </w:r>
-      <w:proofErr w:type="gramEnd"/>
-      <w:r>
-        <w:t>_serial</w:t>
-      </w:r>
-      <w:proofErr w:type="spellEnd"/>
-      <w:r>
-        <w:t>;</w:t>
+        <w:t>FROM claimed_assets ca</w:t>
+      </w:r>
+    </w:p>
+    <w:p>
+      <w:r>
+        <w:t>LEFT JOIN latest_claim_per_device lc</w:t>
+      </w:r>
+    </w:p>
+    <w:p>
+      <w:r>
+        <w:t xml:space="preserve">    ON lc.device_sl_no = ca.device_serial;</w:t>
       </w:r>
     </w:p>
     <w:p/>
@@ -3012,151 +2052,37 @@
     </w:p>
     <w:p>
       <w:r>
-        <w:t xml:space="preserve">FROM </w:t>
-      </w:r>
-      <w:proofErr w:type="spellStart"/>
-      <w:proofErr w:type="gramStart"/>
-      <w:r>
-        <w:t>public.asset</w:t>
-      </w:r>
-      <w:proofErr w:type="gramEnd"/>
-      <w:r>
-        <w:t>_devices</w:t>
-      </w:r>
-      <w:proofErr w:type="spellEnd"/>
-    </w:p>
-    <w:p>
-      <w:r>
-        <w:t xml:space="preserve">WHERE </w:t>
-      </w:r>
-      <w:proofErr w:type="spellStart"/>
-      <w:r>
-        <w:t>row_status</w:t>
-      </w:r>
-      <w:proofErr w:type="spellEnd"/>
-      <w:r>
-        <w:t xml:space="preserve"> = 1</w:t>
-      </w:r>
-    </w:p>
-    <w:p>
-      <w:r>
-        <w:t xml:space="preserve">  AND </w:t>
-      </w:r>
-      <w:proofErr w:type="spellStart"/>
-      <w:r>
-        <w:t>warranty_date</w:t>
-      </w:r>
-      <w:proofErr w:type="spellEnd"/>
-      <w:r>
-        <w:t xml:space="preserve"> IS NOT NULL</w:t>
-      </w:r>
-    </w:p>
-    <w:p>
-      <w:r>
-        <w:t xml:space="preserve">  AND </w:t>
-      </w:r>
-      <w:proofErr w:type="spellStart"/>
-      <w:r>
-        <w:t>warranty_</w:t>
-      </w:r>
-      <w:proofErr w:type="gramStart"/>
-      <w:r>
-        <w:t>date</w:t>
-      </w:r>
-      <w:proofErr w:type="spellEnd"/>
-      <w:r>
-        <w:t>::</w:t>
-      </w:r>
-      <w:proofErr w:type="gramEnd"/>
-      <w:r>
-        <w:t>date &gt;= DATE_</w:t>
-      </w:r>
-      <w:proofErr w:type="gramStart"/>
-      <w:r>
-        <w:t>TRUNC(</w:t>
-      </w:r>
-      <w:proofErr w:type="gramEnd"/>
-      <w:r>
-        <w:t>'year', CURRENT_DATE</w:t>
-      </w:r>
-      <w:proofErr w:type="gramStart"/>
-      <w:r>
-        <w:t>)::</w:t>
-      </w:r>
-      <w:proofErr w:type="gramEnd"/>
-      <w:r>
-        <w:t>date</w:t>
-      </w:r>
-    </w:p>
-    <w:p>
-      <w:r>
-        <w:t xml:space="preserve">  AND </w:t>
-      </w:r>
-      <w:proofErr w:type="spellStart"/>
-      <w:r>
-        <w:t>warranty_</w:t>
-      </w:r>
-      <w:proofErr w:type="gramStart"/>
-      <w:r>
-        <w:t>date</w:t>
-      </w:r>
-      <w:proofErr w:type="spellEnd"/>
-      <w:r>
-        <w:t>::</w:t>
-      </w:r>
-      <w:proofErr w:type="gramEnd"/>
-      <w:r>
-        <w:t>date &lt; (DATE_</w:t>
-      </w:r>
-      <w:proofErr w:type="gramStart"/>
-      <w:r>
-        <w:t>TRUNC(</w:t>
-      </w:r>
-      <w:proofErr w:type="gramEnd"/>
-      <w:r>
-        <w:t>'year', CURRENT_DATE) + INTERVAL '1 year'</w:t>
-      </w:r>
-      <w:proofErr w:type="gramStart"/>
-      <w:r>
-        <w:t>)::</w:t>
-      </w:r>
-      <w:proofErr w:type="gramEnd"/>
-      <w:r>
-        <w:t>date</w:t>
-      </w:r>
-    </w:p>
-    <w:p>
-      <w:r>
-        <w:t xml:space="preserve">  AND </w:t>
-      </w:r>
-      <w:proofErr w:type="spellStart"/>
-      <w:r>
-        <w:t>warranty_</w:t>
-      </w:r>
-      <w:proofErr w:type="gramStart"/>
-      <w:r>
-        <w:t>date</w:t>
-      </w:r>
-      <w:proofErr w:type="spellEnd"/>
-      <w:r>
-        <w:t>::</w:t>
-      </w:r>
-      <w:proofErr w:type="gramEnd"/>
-      <w:r>
-        <w:t>date &lt; CURRENT_DATE</w:t>
-      </w:r>
-    </w:p>
-    <w:p>
-      <w:r>
-        <w:t xml:space="preserve">ORDER BY </w:t>
-      </w:r>
-      <w:proofErr w:type="spellStart"/>
-      <w:r>
-        <w:t>warranty_date</w:t>
-      </w:r>
-      <w:proofErr w:type="spellEnd"/>
-      <w:r>
-        <w:t xml:space="preserve"> ASC;</w:t>
+        <w:t>FROM public.asset_devices</w:t>
+      </w:r>
+    </w:p>
+    <w:p>
+      <w:r>
+        <w:t>WHERE row_status = 1</w:t>
+      </w:r>
+    </w:p>
+    <w:p>
+      <w:r>
+        <w:t xml:space="preserve">  AND warranty_date IS NOT NULL</w:t>
+      </w:r>
+    </w:p>
+    <w:p>
+      <w:r>
+        <w:t xml:space="preserve">  AND warranty_date::date &gt;= DATE_TRUNC('year', CURRENT_DATE)::date</w:t>
+      </w:r>
+    </w:p>
+    <w:p>
+      <w:r>
+        <w:t xml:space="preserve">  AND warranty_date::date &lt; (DATE_TRUNC('year', CURRENT_DATE) + INTERVAL '1 year')::date</w:t>
+      </w:r>
+    </w:p>
+    <w:p>
+      <w:r>
+        <w:t xml:space="preserve">  AND warranty_date::date &lt; CURRENT_DATE</w:t>
+      </w:r>
+    </w:p>
+    <w:p>
+      <w:r>
+        <w:t>ORDER BY warranty_date ASC;</w:t>
       </w:r>
     </w:p>
     <w:p/>
@@ -3238,23 +2164,7 @@
           <w:i/>
           <w:iCs/>
         </w:rPr>
-        <w:t xml:space="preserve">        WITH </w:t>
-      </w:r>
-      <w:proofErr w:type="spellStart"/>
-      <w:r>
-        <w:rPr>
-          <w:i/>
-          <w:iCs/>
-        </w:rPr>
-        <w:t>claimed_assets</w:t>
-      </w:r>
-      <w:proofErr w:type="spellEnd"/>
-      <w:r>
-        <w:rPr>
-          <w:i/>
-          <w:iCs/>
-        </w:rPr>
-        <w:t xml:space="preserve"> AS (</w:t>
+        <w:t>        WITH claimed_assets AS (</w:t>
       </w:r>
     </w:p>
     <w:p>
@@ -3299,136 +2209,52 @@
           <w:i/>
           <w:iCs/>
         </w:rPr>
-        <w:t xml:space="preserve">                </w:t>
-      </w:r>
-      <w:proofErr w:type="spellStart"/>
-      <w:proofErr w:type="gramStart"/>
-      <w:r>
-        <w:rPr>
-          <w:i/>
-          <w:iCs/>
-        </w:rPr>
-        <w:t>ad.device</w:t>
-      </w:r>
-      <w:proofErr w:type="gramEnd"/>
-      <w:r>
-        <w:rPr>
-          <w:i/>
-          <w:iCs/>
-        </w:rPr>
-        <w:t>_serial</w:t>
-      </w:r>
-      <w:proofErr w:type="spellEnd"/>
-    </w:p>
-    <w:p>
-      <w:pPr>
-        <w:rPr>
-          <w:i/>
-          <w:iCs/>
-        </w:rPr>
-      </w:pPr>
-      <w:r>
-        <w:rPr>
-          <w:i/>
-          <w:iCs/>
-        </w:rPr>
-        <w:t xml:space="preserve">            FROM </w:t>
-      </w:r>
-      <w:proofErr w:type="spellStart"/>
-      <w:proofErr w:type="gramStart"/>
-      <w:r>
-        <w:rPr>
-          <w:i/>
-          <w:iCs/>
-        </w:rPr>
-        <w:t>public.asset</w:t>
-      </w:r>
-      <w:proofErr w:type="gramEnd"/>
-      <w:r>
-        <w:rPr>
-          <w:i/>
-          <w:iCs/>
-        </w:rPr>
-        <w:t>_devices</w:t>
-      </w:r>
-      <w:proofErr w:type="spellEnd"/>
-      <w:r>
-        <w:rPr>
-          <w:i/>
-          <w:iCs/>
-        </w:rPr>
-        <w:t xml:space="preserve"> ad</w:t>
-      </w:r>
-    </w:p>
-    <w:p>
-      <w:pPr>
-        <w:rPr>
-          <w:i/>
-          <w:iCs/>
-        </w:rPr>
-      </w:pPr>
-      <w:r>
-        <w:rPr>
-          <w:i/>
-          <w:iCs/>
-        </w:rPr>
-        <w:t xml:space="preserve">            WHERE </w:t>
-      </w:r>
-      <w:proofErr w:type="spellStart"/>
-      <w:proofErr w:type="gramStart"/>
-      <w:r>
-        <w:rPr>
-          <w:i/>
-          <w:iCs/>
-        </w:rPr>
-        <w:t>ad.asset</w:t>
-      </w:r>
-      <w:proofErr w:type="gramEnd"/>
-      <w:r>
-        <w:rPr>
-          <w:i/>
-          <w:iCs/>
-        </w:rPr>
-        <w:t>_status</w:t>
-      </w:r>
-      <w:proofErr w:type="spellEnd"/>
-      <w:r>
-        <w:rPr>
-          <w:i/>
-          <w:iCs/>
-        </w:rPr>
-        <w:t xml:space="preserve"> = 8</w:t>
-      </w:r>
-    </w:p>
-    <w:p>
-      <w:pPr>
-        <w:rPr>
-          <w:i/>
-          <w:iCs/>
-        </w:rPr>
-      </w:pPr>
-      <w:r>
-        <w:rPr>
-          <w:i/>
-          <w:iCs/>
-        </w:rPr>
-        <w:t xml:space="preserve">              AND </w:t>
-      </w:r>
-      <w:proofErr w:type="spellStart"/>
-      <w:r>
-        <w:rPr>
-          <w:i/>
-          <w:iCs/>
-        </w:rPr>
-        <w:t>ad.row_status</w:t>
-      </w:r>
-      <w:proofErr w:type="spellEnd"/>
-      <w:r>
-        <w:rPr>
-          <w:i/>
-          <w:iCs/>
-        </w:rPr>
-        <w:t xml:space="preserve"> = 1</w:t>
+        <w:t>                ad.device_serial</w:t>
+      </w:r>
+    </w:p>
+    <w:p>
+      <w:pPr>
+        <w:rPr>
+          <w:i/>
+          <w:iCs/>
+        </w:rPr>
+      </w:pPr>
+      <w:r>
+        <w:rPr>
+          <w:i/>
+          <w:iCs/>
+        </w:rPr>
+        <w:t>            FROM public.asset_devices ad</w:t>
+      </w:r>
+    </w:p>
+    <w:p>
+      <w:pPr>
+        <w:rPr>
+          <w:i/>
+          <w:iCs/>
+        </w:rPr>
+      </w:pPr>
+      <w:r>
+        <w:rPr>
+          <w:i/>
+          <w:iCs/>
+        </w:rPr>
+        <w:t>            WHERE ad.asset_status = 8</w:t>
+      </w:r>
+    </w:p>
+    <w:p>
+      <w:pPr>
+        <w:rPr>
+          <w:i/>
+          <w:iCs/>
+        </w:rPr>
+      </w:pPr>
+      <w:r>
+        <w:rPr>
+          <w:i/>
+          <w:iCs/>
+        </w:rPr>
+        <w:t>              AND ad.row_status = 1</w:t>
       </w:r>
     </w:p>
     <w:p>
@@ -3466,63 +2292,22 @@
           <w:i/>
           <w:iCs/>
         </w:rPr>
-        <w:t xml:space="preserve">        </w:t>
-      </w:r>
-      <w:proofErr w:type="spellStart"/>
-      <w:r>
-        <w:rPr>
-          <w:i/>
-          <w:iCs/>
-        </w:rPr>
-        <w:t>latest_claim_per_device</w:t>
-      </w:r>
-      <w:proofErr w:type="spellEnd"/>
-      <w:r>
-        <w:rPr>
-          <w:i/>
-          <w:iCs/>
-        </w:rPr>
-        <w:t xml:space="preserve"> AS (</w:t>
-      </w:r>
-    </w:p>
-    <w:p>
-      <w:pPr>
-        <w:rPr>
-          <w:i/>
-          <w:iCs/>
-        </w:rPr>
-      </w:pPr>
-      <w:r>
-        <w:rPr>
-          <w:i/>
-          <w:iCs/>
-        </w:rPr>
-        <w:t>            SELECT DISTINCT ON (</w:t>
-      </w:r>
-      <w:proofErr w:type="spellStart"/>
-      <w:proofErr w:type="gramStart"/>
-      <w:r>
-        <w:rPr>
-          <w:i/>
-          <w:iCs/>
-        </w:rPr>
-        <w:t>dc.device</w:t>
-      </w:r>
-      <w:proofErr w:type="gramEnd"/>
-      <w:r>
-        <w:rPr>
-          <w:i/>
-          <w:iCs/>
-        </w:rPr>
-        <w:t>_sl_no</w:t>
-      </w:r>
-      <w:proofErr w:type="spellEnd"/>
-      <w:r>
-        <w:rPr>
-          <w:i/>
-          <w:iCs/>
-        </w:rPr>
-        <w:t>)</w:t>
+        <w:t>        latest_claim_per_device AS (</w:t>
+      </w:r>
+    </w:p>
+    <w:p>
+      <w:pPr>
+        <w:rPr>
+          <w:i/>
+          <w:iCs/>
+        </w:rPr>
+      </w:pPr>
+      <w:r>
+        <w:rPr>
+          <w:i/>
+          <w:iCs/>
+        </w:rPr>
+        <w:t>            SELECT DISTINCT ON (dc.device_sl_no)</w:t>
       </w:r>
     </w:p>
     <w:p>
@@ -3552,291 +2337,127 @@
           <w:i/>
           <w:iCs/>
         </w:rPr>
-        <w:t xml:space="preserve">                </w:t>
-      </w:r>
-      <w:proofErr w:type="spellStart"/>
-      <w:r>
-        <w:rPr>
-          <w:i/>
-          <w:iCs/>
-        </w:rPr>
-        <w:t>dc.device_sl_no</w:t>
-      </w:r>
-      <w:proofErr w:type="spellEnd"/>
-      <w:r>
-        <w:rPr>
-          <w:i/>
-          <w:iCs/>
-        </w:rPr>
-        <w:t>,</w:t>
-      </w:r>
-    </w:p>
-    <w:p>
-      <w:pPr>
-        <w:rPr>
-          <w:i/>
-          <w:iCs/>
-        </w:rPr>
-      </w:pPr>
-      <w:r>
-        <w:rPr>
-          <w:i/>
-          <w:iCs/>
-        </w:rPr>
-        <w:t xml:space="preserve">                </w:t>
-      </w:r>
-      <w:proofErr w:type="spellStart"/>
-      <w:r>
-        <w:rPr>
-          <w:i/>
-          <w:iCs/>
-        </w:rPr>
-        <w:t>dc.reference_no_claim</w:t>
-      </w:r>
-      <w:proofErr w:type="spellEnd"/>
-      <w:r>
-        <w:rPr>
-          <w:i/>
-          <w:iCs/>
-        </w:rPr>
-        <w:t>,</w:t>
-      </w:r>
-    </w:p>
-    <w:p>
-      <w:pPr>
-        <w:rPr>
-          <w:i/>
-          <w:iCs/>
-        </w:rPr>
-      </w:pPr>
-      <w:r>
-        <w:rPr>
-          <w:i/>
-          <w:iCs/>
-        </w:rPr>
-        <w:t xml:space="preserve">                </w:t>
-      </w:r>
-      <w:proofErr w:type="spellStart"/>
-      <w:r>
-        <w:rPr>
-          <w:i/>
-          <w:iCs/>
-        </w:rPr>
-        <w:t>dc.claim_status</w:t>
-      </w:r>
-      <w:proofErr w:type="spellEnd"/>
-      <w:r>
-        <w:rPr>
-          <w:i/>
-          <w:iCs/>
-        </w:rPr>
-        <w:t>,</w:t>
-      </w:r>
-    </w:p>
-    <w:p>
-      <w:pPr>
-        <w:rPr>
-          <w:i/>
-          <w:iCs/>
-        </w:rPr>
-      </w:pPr>
-      <w:r>
-        <w:rPr>
-          <w:i/>
-          <w:iCs/>
-        </w:rPr>
-        <w:t xml:space="preserve">                </w:t>
-      </w:r>
-      <w:proofErr w:type="spellStart"/>
-      <w:r>
-        <w:rPr>
-          <w:i/>
-          <w:iCs/>
-        </w:rPr>
-        <w:t>dc.previous_status</w:t>
-      </w:r>
-      <w:proofErr w:type="spellEnd"/>
-      <w:r>
-        <w:rPr>
-          <w:i/>
-          <w:iCs/>
-        </w:rPr>
-        <w:t>,</w:t>
-      </w:r>
-    </w:p>
-    <w:p>
-      <w:pPr>
-        <w:rPr>
-          <w:i/>
-          <w:iCs/>
-        </w:rPr>
-      </w:pPr>
-      <w:r>
-        <w:rPr>
-          <w:i/>
-          <w:iCs/>
-        </w:rPr>
-        <w:t xml:space="preserve">                </w:t>
-      </w:r>
-      <w:proofErr w:type="spellStart"/>
-      <w:r>
-        <w:rPr>
-          <w:i/>
-          <w:iCs/>
-        </w:rPr>
-        <w:t>dc.remarks</w:t>
-      </w:r>
-      <w:proofErr w:type="spellEnd"/>
-      <w:r>
-        <w:rPr>
-          <w:i/>
-          <w:iCs/>
-        </w:rPr>
-        <w:t>,</w:t>
-      </w:r>
-    </w:p>
-    <w:p>
-      <w:pPr>
-        <w:rPr>
-          <w:i/>
-          <w:iCs/>
-        </w:rPr>
-      </w:pPr>
-      <w:r>
-        <w:rPr>
-          <w:i/>
-          <w:iCs/>
-        </w:rPr>
-        <w:t xml:space="preserve">                </w:t>
-      </w:r>
-      <w:proofErr w:type="spellStart"/>
-      <w:r>
-        <w:rPr>
-          <w:i/>
-          <w:iCs/>
-        </w:rPr>
-        <w:t>dc.problems</w:t>
-      </w:r>
-      <w:proofErr w:type="spellEnd"/>
-    </w:p>
-    <w:p>
-      <w:pPr>
-        <w:rPr>
-          <w:i/>
-          <w:iCs/>
-        </w:rPr>
-      </w:pPr>
-      <w:r>
-        <w:rPr>
-          <w:i/>
-          <w:iCs/>
-        </w:rPr>
-        <w:t xml:space="preserve">            FROM </w:t>
-      </w:r>
-      <w:proofErr w:type="spellStart"/>
-      <w:proofErr w:type="gramStart"/>
-      <w:r>
-        <w:rPr>
-          <w:i/>
-          <w:iCs/>
-        </w:rPr>
-        <w:t>public.device</w:t>
-      </w:r>
-      <w:proofErr w:type="gramEnd"/>
-      <w:r>
-        <w:rPr>
-          <w:i/>
-          <w:iCs/>
-        </w:rPr>
-        <w:t>_claims</w:t>
-      </w:r>
-      <w:proofErr w:type="spellEnd"/>
-      <w:r>
-        <w:rPr>
-          <w:i/>
-          <w:iCs/>
-        </w:rPr>
-        <w:t xml:space="preserve"> dc</w:t>
-      </w:r>
-    </w:p>
-    <w:p>
-      <w:pPr>
-        <w:rPr>
-          <w:i/>
-          <w:iCs/>
-        </w:rPr>
-      </w:pPr>
-      <w:r>
-        <w:rPr>
-          <w:i/>
-          <w:iCs/>
-        </w:rPr>
-        <w:t xml:space="preserve">            WHERE </w:t>
-      </w:r>
-      <w:proofErr w:type="spellStart"/>
-      <w:proofErr w:type="gramStart"/>
-      <w:r>
-        <w:rPr>
-          <w:i/>
-          <w:iCs/>
-        </w:rPr>
-        <w:t>dc.device</w:t>
-      </w:r>
-      <w:proofErr w:type="gramEnd"/>
-      <w:r>
-        <w:rPr>
-          <w:i/>
-          <w:iCs/>
-        </w:rPr>
-        <w:t>_sl_no</w:t>
-      </w:r>
-      <w:proofErr w:type="spellEnd"/>
-      <w:r>
-        <w:rPr>
-          <w:i/>
-          <w:iCs/>
-        </w:rPr>
-        <w:t xml:space="preserve"> IS NOT NULL</w:t>
-      </w:r>
-    </w:p>
-    <w:p>
-      <w:pPr>
-        <w:rPr>
-          <w:i/>
-          <w:iCs/>
-        </w:rPr>
-      </w:pPr>
-      <w:r>
-        <w:rPr>
-          <w:i/>
-          <w:iCs/>
-        </w:rPr>
-        <w:t xml:space="preserve">            ORDER BY </w:t>
-      </w:r>
-      <w:proofErr w:type="spellStart"/>
-      <w:proofErr w:type="gramStart"/>
-      <w:r>
-        <w:rPr>
-          <w:i/>
-          <w:iCs/>
-        </w:rPr>
-        <w:t>dc.device</w:t>
-      </w:r>
-      <w:proofErr w:type="gramEnd"/>
-      <w:r>
-        <w:rPr>
-          <w:i/>
-          <w:iCs/>
-        </w:rPr>
-        <w:t>_sl_no</w:t>
-      </w:r>
-      <w:proofErr w:type="spellEnd"/>
-      <w:r>
-        <w:rPr>
-          <w:i/>
-          <w:iCs/>
-        </w:rPr>
-        <w:t>, dc.id DESC</w:t>
+        <w:t>                dc.device_sl_no,</w:t>
+      </w:r>
+    </w:p>
+    <w:p>
+      <w:pPr>
+        <w:rPr>
+          <w:i/>
+          <w:iCs/>
+        </w:rPr>
+      </w:pPr>
+      <w:r>
+        <w:rPr>
+          <w:i/>
+          <w:iCs/>
+        </w:rPr>
+        <w:t>                dc.reference_no_claim,</w:t>
+      </w:r>
+    </w:p>
+    <w:p>
+      <w:pPr>
+        <w:rPr>
+          <w:i/>
+          <w:iCs/>
+        </w:rPr>
+      </w:pPr>
+      <w:r>
+        <w:rPr>
+          <w:i/>
+          <w:iCs/>
+        </w:rPr>
+        <w:t>                dc.claim_status,</w:t>
+      </w:r>
+    </w:p>
+    <w:p>
+      <w:pPr>
+        <w:rPr>
+          <w:i/>
+          <w:iCs/>
+        </w:rPr>
+      </w:pPr>
+      <w:r>
+        <w:rPr>
+          <w:i/>
+          <w:iCs/>
+        </w:rPr>
+        <w:t>                dc.previous_status,</w:t>
+      </w:r>
+    </w:p>
+    <w:p>
+      <w:pPr>
+        <w:rPr>
+          <w:i/>
+          <w:iCs/>
+        </w:rPr>
+      </w:pPr>
+      <w:r>
+        <w:rPr>
+          <w:i/>
+          <w:iCs/>
+        </w:rPr>
+        <w:t>                dc.remarks,</w:t>
+      </w:r>
+    </w:p>
+    <w:p>
+      <w:pPr>
+        <w:rPr>
+          <w:i/>
+          <w:iCs/>
+        </w:rPr>
+      </w:pPr>
+      <w:r>
+        <w:rPr>
+          <w:i/>
+          <w:iCs/>
+        </w:rPr>
+        <w:t>                dc.problems</w:t>
+      </w:r>
+    </w:p>
+    <w:p>
+      <w:pPr>
+        <w:rPr>
+          <w:i/>
+          <w:iCs/>
+        </w:rPr>
+      </w:pPr>
+      <w:r>
+        <w:rPr>
+          <w:i/>
+          <w:iCs/>
+        </w:rPr>
+        <w:t>            FROM public.device_claims dc</w:t>
+      </w:r>
+    </w:p>
+    <w:p>
+      <w:pPr>
+        <w:rPr>
+          <w:i/>
+          <w:iCs/>
+        </w:rPr>
+      </w:pPr>
+      <w:r>
+        <w:rPr>
+          <w:i/>
+          <w:iCs/>
+        </w:rPr>
+        <w:t>            WHERE dc.device_sl_no IS NOT NULL</w:t>
+      </w:r>
+    </w:p>
+    <w:p>
+      <w:pPr>
+        <w:rPr>
+          <w:i/>
+          <w:iCs/>
+        </w:rPr>
+      </w:pPr>
+      <w:r>
+        <w:rPr>
+          <w:i/>
+          <w:iCs/>
+        </w:rPr>
+        <w:t>            ORDER BY dc.device_sl_no, dc.id DESC</w:t>
       </w:r>
     </w:p>
     <w:p>
@@ -3874,221 +2495,82 @@
           <w:i/>
           <w:iCs/>
         </w:rPr>
-        <w:t xml:space="preserve">        </w:t>
-      </w:r>
-      <w:proofErr w:type="spellStart"/>
-      <w:r>
-        <w:rPr>
-          <w:i/>
-          <w:iCs/>
-        </w:rPr>
-        <w:t>expired_summary</w:t>
-      </w:r>
-      <w:proofErr w:type="spellEnd"/>
-      <w:r>
-        <w:rPr>
-          <w:i/>
-          <w:iCs/>
-        </w:rPr>
-        <w:t xml:space="preserve"> AS (</w:t>
-      </w:r>
-    </w:p>
-    <w:p>
-      <w:pPr>
-        <w:rPr>
-          <w:i/>
-          <w:iCs/>
-        </w:rPr>
-      </w:pPr>
-      <w:r>
-        <w:rPr>
-          <w:i/>
-          <w:iCs/>
-        </w:rPr>
-        <w:t xml:space="preserve">            SELECT </w:t>
-      </w:r>
-      <w:proofErr w:type="gramStart"/>
-      <w:r>
-        <w:rPr>
-          <w:i/>
-          <w:iCs/>
-        </w:rPr>
-        <w:t>COUNT(</w:t>
-      </w:r>
-      <w:proofErr w:type="gramEnd"/>
-      <w:r>
-        <w:rPr>
-          <w:i/>
-          <w:iCs/>
-        </w:rPr>
-        <w:t>*) AS expired</w:t>
-      </w:r>
-    </w:p>
-    <w:p>
-      <w:pPr>
-        <w:rPr>
-          <w:i/>
-          <w:iCs/>
-        </w:rPr>
-      </w:pPr>
-      <w:r>
-        <w:rPr>
-          <w:i/>
-          <w:iCs/>
-        </w:rPr>
-        <w:t xml:space="preserve">            FROM </w:t>
-      </w:r>
-      <w:proofErr w:type="spellStart"/>
-      <w:proofErr w:type="gramStart"/>
-      <w:r>
-        <w:rPr>
-          <w:i/>
-          <w:iCs/>
-        </w:rPr>
-        <w:t>public.asset</w:t>
-      </w:r>
-      <w:proofErr w:type="gramEnd"/>
-      <w:r>
-        <w:rPr>
-          <w:i/>
-          <w:iCs/>
-        </w:rPr>
-        <w:t>_devices</w:t>
-      </w:r>
-      <w:proofErr w:type="spellEnd"/>
-      <w:r>
-        <w:rPr>
-          <w:i/>
-          <w:iCs/>
-        </w:rPr>
-        <w:t xml:space="preserve"> ad</w:t>
-      </w:r>
-    </w:p>
-    <w:p>
-      <w:pPr>
-        <w:rPr>
-          <w:i/>
-          <w:iCs/>
-        </w:rPr>
-      </w:pPr>
-      <w:r>
-        <w:rPr>
-          <w:i/>
-          <w:iCs/>
-        </w:rPr>
-        <w:t xml:space="preserve">            WHERE </w:t>
-      </w:r>
-      <w:proofErr w:type="spellStart"/>
-      <w:r>
-        <w:rPr>
-          <w:i/>
-          <w:iCs/>
-        </w:rPr>
-        <w:t>ad.row_status</w:t>
-      </w:r>
-      <w:proofErr w:type="spellEnd"/>
-      <w:r>
-        <w:rPr>
-          <w:i/>
-          <w:iCs/>
-        </w:rPr>
-        <w:t xml:space="preserve"> = 1</w:t>
-      </w:r>
-    </w:p>
-    <w:p>
-      <w:pPr>
-        <w:rPr>
-          <w:i/>
-          <w:iCs/>
-        </w:rPr>
-      </w:pPr>
-      <w:r>
-        <w:rPr>
-          <w:i/>
-          <w:iCs/>
-        </w:rPr>
-        <w:t xml:space="preserve">              AND </w:t>
-      </w:r>
-      <w:proofErr w:type="spellStart"/>
-      <w:proofErr w:type="gramStart"/>
-      <w:r>
-        <w:rPr>
-          <w:i/>
-          <w:iCs/>
-        </w:rPr>
-        <w:t>ad.warranty</w:t>
-      </w:r>
-      <w:proofErr w:type="gramEnd"/>
-      <w:r>
-        <w:rPr>
-          <w:i/>
-          <w:iCs/>
-        </w:rPr>
-        <w:t>_date</w:t>
-      </w:r>
-      <w:proofErr w:type="spellEnd"/>
-      <w:r>
-        <w:rPr>
-          <w:i/>
-          <w:iCs/>
-        </w:rPr>
-        <w:t xml:space="preserve"> IS NOT NULL</w:t>
-      </w:r>
-    </w:p>
-    <w:p>
-      <w:pPr>
-        <w:rPr>
-          <w:i/>
-          <w:iCs/>
-        </w:rPr>
-      </w:pPr>
-      <w:r>
-        <w:rPr>
-          <w:i/>
-          <w:iCs/>
-        </w:rPr>
-        <w:t xml:space="preserve">              AND </w:t>
-      </w:r>
-      <w:proofErr w:type="spellStart"/>
-      <w:proofErr w:type="gramStart"/>
-      <w:r>
-        <w:rPr>
-          <w:i/>
-          <w:iCs/>
-        </w:rPr>
-        <w:t>ad.warranty</w:t>
-      </w:r>
-      <w:proofErr w:type="gramEnd"/>
-      <w:r>
-        <w:rPr>
-          <w:i/>
-          <w:iCs/>
-        </w:rPr>
-        <w:t>_</w:t>
-      </w:r>
-      <w:proofErr w:type="gramStart"/>
-      <w:r>
-        <w:rPr>
-          <w:i/>
-          <w:iCs/>
-        </w:rPr>
-        <w:t>date</w:t>
-      </w:r>
-      <w:proofErr w:type="spellEnd"/>
-      <w:r>
-        <w:rPr>
-          <w:i/>
-          <w:iCs/>
-        </w:rPr>
-        <w:t>::</w:t>
-      </w:r>
-      <w:proofErr w:type="gramEnd"/>
-      <w:r>
-        <w:rPr>
-          <w:i/>
-          <w:iCs/>
-        </w:rPr>
-        <w:t>date &lt; CURRENT_DATE</w:t>
+        <w:t>        expired_summary AS (</w:t>
+      </w:r>
+    </w:p>
+    <w:p>
+      <w:pPr>
+        <w:rPr>
+          <w:i/>
+          <w:iCs/>
+        </w:rPr>
+      </w:pPr>
+      <w:r>
+        <w:rPr>
+          <w:i/>
+          <w:iCs/>
+        </w:rPr>
+        <w:t>            SELECT COUNT(*) AS expired</w:t>
+      </w:r>
+    </w:p>
+    <w:p>
+      <w:pPr>
+        <w:rPr>
+          <w:i/>
+          <w:iCs/>
+        </w:rPr>
+      </w:pPr>
+      <w:r>
+        <w:rPr>
+          <w:i/>
+          <w:iCs/>
+        </w:rPr>
+        <w:t>            FROM public.asset_devices ad</w:t>
+      </w:r>
+    </w:p>
+    <w:p>
+      <w:pPr>
+        <w:rPr>
+          <w:i/>
+          <w:iCs/>
+        </w:rPr>
+      </w:pPr>
+      <w:r>
+        <w:rPr>
+          <w:i/>
+          <w:iCs/>
+        </w:rPr>
+        <w:t>            WHERE ad.row_status = 1</w:t>
+      </w:r>
+    </w:p>
+    <w:p>
+      <w:pPr>
+        <w:rPr>
+          <w:i/>
+          <w:iCs/>
+        </w:rPr>
+      </w:pPr>
+      <w:r>
+        <w:rPr>
+          <w:i/>
+          <w:iCs/>
+        </w:rPr>
+        <w:t>              AND ad.warranty_date IS NOT NULL</w:t>
+      </w:r>
+    </w:p>
+    <w:p>
+      <w:pPr>
+        <w:rPr>
+          <w:i/>
+          <w:iCs/>
+        </w:rPr>
+      </w:pPr>
+      <w:r>
+        <w:rPr>
+          <w:i/>
+          <w:iCs/>
+        </w:rPr>
+        <w:t>              AND ad.warranty_date::date &lt; CURRENT_DATE</w:t>
       </w:r>
     </w:p>
     <w:p>
@@ -4141,23 +2623,7 @@
           <w:i/>
           <w:iCs/>
         </w:rPr>
-        <w:t xml:space="preserve">            </w:t>
-      </w:r>
-      <w:proofErr w:type="gramStart"/>
-      <w:r>
-        <w:rPr>
-          <w:i/>
-          <w:iCs/>
-        </w:rPr>
-        <w:t>COUNT(</w:t>
-      </w:r>
-      <w:proofErr w:type="gramEnd"/>
-      <w:r>
-        <w:rPr>
-          <w:i/>
-          <w:iCs/>
-        </w:rPr>
-        <w:t>DISTINCT ca.id) AS claimed,</w:t>
+        <w:t>            COUNT(DISTINCT ca.id) AS claimed,</w:t>
       </w:r>
     </w:p>
     <w:p>
@@ -4181,173 +2647,75 @@
           <w:iCs/>
         </w:rPr>
         <w:lastRenderedPageBreak/>
-        <w:t xml:space="preserve">            </w:t>
-      </w:r>
-      <w:proofErr w:type="gramStart"/>
-      <w:r>
-        <w:rPr>
-          <w:i/>
-          <w:iCs/>
-        </w:rPr>
-        <w:t>COUNT(</w:t>
-      </w:r>
-      <w:proofErr w:type="gramEnd"/>
-      <w:r>
-        <w:rPr>
-          <w:i/>
-          <w:iCs/>
-        </w:rPr>
-        <w:t>*) FILTER (</w:t>
-      </w:r>
-    </w:p>
-    <w:p>
-      <w:pPr>
-        <w:rPr>
-          <w:i/>
-          <w:iCs/>
-        </w:rPr>
-      </w:pPr>
-      <w:r>
-        <w:rPr>
-          <w:i/>
-          <w:iCs/>
-        </w:rPr>
-        <w:t xml:space="preserve">                WHERE </w:t>
-      </w:r>
-      <w:proofErr w:type="spellStart"/>
-      <w:proofErr w:type="gramStart"/>
-      <w:r>
-        <w:rPr>
-          <w:i/>
-          <w:iCs/>
-        </w:rPr>
-        <w:t>lc.claim</w:t>
-      </w:r>
-      <w:proofErr w:type="gramEnd"/>
-      <w:r>
-        <w:rPr>
-          <w:i/>
-          <w:iCs/>
-        </w:rPr>
-        <w:t>_status</w:t>
-      </w:r>
-      <w:proofErr w:type="spellEnd"/>
-      <w:r>
-        <w:rPr>
-          <w:i/>
-          <w:iCs/>
-        </w:rPr>
-        <w:t xml:space="preserve"> = 9</w:t>
-      </w:r>
-    </w:p>
-    <w:p>
-      <w:pPr>
-        <w:rPr>
-          <w:i/>
-          <w:iCs/>
-        </w:rPr>
-      </w:pPr>
-      <w:r>
-        <w:rPr>
-          <w:i/>
-          <w:iCs/>
-        </w:rPr>
-        <w:t xml:space="preserve">            ) AS </w:t>
-      </w:r>
-      <w:proofErr w:type="spellStart"/>
-      <w:r>
-        <w:rPr>
-          <w:i/>
-          <w:iCs/>
-        </w:rPr>
-        <w:t>to_vendor</w:t>
-      </w:r>
-      <w:proofErr w:type="spellEnd"/>
-      <w:r>
-        <w:rPr>
-          <w:i/>
-          <w:iCs/>
-        </w:rPr>
-        <w:t>,</w:t>
-      </w:r>
-    </w:p>
-    <w:p>
-      <w:pPr>
-        <w:rPr>
-          <w:i/>
-          <w:iCs/>
-        </w:rPr>
-      </w:pPr>
-    </w:p>
-    <w:p>
-      <w:pPr>
-        <w:rPr>
-          <w:i/>
-          <w:iCs/>
-        </w:rPr>
-      </w:pPr>
-      <w:r>
-        <w:rPr>
-          <w:i/>
-          <w:iCs/>
-        </w:rPr>
-        <w:t xml:space="preserve">            </w:t>
-      </w:r>
-      <w:proofErr w:type="gramStart"/>
-      <w:r>
-        <w:rPr>
-          <w:i/>
-          <w:iCs/>
-        </w:rPr>
-        <w:t>COUNT(</w:t>
-      </w:r>
-      <w:proofErr w:type="gramEnd"/>
-      <w:r>
-        <w:rPr>
-          <w:i/>
-          <w:iCs/>
-        </w:rPr>
-        <w:t>*) FILTER (</w:t>
-      </w:r>
-    </w:p>
-    <w:p>
-      <w:pPr>
-        <w:rPr>
-          <w:i/>
-          <w:iCs/>
-        </w:rPr>
-      </w:pPr>
-      <w:r>
-        <w:rPr>
-          <w:i/>
-          <w:iCs/>
-        </w:rPr>
-        <w:t xml:space="preserve">                WHERE </w:t>
-      </w:r>
-      <w:proofErr w:type="spellStart"/>
-      <w:proofErr w:type="gramStart"/>
-      <w:r>
-        <w:rPr>
-          <w:i/>
-          <w:iCs/>
-        </w:rPr>
-        <w:t>lc.claim</w:t>
-      </w:r>
-      <w:proofErr w:type="gramEnd"/>
-      <w:r>
-        <w:rPr>
-          <w:i/>
-          <w:iCs/>
-        </w:rPr>
-        <w:t>_status</w:t>
-      </w:r>
-      <w:proofErr w:type="spellEnd"/>
-      <w:r>
-        <w:rPr>
-          <w:i/>
-          <w:iCs/>
-        </w:rPr>
-        <w:t xml:space="preserve"> = 10</w:t>
+        <w:t>            COUNT(*) FILTER (</w:t>
+      </w:r>
+    </w:p>
+    <w:p>
+      <w:pPr>
+        <w:rPr>
+          <w:i/>
+          <w:iCs/>
+        </w:rPr>
+      </w:pPr>
+      <w:r>
+        <w:rPr>
+          <w:i/>
+          <w:iCs/>
+        </w:rPr>
+        <w:t>                WHERE lc.claim_status = 9</w:t>
+      </w:r>
+    </w:p>
+    <w:p>
+      <w:pPr>
+        <w:rPr>
+          <w:i/>
+          <w:iCs/>
+        </w:rPr>
+      </w:pPr>
+      <w:r>
+        <w:rPr>
+          <w:i/>
+          <w:iCs/>
+        </w:rPr>
+        <w:t>            ) AS to_vendor,</w:t>
+      </w:r>
+    </w:p>
+    <w:p>
+      <w:pPr>
+        <w:rPr>
+          <w:i/>
+          <w:iCs/>
+        </w:rPr>
+      </w:pPr>
+    </w:p>
+    <w:p>
+      <w:pPr>
+        <w:rPr>
+          <w:i/>
+          <w:iCs/>
+        </w:rPr>
+      </w:pPr>
+      <w:r>
+        <w:rPr>
+          <w:i/>
+          <w:iCs/>
+        </w:rPr>
+        <w:t>            COUNT(*) FILTER (</w:t>
+      </w:r>
+    </w:p>
+    <w:p>
+      <w:pPr>
+        <w:rPr>
+          <w:i/>
+          <w:iCs/>
+        </w:rPr>
+      </w:pPr>
+      <w:r>
+        <w:rPr>
+          <w:i/>
+          <w:iCs/>
+        </w:rPr>
+        <w:t>                WHERE lc.claim_status = 10</w:t>
       </w:r>
     </w:p>
     <w:p>
@@ -4385,39 +2753,7 @@
           <w:i/>
           <w:iCs/>
         </w:rPr>
-        <w:t xml:space="preserve">            </w:t>
-      </w:r>
-      <w:proofErr w:type="gramStart"/>
-      <w:r>
-        <w:rPr>
-          <w:i/>
-          <w:iCs/>
-        </w:rPr>
-        <w:t>COALESCE(</w:t>
-      </w:r>
-      <w:proofErr w:type="gramEnd"/>
-      <w:r>
-        <w:rPr>
-          <w:i/>
-          <w:iCs/>
-        </w:rPr>
-        <w:t xml:space="preserve">(SELECT expired FROM </w:t>
-      </w:r>
-      <w:proofErr w:type="spellStart"/>
-      <w:r>
-        <w:rPr>
-          <w:i/>
-          <w:iCs/>
-        </w:rPr>
-        <w:t>expired_summary</w:t>
-      </w:r>
-      <w:proofErr w:type="spellEnd"/>
-      <w:r>
-        <w:rPr>
-          <w:i/>
-          <w:iCs/>
-        </w:rPr>
-        <w:t>), 0) AS expired,</w:t>
+        <w:t>            COALESCE((SELECT expired FROM expired_summary), 0) AS expired,</w:t>
       </w:r>
     </w:p>
     <w:p>
@@ -4455,182 +2791,52 @@
           <w:i/>
           <w:iCs/>
         </w:rPr>
-        <w:t xml:space="preserve">                </w:t>
-      </w:r>
-      <w:proofErr w:type="gramStart"/>
-      <w:r>
-        <w:rPr>
-          <w:i/>
-          <w:iCs/>
-        </w:rPr>
-        <w:t>COUNT(</w:t>
-      </w:r>
-      <w:proofErr w:type="gramEnd"/>
-      <w:r>
-        <w:rPr>
-          <w:i/>
-          <w:iCs/>
-        </w:rPr>
-        <w:t>DISTINCT ca.id)</w:t>
-      </w:r>
-    </w:p>
-    <w:p>
-      <w:pPr>
-        <w:rPr>
-          <w:i/>
-          <w:iCs/>
-        </w:rPr>
-      </w:pPr>
-      <w:r>
-        <w:rPr>
-          <w:i/>
-          <w:iCs/>
-        </w:rPr>
-        <w:t xml:space="preserve">                + </w:t>
-      </w:r>
-      <w:proofErr w:type="gramStart"/>
-      <w:r>
-        <w:rPr>
-          <w:i/>
-          <w:iCs/>
-        </w:rPr>
-        <w:t>COUNT(</w:t>
-      </w:r>
-      <w:proofErr w:type="gramEnd"/>
-      <w:r>
-        <w:rPr>
-          <w:i/>
-          <w:iCs/>
-        </w:rPr>
-        <w:t xml:space="preserve">*) FILTER (WHERE </w:t>
-      </w:r>
-      <w:proofErr w:type="spellStart"/>
-      <w:proofErr w:type="gramStart"/>
-      <w:r>
-        <w:rPr>
-          <w:i/>
-          <w:iCs/>
-        </w:rPr>
-        <w:t>lc.claim</w:t>
-      </w:r>
-      <w:proofErr w:type="gramEnd"/>
-      <w:r>
-        <w:rPr>
-          <w:i/>
-          <w:iCs/>
-        </w:rPr>
-        <w:t>_status</w:t>
-      </w:r>
-      <w:proofErr w:type="spellEnd"/>
-      <w:r>
-        <w:rPr>
-          <w:i/>
-          <w:iCs/>
-        </w:rPr>
-        <w:t xml:space="preserve"> = 9)</w:t>
-      </w:r>
-    </w:p>
-    <w:p>
-      <w:pPr>
-        <w:rPr>
-          <w:i/>
-          <w:iCs/>
-        </w:rPr>
-      </w:pPr>
-      <w:r>
-        <w:rPr>
-          <w:i/>
-          <w:iCs/>
-        </w:rPr>
-        <w:t xml:space="preserve">                + </w:t>
-      </w:r>
-      <w:proofErr w:type="gramStart"/>
-      <w:r>
-        <w:rPr>
-          <w:i/>
-          <w:iCs/>
-        </w:rPr>
-        <w:t>COUNT(</w:t>
-      </w:r>
-      <w:proofErr w:type="gramEnd"/>
-      <w:r>
-        <w:rPr>
-          <w:i/>
-          <w:iCs/>
-        </w:rPr>
-        <w:t xml:space="preserve">*) FILTER (WHERE </w:t>
-      </w:r>
-      <w:proofErr w:type="spellStart"/>
-      <w:proofErr w:type="gramStart"/>
-      <w:r>
-        <w:rPr>
-          <w:i/>
-          <w:iCs/>
-        </w:rPr>
-        <w:t>lc.claim</w:t>
-      </w:r>
-      <w:proofErr w:type="gramEnd"/>
-      <w:r>
-        <w:rPr>
-          <w:i/>
-          <w:iCs/>
-        </w:rPr>
-        <w:t>_status</w:t>
-      </w:r>
-      <w:proofErr w:type="spellEnd"/>
-      <w:r>
-        <w:rPr>
-          <w:i/>
-          <w:iCs/>
-        </w:rPr>
-        <w:t xml:space="preserve"> = 10)</w:t>
-      </w:r>
-    </w:p>
-    <w:p>
-      <w:pPr>
-        <w:rPr>
-          <w:i/>
-          <w:iCs/>
-        </w:rPr>
-      </w:pPr>
-      <w:r>
-        <w:rPr>
-          <w:i/>
-          <w:iCs/>
-        </w:rPr>
-        <w:t xml:space="preserve">                + </w:t>
-      </w:r>
-      <w:proofErr w:type="gramStart"/>
-      <w:r>
-        <w:rPr>
-          <w:i/>
-          <w:iCs/>
-        </w:rPr>
-        <w:t>COALESCE(</w:t>
-      </w:r>
-      <w:proofErr w:type="gramEnd"/>
-      <w:r>
-        <w:rPr>
-          <w:i/>
-          <w:iCs/>
-        </w:rPr>
-        <w:t xml:space="preserve">(SELECT expired FROM </w:t>
-      </w:r>
-      <w:proofErr w:type="spellStart"/>
-      <w:r>
-        <w:rPr>
-          <w:i/>
-          <w:iCs/>
-        </w:rPr>
-        <w:t>expired_summary</w:t>
-      </w:r>
-      <w:proofErr w:type="spellEnd"/>
-      <w:r>
-        <w:rPr>
-          <w:i/>
-          <w:iCs/>
-        </w:rPr>
-        <w:t>), 0)</w:t>
+        <w:t>                COUNT(DISTINCT ca.id)</w:t>
+      </w:r>
+    </w:p>
+    <w:p>
+      <w:pPr>
+        <w:rPr>
+          <w:i/>
+          <w:iCs/>
+        </w:rPr>
+      </w:pPr>
+      <w:r>
+        <w:rPr>
+          <w:i/>
+          <w:iCs/>
+        </w:rPr>
+        <w:t>                + COUNT(*) FILTER (WHERE lc.claim_status = 9)</w:t>
+      </w:r>
+    </w:p>
+    <w:p>
+      <w:pPr>
+        <w:rPr>
+          <w:i/>
+          <w:iCs/>
+        </w:rPr>
+      </w:pPr>
+      <w:r>
+        <w:rPr>
+          <w:i/>
+          <w:iCs/>
+        </w:rPr>
+        <w:t>                + COUNT(*) FILTER (WHERE lc.claim_status = 10)</w:t>
+      </w:r>
+    </w:p>
+    <w:p>
+      <w:pPr>
+        <w:rPr>
+          <w:i/>
+          <w:iCs/>
+        </w:rPr>
+      </w:pPr>
+      <w:r>
+        <w:rPr>
+          <w:i/>
+          <w:iCs/>
+        </w:rPr>
+        <w:t>                + COALESCE((SELECT expired FROM expired_summary), 0)</w:t>
       </w:r>
     </w:p>
     <w:p>
@@ -4668,113 +2874,38 @@
           <w:i/>
           <w:iCs/>
         </w:rPr>
-        <w:t xml:space="preserve">        FROM </w:t>
-      </w:r>
-      <w:proofErr w:type="spellStart"/>
-      <w:r>
-        <w:rPr>
-          <w:i/>
-          <w:iCs/>
-        </w:rPr>
-        <w:t>claimed_assets</w:t>
-      </w:r>
-      <w:proofErr w:type="spellEnd"/>
-      <w:r>
-        <w:rPr>
-          <w:i/>
-          <w:iCs/>
-        </w:rPr>
-        <w:t xml:space="preserve"> ca</w:t>
-      </w:r>
-    </w:p>
-    <w:p>
-      <w:pPr>
-        <w:rPr>
-          <w:i/>
-          <w:iCs/>
-        </w:rPr>
-      </w:pPr>
-      <w:r>
-        <w:rPr>
-          <w:i/>
-          <w:iCs/>
-        </w:rPr>
-        <w:t xml:space="preserve">        LEFT JOIN </w:t>
-      </w:r>
-      <w:proofErr w:type="spellStart"/>
-      <w:r>
-        <w:rPr>
-          <w:i/>
-          <w:iCs/>
-        </w:rPr>
-        <w:t>latest_claim_per_device</w:t>
-      </w:r>
-      <w:proofErr w:type="spellEnd"/>
-      <w:r>
-        <w:rPr>
-          <w:i/>
-          <w:iCs/>
-        </w:rPr>
-        <w:t xml:space="preserve"> lc</w:t>
-      </w:r>
-    </w:p>
-    <w:p>
-      <w:pPr>
-        <w:rPr>
-          <w:i/>
-          <w:iCs/>
-        </w:rPr>
-      </w:pPr>
-      <w:r>
-        <w:rPr>
-          <w:i/>
-          <w:iCs/>
-        </w:rPr>
-        <w:t xml:space="preserve">            ON </w:t>
-      </w:r>
-      <w:proofErr w:type="spellStart"/>
-      <w:proofErr w:type="gramStart"/>
-      <w:r>
-        <w:rPr>
-          <w:i/>
-          <w:iCs/>
-        </w:rPr>
-        <w:t>lc.device</w:t>
-      </w:r>
-      <w:proofErr w:type="gramEnd"/>
-      <w:r>
-        <w:rPr>
-          <w:i/>
-          <w:iCs/>
-        </w:rPr>
-        <w:t>_sl_no</w:t>
-      </w:r>
-      <w:proofErr w:type="spellEnd"/>
-      <w:r>
-        <w:rPr>
-          <w:i/>
-          <w:iCs/>
-        </w:rPr>
-        <w:t xml:space="preserve"> = </w:t>
-      </w:r>
-      <w:proofErr w:type="spellStart"/>
-      <w:proofErr w:type="gramStart"/>
-      <w:r>
-        <w:rPr>
-          <w:i/>
-          <w:iCs/>
-        </w:rPr>
-        <w:t>ca.device</w:t>
-      </w:r>
-      <w:proofErr w:type="gramEnd"/>
-      <w:r>
-        <w:rPr>
-          <w:i/>
-          <w:iCs/>
-        </w:rPr>
-        <w:t>_serial</w:t>
-      </w:r>
-      <w:proofErr w:type="spellEnd"/>
+        <w:t>        FROM claimed_assets ca</w:t>
+      </w:r>
+    </w:p>
+    <w:p>
+      <w:pPr>
+        <w:rPr>
+          <w:i/>
+          <w:iCs/>
+        </w:rPr>
+      </w:pPr>
+      <w:r>
+        <w:rPr>
+          <w:i/>
+          <w:iCs/>
+        </w:rPr>
+        <w:t>        LEFT JOIN latest_claim_per_device lc</w:t>
+      </w:r>
+    </w:p>
+    <w:p>
+      <w:pPr>
+        <w:rPr>
+          <w:i/>
+          <w:iCs/>
+        </w:rPr>
+      </w:pPr>
+      <w:r>
+        <w:rPr>
+          <w:i/>
+          <w:iCs/>
+        </w:rPr>
+        <w:t>            ON lc.device_sl_no = ca.device_serial</w:t>
+      </w:r>
     </w:p>
     <w:p>
       <w:pPr>
@@ -4789,6 +2920,211 @@
           <w:iCs/>
         </w:rPr>
         <w:t>    `</w:t>
+      </w:r>
+    </w:p>
+    <w:p/>
+    <w:p/>
+    <w:p/>
+    <w:p/>
+    <w:p/>
+    <w:p/>
+    <w:p/>
+    <w:p>
+      <w:r>
+        <w:t xml:space="preserve">Method Get : </w:t>
+      </w:r>
+      <w:hyperlink r:id="rId10" w:history="1">
+        <w:r>
+          <w:rPr>
+            <w:rStyle w:val="Hyperlink"/>
+          </w:rPr>
+          <w:t>http://localhost:8080/api/v1/assets/warranty/summary</w:t>
+        </w:r>
+      </w:hyperlink>
+    </w:p>
+    <w:p>
+      <w:r>
+        <w:rPr>
+          <w:b/>
+          <w:bCs/>
+          <w:color w:val="4472C4" w:themeColor="accent1"/>
+        </w:rPr>
+        <w:t>C</w:t>
+      </w:r>
+      <w:r>
+        <w:rPr>
+          <w:b/>
+          <w:bCs/>
+          <w:color w:val="4472C4" w:themeColor="accent1"/>
+        </w:rPr>
+        <w:t>urrent year data</w:t>
+      </w:r>
+      <w:r>
+        <w:br/>
+      </w:r>
+      <w:r>
+        <w:br/>
+      </w:r>
+      <w:r>
+        <w:t>{</w:t>
+      </w:r>
+    </w:p>
+    <w:p>
+      <w:r>
+        <w:t>    "data": {</w:t>
+      </w:r>
+    </w:p>
+    <w:p>
+      <w:r>
+        <w:t>        "items": [</w:t>
+      </w:r>
+    </w:p>
+    <w:p>
+      <w:r>
+        <w:t>            {</w:t>
+      </w:r>
+    </w:p>
+    <w:p>
+      <w:r>
+        <w:t>                "label": "Claimed",</w:t>
+      </w:r>
+    </w:p>
+    <w:p>
+      <w:r>
+        <w:t>                "value": 8</w:t>
+      </w:r>
+    </w:p>
+    <w:p>
+      <w:r>
+        <w:t>            },</w:t>
+      </w:r>
+    </w:p>
+    <w:p>
+      <w:r>
+        <w:t>            {</w:t>
+      </w:r>
+    </w:p>
+    <w:p>
+      <w:r>
+        <w:t>                "label": "To Vendor",</w:t>
+      </w:r>
+    </w:p>
+    <w:p>
+      <w:r>
+        <w:t>                "value": 3</w:t>
+      </w:r>
+    </w:p>
+    <w:p>
+      <w:r>
+        <w:t>            },</w:t>
+      </w:r>
+    </w:p>
+    <w:p>
+      <w:r>
+        <w:t>            {</w:t>
+      </w:r>
+    </w:p>
+    <w:p>
+      <w:r>
+        <w:t>                "label": "Recovered",</w:t>
+      </w:r>
+    </w:p>
+    <w:p>
+      <w:r>
+        <w:t>                "value": 1</w:t>
+      </w:r>
+    </w:p>
+    <w:p>
+      <w:r>
+        <w:t>            },</w:t>
+      </w:r>
+    </w:p>
+    <w:p>
+      <w:r>
+        <w:t>            {</w:t>
+      </w:r>
+    </w:p>
+    <w:p>
+      <w:r>
+        <w:t>                "label": "Expired",</w:t>
+      </w:r>
+    </w:p>
+    <w:p>
+      <w:r>
+        <w:t>                "value": 187</w:t>
+      </w:r>
+    </w:p>
+    <w:p>
+      <w:r>
+        <w:t>            }</w:t>
+      </w:r>
+    </w:p>
+    <w:p>
+      <w:r>
+        <w:t>        ],</w:t>
+      </w:r>
+    </w:p>
+    <w:p>
+      <w:r>
+        <w:t>        "raw": {</w:t>
+      </w:r>
+    </w:p>
+    <w:p>
+      <w:r>
+        <w:t>            "claimed": 8,</w:t>
+      </w:r>
+    </w:p>
+    <w:p>
+      <w:r>
+        <w:lastRenderedPageBreak/>
+        <w:t>            "to_vendor": 3,</w:t>
+      </w:r>
+    </w:p>
+    <w:p>
+      <w:r>
+        <w:t>            "recovered": 1,</w:t>
+      </w:r>
+    </w:p>
+    <w:p>
+      <w:r>
+        <w:t>            "expired": 187,</w:t>
+      </w:r>
+    </w:p>
+    <w:p>
+      <w:r>
+        <w:t>            "total": 199</w:t>
+      </w:r>
+    </w:p>
+    <w:p>
+      <w:r>
+        <w:t>        },</w:t>
+      </w:r>
+    </w:p>
+    <w:p>
+      <w:r>
+        <w:t>        "total": 199</w:t>
+      </w:r>
+    </w:p>
+    <w:p>
+      <w:r>
+        <w:t>    },</w:t>
+      </w:r>
+    </w:p>
+    <w:p>
+      <w:r>
+        <w:t>    "success": </w:t>
+      </w:r>
+      <w:r>
+        <w:rPr>
+          <w:b/>
+          <w:bCs/>
+        </w:rPr>
+        <w:t>true</w:t>
+      </w:r>
+    </w:p>
+    <w:p>
+      <w:r>
+        <w:t>}</w:t>
       </w:r>
     </w:p>
     <w:p/>

</xml_diff>